<commit_message>
phase 1 and 2
</commit_message>
<xml_diff>
--- a/outputs/final_cv.docx
+++ b/outputs/final_cv.docx
@@ -733,7 +733,7 @@
                 <w:rFonts w:asciiTheme="minorHAnsi" w:hAnsiTheme="minorHAnsi"/>
                 <w:lang w:val="en-US"/>
               </w:rPr>
-              <w:t xml:space="preserve">AI tools, MS office, Excel Automation, SAP, EDMS (Mezzoteam), Testing  CM tools (DOORS/PIVS etc), PMP, SSGB, QMS Foundation, Lead Auditor IRCA/ISO 9001, English, Hindi, Kannada, Telugu, French (DELF A1)</w:t>
+              <w:t xml:space="preserve">AI tools, MS office, Excel Automation, SAP, EDMS (Mezzoteam), Testing  CM tools (DOORS/PIVS etc), PMP, Lead Auditor – ISO 9001, CMQ/OE, English, Hindi, Kannada, Telugu, French (DELF A1)</w:t>
             </w:r>
           </w:p>
         </w:tc>
@@ -1590,7 +1590,7 @@
                 <w:color w:val="05436E"/>
                 <w:lang w:val="en-US"/>
               </w:rPr>
-              <w:t xml:space="preserve">09'19-09`2024</w:t>
+              <w:t xml:space="preserve">09'19-09`24</w:t>
             </w:r>
           </w:p>
           <w:p>
@@ -1702,7 +1702,7 @@
                 <w:rFonts w:ascii="Aptos" w:hAnsi="Aptos"/>
                 <w:lang w:val="en-IN"/>
               </w:rPr>
-              <w:t xml:space="preserve">Senior QA/QC Expert</w:t>
+              <w:t xml:space="preserve">Senior QA/QC Expert (Systems)</w:t>
             </w:r>
           </w:p>
           <w:p>
@@ -1874,7 +1874,7 @@
                 <w:rFonts w:ascii="Aptos" w:hAnsi="Aptos"/>
                 <w:lang w:val="en-IN"/>
               </w:rPr>
-              <w:t xml:space="preserve">Senior QA/QC Expert</w:t>
+              <w:t xml:space="preserve">Senior QA/QC Expert (Systems)</w:t>
             </w:r>
           </w:p>
           <w:p>
@@ -2055,7 +2055,7 @@
                 <w:rFonts w:ascii="Aptos" w:hAnsi="Aptos"/>
                 <w:lang w:val="en-IN"/>
               </w:rPr>
-              <w:t xml:space="preserve">09'19-09`2024</w:t>
+              <w:t xml:space="preserve">09'19-09`24</w:t>
             </w:r>
           </w:p>
           <w:p>
@@ -2089,7 +2089,7 @@
                 <w:rFonts w:ascii="Aptos" w:hAnsi="Aptos"/>
                 <w:lang w:val="en-IN"/>
               </w:rPr>
-              <w:t xml:space="preserve">Systems: Telecom/Power Supply/Traction/Telecom/MEP/L/TVS-ECS/PSD/Signalling/Rolling Stock/AFC/S etc.</w:t>
+              <w:t xml:space="preserve">Telecom/Power Supply/Traction/Telecom/MEP/L/TVS-ECS/PSD/Signalling/Rolling Stock/AFC/S etc</w:t>
             </w:r>
           </w:p>
           <w:p>
@@ -2132,15 +2132,13 @@
                 <w:rFonts w:ascii="Aptos" w:hAnsi="Aptos"/>
                 <w:lang w:val="en-IN"/>
               </w:rPr>
-              <w:t xml:space="preserve">QA Surveillance role, handling 14+ Contractors in PMC/GC role</w:t>
+              <w:t xml:space="preserve">QA Surveillance of Systems Works for Line 1 and Line2 (Viaduct, UG, Depots)</w:t>
+              <w:br/>
+              <w:t xml:space="preserve">Customer facing role with 14+ Contractor Quality teams to manage (Initialise, Monitoring  Control)</w:t>
               <w:br/>
               <w:t xml:space="preserve">Established, Tailored  Maintain internal QMS(Manual); Approved Contractors` QMS, Mentor/Trained teams</w:t>
               <w:br/>
               <w:t xml:space="preserve">Approved QA/QC plans(+MS/ITP/Checklists), QA/QC resources based on expertise review</w:t>
-              <w:br/>
-              <w:t xml:space="preserve">Witnessed critical RFIs/FAT events of Material/Installation/Testing activities</w:t>
-              <w:br/>
-              <w:t xml:space="preserve">Implemented Site QA/QC plans through regular Audits/Site Visits/Reviews/RCAs  related records (KPIs/OBS/NCRs/Snag list)</w:t>
             </w:r>
             <w:r>
               <w:rPr>
@@ -2680,7 +2678,7 @@
                 <w:rFonts w:ascii="Aptos" w:hAnsi="Aptos"/>
                 <w:lang w:val="en-IN"/>
               </w:rPr>
-              <w:t xml:space="preserve">Systems: ELV / Embedded Systems (IoT Hardware and Software) and Supplier Management</w:t>
+              <w:t xml:space="preserve">ELV / Embedded Systems (IoT Hardware and Software) and Supplier Management</w:t>
             </w:r>
           </w:p>
           <w:p>
@@ -2880,7 +2878,7 @@
                 <w:rFonts w:ascii="Aptos" w:hAnsi="Aptos"/>
                 <w:lang w:val="en-IN"/>
               </w:rPr>
-              <w:t xml:space="preserve">Global Quality Assurance Manager</w:t>
+              <w:t xml:space="preserve">Global Quality Assurance Manager (Offshore-Onshore)</w:t>
             </w:r>
           </w:p>
           <w:p>
@@ -3052,7 +3050,7 @@
                 <w:rFonts w:ascii="Aptos" w:hAnsi="Aptos"/>
                 <w:lang w:val="en-IN"/>
               </w:rPr>
-              <w:t xml:space="preserve">Global Quality Assurance Manager</w:t>
+              <w:t xml:space="preserve">Global Quality Assurance Manager (Offshore-Onshore)</w:t>
             </w:r>
           </w:p>
           <w:p>
@@ -3267,7 +3265,7 @@
                 <w:rFonts w:ascii="Aptos" w:hAnsi="Aptos"/>
                 <w:lang w:val="en-IN"/>
               </w:rPr>
-              <w:t xml:space="preserve">Systems: ELV / Communication and Control Systems (CCS) – 15 Sub-Systems (Telecom/PIS/PAS/Radio/FPS/BIM etc)</w:t>
+              <w:t xml:space="preserve">ELV / Communication and Control Systems (CCS) – 15 Sub-Systems (Telecom/PIS/PAS/Radio/FPS/BIM etc)</w:t>
             </w:r>
           </w:p>
           <w:p>
@@ -3313,8 +3311,6 @@
               <w:t xml:space="preserve">QMS: Tailor  Implement Corporate (Chorus)/Customer processes and train the Thales teams and sub-contractors</w:t>
               <w:br/>
               <w:t xml:space="preserve">Corporate QMS implementation (+SHE), ISO certification (9001:2015), Tailoring to Customer Process</w:t>
-              <w:br/>
-              <w:t xml:space="preserve">QA/QC – PQP/WMS/ITP/MAR/RI/RFIs/Calibration/NCRs, Execution, Reporting, Audits, Supplier Quality, Site Quality QC teams (internal and Sub-contractors) during Material/Installation/T phases</w:t>
             </w:r>
             <w:r>
               <w:rPr>
@@ -3467,7 +3463,7 @@
                 <w:rFonts w:ascii="Aptos" w:hAnsi="Aptos"/>
                 <w:lang w:val="en-IN"/>
               </w:rPr>
-              <w:t xml:space="preserve">Project Quality Assurance Manager</w:t>
+              <w:t xml:space="preserve">Project Quality Assurance Manager (Onshore)</w:t>
             </w:r>
           </w:p>
           <w:p>
@@ -3639,7 +3635,7 @@
                 <w:rFonts w:ascii="Aptos" w:hAnsi="Aptos"/>
                 <w:lang w:val="en-IN"/>
               </w:rPr>
-              <w:t xml:space="preserve">Project Quality Assurance Manager</w:t>
+              <w:t xml:space="preserve">Project Quality Assurance Manager (Onshore)</w:t>
             </w:r>
           </w:p>
           <w:p>
@@ -3854,7 +3850,7 @@
                 <w:rFonts w:ascii="Aptos" w:hAnsi="Aptos"/>
                 <w:lang w:val="en-IN"/>
               </w:rPr>
-              <w:t xml:space="preserve">Systems: ELV / Embedded Systems (Aircraft Hardware and Software) and Aircraft Material inspections (before assembling)</w:t>
+              <w:t xml:space="preserve">ELV / Embedded Systems (Aircraft Hardware and Software) and Aircraft Material inspections (before assembling)</w:t>
             </w:r>
           </w:p>
           <w:p>
@@ -3900,8 +3896,6 @@
               <w:t xml:space="preserve">QMS: Implemented Corporate QMS (Chorus 2.0 CPO, Tailoring, trainings, deployment etc.); ISO 9001 certification</w:t>
               <w:br/>
               <w:t xml:space="preserve">Planning: PQP, WMS/ITPs/Checklists for project including reviews and approvals of offset partner deliverables</w:t>
-              <w:br/>
-              <w:t xml:space="preserve">Engineering QA: Gate reviews, Software sampling tests/Build Checks, CSAT, Quality Advice, Track Actions</w:t>
             </w:r>
             <w:r>
               <w:rPr>
@@ -4054,7 +4048,7 @@
                 <w:rFonts w:ascii="Aptos" w:hAnsi="Aptos"/>
                 <w:lang w:val="en-IN"/>
               </w:rPr>
-              <w:t xml:space="preserve">Portfolio Quality Assurance Manager</w:t>
+              <w:t xml:space="preserve">Portfolio Quality Assurance Manager (Onshore)</w:t>
             </w:r>
           </w:p>
           <w:p>
@@ -4226,7 +4220,7 @@
                 <w:rFonts w:ascii="Aptos" w:hAnsi="Aptos"/>
                 <w:lang w:val="en-IN"/>
               </w:rPr>
-              <w:t xml:space="preserve">Portfolio Quality Assurance Manager</w:t>
+              <w:t xml:space="preserve">Portfolio Quality Assurance Manager (Onshore)</w:t>
             </w:r>
           </w:p>
           <w:p>
@@ -4441,7 +4435,7 @@
                 <w:rFonts w:ascii="Aptos" w:hAnsi="Aptos"/>
                 <w:lang w:val="en-IN"/>
               </w:rPr>
-              <w:t xml:space="preserve">Systems: ELV / Embedded Systems (Aircraft Hardware and Software) and Aircraft Material inspections (before assembling)</w:t>
+              <w:t xml:space="preserve">ELV / Embedded Systems (Aircraft Hardware and Software) and Aircraft Material inspections (before assembling)</w:t>
             </w:r>
           </w:p>
           <w:p>
@@ -4639,7 +4633,7 @@
                 <w:rFonts w:ascii="Aptos" w:hAnsi="Aptos"/>
                 <w:lang w:val="en-IN"/>
               </w:rPr>
-              <w:t xml:space="preserve">Engineering Technical Lead</w:t>
+              <w:t xml:space="preserve">Engineering Technical Lead (Offshore)</w:t>
             </w:r>
           </w:p>
           <w:p>
@@ -4811,7 +4805,7 @@
                 <w:rFonts w:ascii="Aptos" w:hAnsi="Aptos"/>
                 <w:lang w:val="en-IN"/>
               </w:rPr>
-              <w:t xml:space="preserve">Engineering Technical Lead</w:t>
+              <w:t xml:space="preserve">Engineering Technical Lead (Offshore)</w:t>
             </w:r>
           </w:p>
           <w:p>
@@ -5026,7 +5020,7 @@
                 <w:rFonts w:ascii="Aptos" w:hAnsi="Aptos"/>
                 <w:lang w:val="en-IN"/>
               </w:rPr>
-              <w:t xml:space="preserve">Systems: Aircraft HMI Software – LLR(Requirements), Design, Coding and Testing</w:t>
+              <w:t xml:space="preserve">Aircraft HMI Software – LLR(Requirements), Design, Coding and Testing</w:t>
             </w:r>
           </w:p>
           <w:p>
@@ -5112,7 +5106,7 @@
                 <w:color w:val="05436E"/>
                 <w:lang w:val="en-US"/>
               </w:rPr>
-              <w:t xml:space="preserve">11'2003-03'2007</w:t>
+              <w:t xml:space="preserve">05'2004-03'2007</w:t>
             </w:r>
           </w:p>
           <w:p>
@@ -5163,7 +5157,7 @@
                 <w:rFonts w:ascii="Aptos" w:hAnsi="Aptos"/>
                 <w:lang w:val="en-IN"/>
               </w:rPr>
-              <w:t xml:space="preserve">Honeywell</w:t>
+              <w:t xml:space="preserve">Honeywell, ADA/DRDO</w:t>
             </w:r>
           </w:p>
           <w:p>
@@ -5545,7 +5539,7 @@
                 <w:bCs/>
                 <w:lang w:val="en-IN"/>
               </w:rPr>
-              <w:t xml:space="preserve">ADA/DRDO</w:t>
+              <w:t xml:space="preserve"/>
             </w:r>
           </w:p>
           <w:p>
@@ -5577,7 +5571,7 @@
                 <w:rFonts w:ascii="Aptos" w:hAnsi="Aptos"/>
                 <w:lang w:val="en-IN"/>
               </w:rPr>
-              <w:t xml:space="preserve">11'2003-03'2007</w:t>
+              <w:t xml:space="preserve">05'2004-03'2007</w:t>
             </w:r>
           </w:p>
           <w:p>

</xml_diff>

<commit_message>
updates in final cv
</commit_message>
<xml_diff>
--- a/outputs/final_cv.docx
+++ b/outputs/final_cv.docx
@@ -572,7 +572,7 @@
               </w:rPr>
               <w:t xml:space="preserve">Bachelor of Engineering in Electronics  Communication, Electronics  Communication, Kuvempu University - Government, 1999 to 2003</w:t>
               <w:br/>
-              <w:t xml:space="preserve">PGD in MBA, International Business Management, IBM, 2012 to 2013</w:t>
+              <w:t xml:space="preserve">PGD in MBA IBM, International Business Management, IBM, 2012 to 2013</w:t>
             </w:r>
           </w:p>
         </w:tc>
@@ -733,7 +733,7 @@
                 <w:rFonts w:asciiTheme="minorHAnsi" w:hAnsiTheme="minorHAnsi"/>
                 <w:lang w:val="en-US"/>
               </w:rPr>
-              <w:t xml:space="preserve">AI tools, MS office, Excel Automation, SAP, EDMS (Mezzoteam), Testing  CM tools (DOORS/PIVS etc), French (DELF A1), English, Hindi, Kannada, Telugu, PMP, Lead Auditor – ISO 9001, CMQ/OE</w:t>
+              <w:t xml:space="preserve">AI tools, MS office, Excel Automation, SAP, EDMS (Mezzoteam), Testing  CM tools (DOORS/PIVS etc), PMP, Lead Auditor IRCA/ISO 9001, SSGB, QMS Foundation, English, Hindi, Kannada, Telugu, French (DELF A1)</w:t>
             </w:r>
           </w:p>
         </w:tc>
@@ -1590,7 +1590,7 @@
                 <w:color w:val="05436E"/>
                 <w:lang w:val="en-US"/>
               </w:rPr>
-              <w:t xml:space="preserve">09'19-09`24</w:t>
+              <w:t xml:space="preserve">09'19-09`2024</w:t>
             </w:r>
           </w:p>
           <w:p>
@@ -1702,7 +1702,7 @@
                 <w:rFonts w:ascii="Aptos" w:hAnsi="Aptos"/>
                 <w:lang w:val="en-IN"/>
               </w:rPr>
-              <w:t xml:space="preserve">Senior Quality Assurance Expert (SQAE)</w:t>
+              <w:t xml:space="preserve">Senior QA/QC Expert</w:t>
             </w:r>
           </w:p>
           <w:p>
@@ -1874,7 +1874,7 @@
                 <w:rFonts w:ascii="Aptos" w:hAnsi="Aptos"/>
                 <w:lang w:val="en-IN"/>
               </w:rPr>
-              <w:t xml:space="preserve">Senior Quality Assurance Expert (SQAE)</w:t>
+              <w:t xml:space="preserve">Senior QA/QC Expert</w:t>
             </w:r>
           </w:p>
           <w:p>
@@ -2055,7 +2055,7 @@
                 <w:rFonts w:ascii="Aptos" w:hAnsi="Aptos"/>
                 <w:lang w:val="en-IN"/>
               </w:rPr>
-              <w:t xml:space="preserve">09'19-09`24</w:t>
+              <w:t xml:space="preserve">09'19-09`2024</w:t>
             </w:r>
           </w:p>
           <w:p>
@@ -2132,15 +2132,13 @@
                 <w:rFonts w:ascii="Aptos" w:hAnsi="Aptos"/>
                 <w:lang w:val="en-IN"/>
               </w:rPr>
-              <w:t xml:space="preserve">QA Surveillance role, handling 14+ Contractors in PMC/GC role</w:t>
+              <w:t xml:space="preserve">QA Surveillance of Systems Works for Line 1 and Line2 (Viaduct, UG, Depots)</w:t>
+              <w:br/>
+              <w:t xml:space="preserve">Customer facing role with 14+ Contractor Quality teams to manage (Initialise, Monitoring  Control)</w:t>
               <w:br/>
               <w:t xml:space="preserve">Established, Tailored  Maintain internal QMS(Manual); Approved Contractors` QMS, Mentor/Trained teams</w:t>
               <w:br/>
               <w:t xml:space="preserve">Approved QA/QC plans(+MS/ITP/Checklists), QA/QC resources based on expertise review</w:t>
-              <w:br/>
-              <w:t xml:space="preserve">Witnessed critical RFIs/FAT events of Material/Installation/Testing activities</w:t>
-              <w:br/>
-              <w:t xml:space="preserve">Implemented Site QA/QC plans through regular Audits/Site Visits/Reviews/RCAs  related records (KPIs/OBS/NCRs/Snag list)</w:t>
             </w:r>
             <w:r>
               <w:rPr>
@@ -3313,8 +3311,6 @@
               <w:t xml:space="preserve">QMS: Tailor  Implement Corporate (Chorus)/Customer processes and train the Thales teams and sub-contractors</w:t>
               <w:br/>
               <w:t xml:space="preserve">Corporate QMS implementation (+SHE), ISO certification (9001:2015), Tailoring to Customer Process</w:t>
-              <w:br/>
-              <w:t xml:space="preserve">QA/QC – PQP/WMS/ITP/MAR/RI/RFIs/Calibration/NCRs, Execution, Reporting, Audits, Supplier Quality, Site Quality QC teams (internal and Sub-contractors) during Material/Installation/T phases</w:t>
             </w:r>
             <w:r>
               <w:rPr>
@@ -3900,8 +3896,6 @@
               <w:t xml:space="preserve">QMS: Implemented Corporate QMS (Chorus 2.0 CPO, Tailoring, trainings, deployment etc.); ISO 9001 certification</w:t>
               <w:br/>
               <w:t xml:space="preserve">Planning: PQP, WMS/ITPs/Checklists for project including reviews and approvals of offset partner deliverables</w:t>
-              <w:br/>
-              <w:t xml:space="preserve">Engineering QA: Gate reviews, Software sampling tests/Build Checks, CSAT, Quality Advice, Track Actions</w:t>
             </w:r>
             <w:r>
               <w:rPr>
@@ -5112,7 +5106,7 @@
                 <w:color w:val="05436E"/>
                 <w:lang w:val="en-US"/>
               </w:rPr>
-              <w:t xml:space="preserve">11'2003-03'2007</w:t>
+              <w:t xml:space="preserve">05'2004-03'2007</w:t>
             </w:r>
           </w:p>
           <w:p>
@@ -5163,7 +5157,7 @@
                 <w:rFonts w:ascii="Aptos" w:hAnsi="Aptos"/>
                 <w:lang w:val="en-IN"/>
               </w:rPr>
-              <w:t xml:space="preserve">Honeywell</w:t>
+              <w:t xml:space="preserve">Honeywell, ADA/DRDO</w:t>
             </w:r>
           </w:p>
           <w:p>
@@ -5545,7 +5539,7 @@
                 <w:bCs/>
                 <w:lang w:val="en-IN"/>
               </w:rPr>
-              <w:t xml:space="preserve">ADA/DRDO</w:t>
+              <w:t xml:space="preserve"/>
             </w:r>
           </w:p>
           <w:p>
@@ -5577,7 +5571,7 @@
                 <w:rFonts w:ascii="Aptos" w:hAnsi="Aptos"/>
                 <w:lang w:val="en-IN"/>
               </w:rPr>
-              <w:t xml:space="preserve">11'2003-03'2007</w:t>
+              <w:t xml:space="preserve">05'2004-03'2007</w:t>
             </w:r>
           </w:p>
           <w:p>

</xml_diff>

<commit_message>
image extraction and parsing
</commit_message>
<xml_diff>
--- a/outputs/final_cv.docx
+++ b/outputs/final_cv.docx
@@ -69,77 +69,6 @@
           <w:lang w:val="en-US"/>
         </w:rPr>
       </w:pPr>
-      <w:r>
-        <w:rPr>
-          <w:rFonts w:asciiTheme="minorHAnsi" w:hAnsiTheme="minorHAnsi" w:cs="Calibri"/>
-          <w:b/>
-          <w:bCs/>
-          <w:noProof/>
-          <w:lang w:val="en-IN"/>
-        </w:rPr>
-        <w:drawing>
-          <wp:anchor distT="0" distB="0" distL="114300" distR="114300" simplePos="0" relativeHeight="251661312" behindDoc="0" locked="0" layoutInCell="1" allowOverlap="1" wp14:anchorId="023E4E10" wp14:editId="1865D775">
-            <wp:simplePos x="0" y="0"/>
-            <wp:positionH relativeFrom="column">
-              <wp:posOffset>4894313</wp:posOffset>
-            </wp:positionH>
-            <wp:positionV relativeFrom="paragraph">
-              <wp:posOffset>173355</wp:posOffset>
-            </wp:positionV>
-            <wp:extent cx="1112520" cy="1161164"/>
-            <wp:effectExtent l="0" t="0" r="0" b="1270"/>
-            <wp:wrapNone/>
-            <wp:docPr id="1001" name="Picture 21" descr="A grey silhouette of a person&#10;&#10;AI-generated content may be incorrect."/>
-            <wp:cNvGraphicFramePr>
-              <a:graphicFrameLocks xmlns:a="http://schemas.openxmlformats.org/drawingml/2006/main" noChangeAspect="1"/>
-            </wp:cNvGraphicFramePr>
-            <a:graphic xmlns:a="http://schemas.openxmlformats.org/drawingml/2006/main">
-              <a:graphicData uri="http://schemas.openxmlformats.org/drawingml/2006/picture">
-                <pic:pic xmlns:pic="http://schemas.openxmlformats.org/drawingml/2006/picture">
-                  <pic:nvPicPr>
-                    <pic:cNvPr id="21" name="Picture 21" descr="A grey silhouette of a person&#10;&#10;AI-generated content may be incorrect."/>
-                    <pic:cNvPicPr>
-                      <a:picLocks noChangeAspect="1" noChangeArrowheads="1"/>
-                    </pic:cNvPicPr>
-                  </pic:nvPicPr>
-                  <pic:blipFill>
-                    <a:blip r:embed="rId8" cstate="print">
-                      <a:extLst>
-                        <a:ext uri="{28A0092B-C50C-407E-A947-70E740481C1C}">
-                          <a14:useLocalDpi xmlns:a14="http://schemas.microsoft.com/office/drawing/2010/main" val="0"/>
-                        </a:ext>
-                      </a:extLst>
-                    </a:blip>
-                    <a:srcRect/>
-                    <a:stretch>
-                      <a:fillRect/>
-                    </a:stretch>
-                  </pic:blipFill>
-                  <pic:spPr bwMode="auto">
-                    <a:xfrm>
-                      <a:off x="0" y="0"/>
-                      <a:ext cx="1112520" cy="1161164"/>
-                    </a:xfrm>
-                    <a:prstGeom prst="rect">
-                      <a:avLst/>
-                    </a:prstGeom>
-                    <a:noFill/>
-                    <a:ln>
-                      <a:noFill/>
-                    </a:ln>
-                  </pic:spPr>
-                </pic:pic>
-              </a:graphicData>
-            </a:graphic>
-            <wp14:sizeRelH relativeFrom="page">
-              <wp14:pctWidth>0</wp14:pctWidth>
-            </wp14:sizeRelH>
-            <wp14:sizeRelV relativeFrom="page">
-              <wp14:pctHeight>0</wp14:pctHeight>
-            </wp14:sizeRelV>
-          </wp:anchor>
-        </w:drawing>
-      </w:r>
     </w:p>
     <w:tbl>
       <w:tblPr>
@@ -578,6 +507,100 @@
         </w:tc>
       </w:tr>
     </w:tbl>
+    <w:tbl>
+      <w:tblPr>
+        <w:tblpPr w:leftFromText="180" w:rightFromText="180" w:vertAnchor="text" w:horzAnchor="page" w:tblpX="9352" w:tblpY="-2273"/>
+        <w:tblW w:w="0" w:type="auto"/>
+        <w:tblBorders>
+          <w:top w:val="single" w:sz="4" w:space="0" w:color="auto"/>
+          <w:left w:val="single" w:sz="4" w:space="0" w:color="auto"/>
+          <w:bottom w:val="single" w:sz="4" w:space="0" w:color="auto"/>
+          <w:right w:val="single" w:sz="4" w:space="0" w:color="auto"/>
+          <w:insideH w:val="single" w:sz="4" w:space="0" w:color="auto"/>
+          <w:insideV w:val="single" w:sz="4" w:space="0" w:color="auto"/>
+        </w:tblBorders>
+        <w:tblLook w:val="0000" w:firstRow="0" w:lastRow="0" w:firstColumn="0" w:lastColumn="0" w:noHBand="0" w:noVBand="0"/>
+      </w:tblPr>
+      <w:tblGrid>
+        <w:gridCol w:w="2044"/>
+      </w:tblGrid>
+      <w:tr>
+        <w:tblPrEx>
+          <w:tblCellMar>
+            <w:top w:w="0" w:type="dxa"/>
+            <w:bottom w:w="0" w:type="dxa"/>
+          </w:tblCellMar>
+        </w:tblPrEx>
+        <w:trPr>
+          <w:trHeight w:val="2220"/>
+        </w:trPr>
+        <w:tc>
+          <w:tcPr>
+            <w:tcW w:w="2044" w:type="dxa"/>
+          </w:tcPr>
+          <w:p>
+            <w:pPr>
+              <w:spacing w:after="0"/>
+              <w:jc w:val="center"/>
+              <w:rPr>
+                <w:rFonts w:asciiTheme="minorHAnsi" w:hAnsiTheme="minorHAnsi"/>
+              </w:rPr>
+            </w:pPr>
+            <w:r>
+              <w:rPr>
+                <w:rFonts w:asciiTheme="minorHAnsi" w:hAnsiTheme="minorHAnsi"/>
+              </w:rPr>
+              <w:t xml:space="preserve"/>
+            </w:r>
+            <w:r>
+              <w:drawing>
+                <wp:inline xmlns:a="http://schemas.openxmlformats.org/drawingml/2006/main" xmlns:pic="http://schemas.openxmlformats.org/drawingml/2006/picture">
+                  <wp:extent cx="1260000" cy="1440000"/>
+                  <wp:docPr id="1001" name="Picture 1"/>
+                  <wp:cNvGraphicFramePr>
+                    <a:graphicFrameLocks noChangeAspect="1"/>
+                  </wp:cNvGraphicFramePr>
+                  <a:graphic>
+                    <a:graphicData uri="http://schemas.openxmlformats.org/drawingml/2006/picture">
+                      <pic:pic>
+                        <pic:nvPicPr>
+                          <pic:cNvPr id="0" name="profile.jpeg"/>
+                          <pic:cNvPicPr/>
+                        </pic:nvPicPr>
+                        <pic:blipFill>
+                          <a:blip r:embed="rId16"/>
+                          <a:stretch>
+                            <a:fillRect/>
+                          </a:stretch>
+                        </pic:blipFill>
+                        <pic:spPr>
+                          <a:xfrm>
+                            <a:off x="0" y="0"/>
+                            <a:ext cx="1260000" cy="1440000"/>
+                          </a:xfrm>
+                          <a:prstGeom prst="rect"/>
+                        </pic:spPr>
+                      </pic:pic>
+                    </a:graphicData>
+                  </a:graphic>
+                </wp:inline>
+              </w:drawing>
+            </w:r>
+            <w:r>
+              <w:t xml:space="preserve"/>
+            </w:r>
+          </w:p>
+        </w:tc>
+      </w:tr>
+    </w:tbl>
+    <w:p>
+      <w:pPr>
+        <w:spacing w:after="0"/>
+        <w:rPr>
+          <w:rFonts w:asciiTheme="minorHAnsi" w:hAnsiTheme="minorHAnsi"/>
+        </w:rPr>
+      </w:pPr>
+    </w:p>
     <w:p>
       <w:pPr>
         <w:spacing w:after="0"/>
@@ -1138,16 +1161,16 @@
                 <w:rFonts w:ascii="Aptos" w:hAnsi="Aptos"/>
                 <w:b/>
                 <w:bCs/>
-                <w:color w:val="BF4E14" w:themeColor="accent2" w:themeShade="BF"/>
-                <w:lang w:val="en-IN"/>
-              </w:rPr>
-            </w:pPr>
-            <w:r>
-              <w:rPr>
-                <w:rFonts w:ascii="Aptos" w:hAnsi="Aptos"/>
-                <w:b/>
-                <w:bCs/>
-                <w:color w:val="BF4E14" w:themeColor="accent2" w:themeShade="BF"/>
+                <w:color w:val="F2CEED" w:themeColor="accent5" w:themeTint="33"/>
+                <w:lang w:val="en-IN"/>
+              </w:rPr>
+            </w:pPr>
+            <w:r>
+              <w:rPr>
+                <w:rFonts w:ascii="Aptos" w:hAnsi="Aptos"/>
+                <w:b/>
+                <w:bCs/>
+                <w:color w:val="F2CEED" w:themeColor="accent5" w:themeTint="33"/>
                 <w:lang w:val="en-IN"/>
               </w:rPr>
               <w:t>For References:</w:t>
@@ -1159,16 +1182,16 @@
               <w:jc w:val="both"/>
               <w:rPr>
                 <w:rFonts w:ascii="Aptos" w:hAnsi="Aptos"/>
-                <w:color w:val="BF4E14" w:themeColor="accent2" w:themeShade="BF"/>
-                <w:lang w:val="en-IN"/>
-              </w:rPr>
-            </w:pPr>
-            <w:r>
-              <w:rPr>
-                <w:rFonts w:ascii="Aptos" w:hAnsi="Aptos"/>
-                <w:b/>
-                <w:bCs/>
-                <w:color w:val="BF4E14" w:themeColor="accent2" w:themeShade="BF"/>
+                <w:color w:val="F2CEED" w:themeColor="accent5" w:themeTint="33"/>
+                <w:lang w:val="en-IN"/>
+              </w:rPr>
+            </w:pPr>
+            <w:r>
+              <w:rPr>
+                <w:rFonts w:ascii="Aptos" w:hAnsi="Aptos"/>
+                <w:b/>
+                <w:bCs/>
+                <w:color w:val="F2CEED" w:themeColor="accent5" w:themeTint="33"/>
                 <w:lang w:val="en-IN"/>
               </w:rPr>
               <w:t xml:space="preserve">Name: </w:t>
@@ -1176,7 +1199,7 @@
             <w:r>
               <w:rPr>
                 <w:rFonts w:ascii="Aptos" w:hAnsi="Aptos"/>
-                <w:color w:val="BF4E14" w:themeColor="accent2" w:themeShade="BF"/>
+                <w:color w:val="F2CEED" w:themeColor="accent5" w:themeTint="33"/>
                 <w:lang w:val="en-IN"/>
               </w:rPr>
               <w:t xml:space="preserve"/>
@@ -1188,16 +1211,16 @@
               <w:jc w:val="both"/>
               <w:rPr>
                 <w:rFonts w:ascii="Aptos" w:hAnsi="Aptos"/>
-                <w:color w:val="BF4E14" w:themeColor="accent2" w:themeShade="BF"/>
-                <w:lang w:val="en-IN"/>
-              </w:rPr>
-            </w:pPr>
-            <w:r>
-              <w:rPr>
-                <w:rFonts w:ascii="Aptos" w:hAnsi="Aptos"/>
-                <w:b/>
-                <w:bCs/>
-                <w:color w:val="BF4E14" w:themeColor="accent2" w:themeShade="BF"/>
+                <w:color w:val="F2CEED" w:themeColor="accent5" w:themeTint="33"/>
+                <w:lang w:val="en-IN"/>
+              </w:rPr>
+            </w:pPr>
+            <w:r>
+              <w:rPr>
+                <w:rFonts w:ascii="Aptos" w:hAnsi="Aptos"/>
+                <w:b/>
+                <w:bCs/>
+                <w:color w:val="F2CEED" w:themeColor="accent5" w:themeTint="33"/>
                 <w:lang w:val="en-IN"/>
               </w:rPr>
               <w:t xml:space="preserve">Position: </w:t>
@@ -1205,7 +1228,7 @@
             <w:r>
               <w:rPr>
                 <w:rFonts w:ascii="Aptos" w:hAnsi="Aptos"/>
-                <w:color w:val="BF4E14" w:themeColor="accent2" w:themeShade="BF"/>
+                <w:color w:val="F2CEED" w:themeColor="accent5" w:themeTint="33"/>
                 <w:lang w:val="en-IN"/>
               </w:rPr>
               <w:t xml:space="preserve"/>
@@ -1217,16 +1240,16 @@
               <w:jc w:val="both"/>
               <w:rPr>
                 <w:rFonts w:ascii="Aptos" w:hAnsi="Aptos"/>
-                <w:color w:val="BF4E14" w:themeColor="accent2" w:themeShade="BF"/>
-                <w:lang w:val="en-IN"/>
-              </w:rPr>
-            </w:pPr>
-            <w:r>
-              <w:rPr>
-                <w:rFonts w:ascii="Aptos" w:hAnsi="Aptos"/>
-                <w:b/>
-                <w:bCs/>
-                <w:color w:val="BF4E14" w:themeColor="accent2" w:themeShade="BF"/>
+                <w:color w:val="F2CEED" w:themeColor="accent5" w:themeTint="33"/>
+                <w:lang w:val="en-IN"/>
+              </w:rPr>
+            </w:pPr>
+            <w:r>
+              <w:rPr>
+                <w:rFonts w:ascii="Aptos" w:hAnsi="Aptos"/>
+                <w:b/>
+                <w:bCs/>
+                <w:color w:val="F2CEED" w:themeColor="accent5" w:themeTint="33"/>
                 <w:lang w:val="en-IN"/>
               </w:rPr>
               <w:t xml:space="preserve">Tel: </w:t>
@@ -1234,7 +1257,7 @@
             <w:r>
               <w:rPr>
                 <w:rFonts w:ascii="Aptos" w:hAnsi="Aptos"/>
-                <w:color w:val="BF4E14" w:themeColor="accent2" w:themeShade="BF"/>
+                <w:color w:val="F2CEED" w:themeColor="accent5" w:themeTint="33"/>
                 <w:lang w:val="en-IN"/>
               </w:rPr>
               <w:t xml:space="preserve"/>
@@ -1255,15 +1278,16 @@
                 <w:rFonts w:ascii="Aptos" w:hAnsi="Aptos"/>
                 <w:b/>
                 <w:bCs/>
-                <w:color w:val="BF4E14" w:themeColor="accent2" w:themeShade="BF"/>
-                <w:lang w:val="en-IN"/>
-              </w:rPr>
+                <w:color w:val="F2CEED" w:themeColor="accent5" w:themeTint="33"/>
+                <w:lang w:val="en-IN"/>
+              </w:rPr>
+              <w:lastRenderedPageBreak/>
               <w:t xml:space="preserve">Email: </w:t>
             </w:r>
             <w:r>
               <w:rPr>
                 <w:rFonts w:ascii="Aptos" w:hAnsi="Aptos"/>
-                <w:color w:val="BF4E14" w:themeColor="accent2" w:themeShade="BF"/>
+                <w:color w:val="F2CEED" w:themeColor="accent5" w:themeTint="33"/>
                 <w:lang w:val="en-IN"/>
               </w:rPr>
               <w:t xml:space="preserve"/>
@@ -1289,6 +1313,7 @@
                 <w:rFonts w:ascii="Aptos" w:hAnsi="Aptos"/>
                 <w:lang w:val="en-IN"/>
               </w:rPr>
+              <w:lastRenderedPageBreak/>
               <w:t xml:space="preserve">Quality Assurance Specialist</w:t>
             </w:r>
           </w:p>
@@ -1723,16 +1748,16 @@
                 <w:rFonts w:ascii="Aptos" w:hAnsi="Aptos"/>
                 <w:b/>
                 <w:bCs/>
-                <w:color w:val="BF4E14" w:themeColor="accent2" w:themeShade="BF"/>
-                <w:lang w:val="en-IN"/>
-              </w:rPr>
-            </w:pPr>
-            <w:r>
-              <w:rPr>
-                <w:rFonts w:ascii="Aptos" w:hAnsi="Aptos"/>
-                <w:b/>
-                <w:bCs/>
-                <w:color w:val="BF4E14" w:themeColor="accent2" w:themeShade="BF"/>
+                <w:color w:val="F2CEED" w:themeColor="accent5" w:themeTint="33"/>
+                <w:lang w:val="en-IN"/>
+              </w:rPr>
+            </w:pPr>
+            <w:r>
+              <w:rPr>
+                <w:rFonts w:ascii="Aptos" w:hAnsi="Aptos"/>
+                <w:b/>
+                <w:bCs/>
+                <w:color w:val="F2CEED" w:themeColor="accent5" w:themeTint="33"/>
                 <w:lang w:val="en-IN"/>
               </w:rPr>
               <w:t>For References:</w:t>
@@ -1744,16 +1769,16 @@
               <w:jc w:val="both"/>
               <w:rPr>
                 <w:rFonts w:ascii="Aptos" w:hAnsi="Aptos"/>
-                <w:color w:val="BF4E14" w:themeColor="accent2" w:themeShade="BF"/>
-                <w:lang w:val="en-IN"/>
-              </w:rPr>
-            </w:pPr>
-            <w:r>
-              <w:rPr>
-                <w:rFonts w:ascii="Aptos" w:hAnsi="Aptos"/>
-                <w:b/>
-                <w:bCs/>
-                <w:color w:val="BF4E14" w:themeColor="accent2" w:themeShade="BF"/>
+                <w:color w:val="F2CEED" w:themeColor="accent5" w:themeTint="33"/>
+                <w:lang w:val="en-IN"/>
+              </w:rPr>
+            </w:pPr>
+            <w:r>
+              <w:rPr>
+                <w:rFonts w:ascii="Aptos" w:hAnsi="Aptos"/>
+                <w:b/>
+                <w:bCs/>
+                <w:color w:val="F2CEED" w:themeColor="accent5" w:themeTint="33"/>
                 <w:lang w:val="en-IN"/>
               </w:rPr>
               <w:t xml:space="preserve">Name: </w:t>
@@ -1761,7 +1786,7 @@
             <w:r>
               <w:rPr>
                 <w:rFonts w:ascii="Aptos" w:hAnsi="Aptos"/>
-                <w:color w:val="BF4E14" w:themeColor="accent2" w:themeShade="BF"/>
+                <w:color w:val="F2CEED" w:themeColor="accent5" w:themeTint="33"/>
                 <w:lang w:val="en-IN"/>
               </w:rPr>
               <w:t xml:space="preserve"/>
@@ -1773,16 +1798,16 @@
               <w:jc w:val="both"/>
               <w:rPr>
                 <w:rFonts w:ascii="Aptos" w:hAnsi="Aptos"/>
-                <w:color w:val="BF4E14" w:themeColor="accent2" w:themeShade="BF"/>
-                <w:lang w:val="en-IN"/>
-              </w:rPr>
-            </w:pPr>
-            <w:r>
-              <w:rPr>
-                <w:rFonts w:ascii="Aptos" w:hAnsi="Aptos"/>
-                <w:b/>
-                <w:bCs/>
-                <w:color w:val="BF4E14" w:themeColor="accent2" w:themeShade="BF"/>
+                <w:color w:val="F2CEED" w:themeColor="accent5" w:themeTint="33"/>
+                <w:lang w:val="en-IN"/>
+              </w:rPr>
+            </w:pPr>
+            <w:r>
+              <w:rPr>
+                <w:rFonts w:ascii="Aptos" w:hAnsi="Aptos"/>
+                <w:b/>
+                <w:bCs/>
+                <w:color w:val="F2CEED" w:themeColor="accent5" w:themeTint="33"/>
                 <w:lang w:val="en-IN"/>
               </w:rPr>
               <w:t xml:space="preserve">Position: </w:t>
@@ -1790,7 +1815,7 @@
             <w:r>
               <w:rPr>
                 <w:rFonts w:ascii="Aptos" w:hAnsi="Aptos"/>
-                <w:color w:val="BF4E14" w:themeColor="accent2" w:themeShade="BF"/>
+                <w:color w:val="F2CEED" w:themeColor="accent5" w:themeTint="33"/>
                 <w:lang w:val="en-IN"/>
               </w:rPr>
               <w:t xml:space="preserve"/>
@@ -1802,16 +1827,16 @@
               <w:jc w:val="both"/>
               <w:rPr>
                 <w:rFonts w:ascii="Aptos" w:hAnsi="Aptos"/>
-                <w:color w:val="BF4E14" w:themeColor="accent2" w:themeShade="BF"/>
-                <w:lang w:val="en-IN"/>
-              </w:rPr>
-            </w:pPr>
-            <w:r>
-              <w:rPr>
-                <w:rFonts w:ascii="Aptos" w:hAnsi="Aptos"/>
-                <w:b/>
-                <w:bCs/>
-                <w:color w:val="BF4E14" w:themeColor="accent2" w:themeShade="BF"/>
+                <w:color w:val="F2CEED" w:themeColor="accent5" w:themeTint="33"/>
+                <w:lang w:val="en-IN"/>
+              </w:rPr>
+            </w:pPr>
+            <w:r>
+              <w:rPr>
+                <w:rFonts w:ascii="Aptos" w:hAnsi="Aptos"/>
+                <w:b/>
+                <w:bCs/>
+                <w:color w:val="F2CEED" w:themeColor="accent5" w:themeTint="33"/>
                 <w:lang w:val="en-IN"/>
               </w:rPr>
               <w:t xml:space="preserve">Tel: </w:t>
@@ -1819,7 +1844,7 @@
             <w:r>
               <w:rPr>
                 <w:rFonts w:ascii="Aptos" w:hAnsi="Aptos"/>
-                <w:color w:val="BF4E14" w:themeColor="accent2" w:themeShade="BF"/>
+                <w:color w:val="F2CEED" w:themeColor="accent5" w:themeTint="33"/>
                 <w:lang w:val="en-IN"/>
               </w:rPr>
               <w:t xml:space="preserve"/>
@@ -1840,15 +1865,16 @@
                 <w:rFonts w:ascii="Aptos" w:hAnsi="Aptos"/>
                 <w:b/>
                 <w:bCs/>
-                <w:color w:val="BF4E14" w:themeColor="accent2" w:themeShade="BF"/>
-                <w:lang w:val="en-IN"/>
-              </w:rPr>
+                <w:color w:val="F2CEED" w:themeColor="accent5" w:themeTint="33"/>
+                <w:lang w:val="en-IN"/>
+              </w:rPr>
+              <w:lastRenderedPageBreak/>
               <w:t xml:space="preserve">Email: </w:t>
             </w:r>
             <w:r>
               <w:rPr>
                 <w:rFonts w:ascii="Aptos" w:hAnsi="Aptos"/>
-                <w:color w:val="BF4E14" w:themeColor="accent2" w:themeShade="BF"/>
+                <w:color w:val="F2CEED" w:themeColor="accent5" w:themeTint="33"/>
                 <w:lang w:val="en-IN"/>
               </w:rPr>
               <w:t xml:space="preserve"/>
@@ -1874,6 +1900,7 @@
                 <w:rFonts w:ascii="Aptos" w:hAnsi="Aptos"/>
                 <w:lang w:val="en-IN"/>
               </w:rPr>
+              <w:lastRenderedPageBreak/>
               <w:t xml:space="preserve">Senior QA/QC Expert</w:t>
             </w:r>
           </w:p>
@@ -2312,16 +2339,16 @@
                 <w:rFonts w:ascii="Aptos" w:hAnsi="Aptos"/>
                 <w:b/>
                 <w:bCs/>
-                <w:color w:val="BF4E14" w:themeColor="accent2" w:themeShade="BF"/>
-                <w:lang w:val="en-IN"/>
-              </w:rPr>
-            </w:pPr>
-            <w:r>
-              <w:rPr>
-                <w:rFonts w:ascii="Aptos" w:hAnsi="Aptos"/>
-                <w:b/>
-                <w:bCs/>
-                <w:color w:val="BF4E14" w:themeColor="accent2" w:themeShade="BF"/>
+                <w:color w:val="F2CEED" w:themeColor="accent5" w:themeTint="33"/>
+                <w:lang w:val="en-IN"/>
+              </w:rPr>
+            </w:pPr>
+            <w:r>
+              <w:rPr>
+                <w:rFonts w:ascii="Aptos" w:hAnsi="Aptos"/>
+                <w:b/>
+                <w:bCs/>
+                <w:color w:val="F2CEED" w:themeColor="accent5" w:themeTint="33"/>
                 <w:lang w:val="en-IN"/>
               </w:rPr>
               <w:t>For References:</w:t>
@@ -2333,16 +2360,16 @@
               <w:jc w:val="both"/>
               <w:rPr>
                 <w:rFonts w:ascii="Aptos" w:hAnsi="Aptos"/>
-                <w:color w:val="BF4E14" w:themeColor="accent2" w:themeShade="BF"/>
-                <w:lang w:val="en-IN"/>
-              </w:rPr>
-            </w:pPr>
-            <w:r>
-              <w:rPr>
-                <w:rFonts w:ascii="Aptos" w:hAnsi="Aptos"/>
-                <w:b/>
-                <w:bCs/>
-                <w:color w:val="BF4E14" w:themeColor="accent2" w:themeShade="BF"/>
+                <w:color w:val="F2CEED" w:themeColor="accent5" w:themeTint="33"/>
+                <w:lang w:val="en-IN"/>
+              </w:rPr>
+            </w:pPr>
+            <w:r>
+              <w:rPr>
+                <w:rFonts w:ascii="Aptos" w:hAnsi="Aptos"/>
+                <w:b/>
+                <w:bCs/>
+                <w:color w:val="F2CEED" w:themeColor="accent5" w:themeTint="33"/>
                 <w:lang w:val="en-IN"/>
               </w:rPr>
               <w:t xml:space="preserve">Name: </w:t>
@@ -2350,7 +2377,7 @@
             <w:r>
               <w:rPr>
                 <w:rFonts w:ascii="Aptos" w:hAnsi="Aptos"/>
-                <w:color w:val="BF4E14" w:themeColor="accent2" w:themeShade="BF"/>
+                <w:color w:val="F2CEED" w:themeColor="accent5" w:themeTint="33"/>
                 <w:lang w:val="en-IN"/>
               </w:rPr>
               <w:t xml:space="preserve"/>
@@ -2362,16 +2389,16 @@
               <w:jc w:val="both"/>
               <w:rPr>
                 <w:rFonts w:ascii="Aptos" w:hAnsi="Aptos"/>
-                <w:color w:val="BF4E14" w:themeColor="accent2" w:themeShade="BF"/>
-                <w:lang w:val="en-IN"/>
-              </w:rPr>
-            </w:pPr>
-            <w:r>
-              <w:rPr>
-                <w:rFonts w:ascii="Aptos" w:hAnsi="Aptos"/>
-                <w:b/>
-                <w:bCs/>
-                <w:color w:val="BF4E14" w:themeColor="accent2" w:themeShade="BF"/>
+                <w:color w:val="F2CEED" w:themeColor="accent5" w:themeTint="33"/>
+                <w:lang w:val="en-IN"/>
+              </w:rPr>
+            </w:pPr>
+            <w:r>
+              <w:rPr>
+                <w:rFonts w:ascii="Aptos" w:hAnsi="Aptos"/>
+                <w:b/>
+                <w:bCs/>
+                <w:color w:val="F2CEED" w:themeColor="accent5" w:themeTint="33"/>
                 <w:lang w:val="en-IN"/>
               </w:rPr>
               <w:t xml:space="preserve">Position: </w:t>
@@ -2379,7 +2406,7 @@
             <w:r>
               <w:rPr>
                 <w:rFonts w:ascii="Aptos" w:hAnsi="Aptos"/>
-                <w:color w:val="BF4E14" w:themeColor="accent2" w:themeShade="BF"/>
+                <w:color w:val="F2CEED" w:themeColor="accent5" w:themeTint="33"/>
                 <w:lang w:val="en-IN"/>
               </w:rPr>
               <w:t xml:space="preserve"/>
@@ -2391,16 +2418,16 @@
               <w:jc w:val="both"/>
               <w:rPr>
                 <w:rFonts w:ascii="Aptos" w:hAnsi="Aptos"/>
-                <w:color w:val="BF4E14" w:themeColor="accent2" w:themeShade="BF"/>
-                <w:lang w:val="en-IN"/>
-              </w:rPr>
-            </w:pPr>
-            <w:r>
-              <w:rPr>
-                <w:rFonts w:ascii="Aptos" w:hAnsi="Aptos"/>
-                <w:b/>
-                <w:bCs/>
-                <w:color w:val="BF4E14" w:themeColor="accent2" w:themeShade="BF"/>
+                <w:color w:val="F2CEED" w:themeColor="accent5" w:themeTint="33"/>
+                <w:lang w:val="en-IN"/>
+              </w:rPr>
+            </w:pPr>
+            <w:r>
+              <w:rPr>
+                <w:rFonts w:ascii="Aptos" w:hAnsi="Aptos"/>
+                <w:b/>
+                <w:bCs/>
+                <w:color w:val="F2CEED" w:themeColor="accent5" w:themeTint="33"/>
                 <w:lang w:val="en-IN"/>
               </w:rPr>
               <w:t xml:space="preserve">Tel: </w:t>
@@ -2408,7 +2435,7 @@
             <w:r>
               <w:rPr>
                 <w:rFonts w:ascii="Aptos" w:hAnsi="Aptos"/>
-                <w:color w:val="BF4E14" w:themeColor="accent2" w:themeShade="BF"/>
+                <w:color w:val="F2CEED" w:themeColor="accent5" w:themeTint="33"/>
                 <w:lang w:val="en-IN"/>
               </w:rPr>
               <w:t xml:space="preserve"/>
@@ -2429,15 +2456,16 @@
                 <w:rFonts w:ascii="Aptos" w:hAnsi="Aptos"/>
                 <w:b/>
                 <w:bCs/>
-                <w:color w:val="BF4E14" w:themeColor="accent2" w:themeShade="BF"/>
-                <w:lang w:val="en-IN"/>
-              </w:rPr>
+                <w:color w:val="F2CEED" w:themeColor="accent5" w:themeTint="33"/>
+                <w:lang w:val="en-IN"/>
+              </w:rPr>
+              <w:lastRenderedPageBreak/>
               <w:t xml:space="preserve">Email: </w:t>
             </w:r>
             <w:r>
               <w:rPr>
                 <w:rFonts w:ascii="Aptos" w:hAnsi="Aptos"/>
-                <w:color w:val="BF4E14" w:themeColor="accent2" w:themeShade="BF"/>
+                <w:color w:val="F2CEED" w:themeColor="accent5" w:themeTint="33"/>
                 <w:lang w:val="en-IN"/>
               </w:rPr>
               <w:t xml:space="preserve"/>
@@ -2463,6 +2491,7 @@
                 <w:rFonts w:ascii="Aptos" w:hAnsi="Aptos"/>
                 <w:lang w:val="en-IN"/>
               </w:rPr>
+              <w:lastRenderedPageBreak/>
               <w:t xml:space="preserve">Founder Quality Director</w:t>
             </w:r>
           </w:p>
@@ -2899,16 +2928,16 @@
                 <w:rFonts w:ascii="Aptos" w:hAnsi="Aptos"/>
                 <w:b/>
                 <w:bCs/>
-                <w:color w:val="BF4E14" w:themeColor="accent2" w:themeShade="BF"/>
-                <w:lang w:val="en-IN"/>
-              </w:rPr>
-            </w:pPr>
-            <w:r>
-              <w:rPr>
-                <w:rFonts w:ascii="Aptos" w:hAnsi="Aptos"/>
-                <w:b/>
-                <w:bCs/>
-                <w:color w:val="BF4E14" w:themeColor="accent2" w:themeShade="BF"/>
+                <w:color w:val="F2CEED" w:themeColor="accent5" w:themeTint="33"/>
+                <w:lang w:val="en-IN"/>
+              </w:rPr>
+            </w:pPr>
+            <w:r>
+              <w:rPr>
+                <w:rFonts w:ascii="Aptos" w:hAnsi="Aptos"/>
+                <w:b/>
+                <w:bCs/>
+                <w:color w:val="F2CEED" w:themeColor="accent5" w:themeTint="33"/>
                 <w:lang w:val="en-IN"/>
               </w:rPr>
               <w:t>For References:</w:t>
@@ -2920,16 +2949,16 @@
               <w:jc w:val="both"/>
               <w:rPr>
                 <w:rFonts w:ascii="Aptos" w:hAnsi="Aptos"/>
-                <w:color w:val="BF4E14" w:themeColor="accent2" w:themeShade="BF"/>
-                <w:lang w:val="en-IN"/>
-              </w:rPr>
-            </w:pPr>
-            <w:r>
-              <w:rPr>
-                <w:rFonts w:ascii="Aptos" w:hAnsi="Aptos"/>
-                <w:b/>
-                <w:bCs/>
-                <w:color w:val="BF4E14" w:themeColor="accent2" w:themeShade="BF"/>
+                <w:color w:val="F2CEED" w:themeColor="accent5" w:themeTint="33"/>
+                <w:lang w:val="en-IN"/>
+              </w:rPr>
+            </w:pPr>
+            <w:r>
+              <w:rPr>
+                <w:rFonts w:ascii="Aptos" w:hAnsi="Aptos"/>
+                <w:b/>
+                <w:bCs/>
+                <w:color w:val="F2CEED" w:themeColor="accent5" w:themeTint="33"/>
                 <w:lang w:val="en-IN"/>
               </w:rPr>
               <w:t xml:space="preserve">Name: </w:t>
@@ -2937,7 +2966,7 @@
             <w:r>
               <w:rPr>
                 <w:rFonts w:ascii="Aptos" w:hAnsi="Aptos"/>
-                <w:color w:val="BF4E14" w:themeColor="accent2" w:themeShade="BF"/>
+                <w:color w:val="F2CEED" w:themeColor="accent5" w:themeTint="33"/>
                 <w:lang w:val="en-IN"/>
               </w:rPr>
               <w:t xml:space="preserve"/>
@@ -2949,16 +2978,16 @@
               <w:jc w:val="both"/>
               <w:rPr>
                 <w:rFonts w:ascii="Aptos" w:hAnsi="Aptos"/>
-                <w:color w:val="BF4E14" w:themeColor="accent2" w:themeShade="BF"/>
-                <w:lang w:val="en-IN"/>
-              </w:rPr>
-            </w:pPr>
-            <w:r>
-              <w:rPr>
-                <w:rFonts w:ascii="Aptos" w:hAnsi="Aptos"/>
-                <w:b/>
-                <w:bCs/>
-                <w:color w:val="BF4E14" w:themeColor="accent2" w:themeShade="BF"/>
+                <w:color w:val="F2CEED" w:themeColor="accent5" w:themeTint="33"/>
+                <w:lang w:val="en-IN"/>
+              </w:rPr>
+            </w:pPr>
+            <w:r>
+              <w:rPr>
+                <w:rFonts w:ascii="Aptos" w:hAnsi="Aptos"/>
+                <w:b/>
+                <w:bCs/>
+                <w:color w:val="F2CEED" w:themeColor="accent5" w:themeTint="33"/>
                 <w:lang w:val="en-IN"/>
               </w:rPr>
               <w:t xml:space="preserve">Position: </w:t>
@@ -2966,7 +2995,7 @@
             <w:r>
               <w:rPr>
                 <w:rFonts w:ascii="Aptos" w:hAnsi="Aptos"/>
-                <w:color w:val="BF4E14" w:themeColor="accent2" w:themeShade="BF"/>
+                <w:color w:val="F2CEED" w:themeColor="accent5" w:themeTint="33"/>
                 <w:lang w:val="en-IN"/>
               </w:rPr>
               <w:t xml:space="preserve"/>
@@ -2978,16 +3007,16 @@
               <w:jc w:val="both"/>
               <w:rPr>
                 <w:rFonts w:ascii="Aptos" w:hAnsi="Aptos"/>
-                <w:color w:val="BF4E14" w:themeColor="accent2" w:themeShade="BF"/>
-                <w:lang w:val="en-IN"/>
-              </w:rPr>
-            </w:pPr>
-            <w:r>
-              <w:rPr>
-                <w:rFonts w:ascii="Aptos" w:hAnsi="Aptos"/>
-                <w:b/>
-                <w:bCs/>
-                <w:color w:val="BF4E14" w:themeColor="accent2" w:themeShade="BF"/>
+                <w:color w:val="F2CEED" w:themeColor="accent5" w:themeTint="33"/>
+                <w:lang w:val="en-IN"/>
+              </w:rPr>
+            </w:pPr>
+            <w:r>
+              <w:rPr>
+                <w:rFonts w:ascii="Aptos" w:hAnsi="Aptos"/>
+                <w:b/>
+                <w:bCs/>
+                <w:color w:val="F2CEED" w:themeColor="accent5" w:themeTint="33"/>
                 <w:lang w:val="en-IN"/>
               </w:rPr>
               <w:t xml:space="preserve">Tel: </w:t>
@@ -2995,7 +3024,7 @@
             <w:r>
               <w:rPr>
                 <w:rFonts w:ascii="Aptos" w:hAnsi="Aptos"/>
-                <w:color w:val="BF4E14" w:themeColor="accent2" w:themeShade="BF"/>
+                <w:color w:val="F2CEED" w:themeColor="accent5" w:themeTint="33"/>
                 <w:lang w:val="en-IN"/>
               </w:rPr>
               <w:t xml:space="preserve"/>
@@ -3016,15 +3045,16 @@
                 <w:rFonts w:ascii="Aptos" w:hAnsi="Aptos"/>
                 <w:b/>
                 <w:bCs/>
-                <w:color w:val="BF4E14" w:themeColor="accent2" w:themeShade="BF"/>
-                <w:lang w:val="en-IN"/>
-              </w:rPr>
+                <w:color w:val="F2CEED" w:themeColor="accent5" w:themeTint="33"/>
+                <w:lang w:val="en-IN"/>
+              </w:rPr>
+              <w:lastRenderedPageBreak/>
               <w:t xml:space="preserve">Email: </w:t>
             </w:r>
             <w:r>
               <w:rPr>
                 <w:rFonts w:ascii="Aptos" w:hAnsi="Aptos"/>
-                <w:color w:val="BF4E14" w:themeColor="accent2" w:themeShade="BF"/>
+                <w:color w:val="F2CEED" w:themeColor="accent5" w:themeTint="33"/>
                 <w:lang w:val="en-IN"/>
               </w:rPr>
               <w:t xml:space="preserve"/>
@@ -3050,6 +3080,7 @@
                 <w:rFonts w:ascii="Aptos" w:hAnsi="Aptos"/>
                 <w:lang w:val="en-IN"/>
               </w:rPr>
+              <w:lastRenderedPageBreak/>
               <w:t xml:space="preserve">Global Quality Assurance Manager</w:t>
             </w:r>
           </w:p>
@@ -3484,16 +3515,16 @@
                 <w:rFonts w:ascii="Aptos" w:hAnsi="Aptos"/>
                 <w:b/>
                 <w:bCs/>
-                <w:color w:val="BF4E14" w:themeColor="accent2" w:themeShade="BF"/>
-                <w:lang w:val="en-IN"/>
-              </w:rPr>
-            </w:pPr>
-            <w:r>
-              <w:rPr>
-                <w:rFonts w:ascii="Aptos" w:hAnsi="Aptos"/>
-                <w:b/>
-                <w:bCs/>
-                <w:color w:val="BF4E14" w:themeColor="accent2" w:themeShade="BF"/>
+                <w:color w:val="F2CEED" w:themeColor="accent5" w:themeTint="33"/>
+                <w:lang w:val="en-IN"/>
+              </w:rPr>
+            </w:pPr>
+            <w:r>
+              <w:rPr>
+                <w:rFonts w:ascii="Aptos" w:hAnsi="Aptos"/>
+                <w:b/>
+                <w:bCs/>
+                <w:color w:val="F2CEED" w:themeColor="accent5" w:themeTint="33"/>
                 <w:lang w:val="en-IN"/>
               </w:rPr>
               <w:t>For References:</w:t>
@@ -3505,16 +3536,16 @@
               <w:jc w:val="both"/>
               <w:rPr>
                 <w:rFonts w:ascii="Aptos" w:hAnsi="Aptos"/>
-                <w:color w:val="BF4E14" w:themeColor="accent2" w:themeShade="BF"/>
-                <w:lang w:val="en-IN"/>
-              </w:rPr>
-            </w:pPr>
-            <w:r>
-              <w:rPr>
-                <w:rFonts w:ascii="Aptos" w:hAnsi="Aptos"/>
-                <w:b/>
-                <w:bCs/>
-                <w:color w:val="BF4E14" w:themeColor="accent2" w:themeShade="BF"/>
+                <w:color w:val="F2CEED" w:themeColor="accent5" w:themeTint="33"/>
+                <w:lang w:val="en-IN"/>
+              </w:rPr>
+            </w:pPr>
+            <w:r>
+              <w:rPr>
+                <w:rFonts w:ascii="Aptos" w:hAnsi="Aptos"/>
+                <w:b/>
+                <w:bCs/>
+                <w:color w:val="F2CEED" w:themeColor="accent5" w:themeTint="33"/>
                 <w:lang w:val="en-IN"/>
               </w:rPr>
               <w:t xml:space="preserve">Name: </w:t>
@@ -3522,7 +3553,7 @@
             <w:r>
               <w:rPr>
                 <w:rFonts w:ascii="Aptos" w:hAnsi="Aptos"/>
-                <w:color w:val="BF4E14" w:themeColor="accent2" w:themeShade="BF"/>
+                <w:color w:val="F2CEED" w:themeColor="accent5" w:themeTint="33"/>
                 <w:lang w:val="en-IN"/>
               </w:rPr>
               <w:t xml:space="preserve"/>
@@ -3534,16 +3565,16 @@
               <w:jc w:val="both"/>
               <w:rPr>
                 <w:rFonts w:ascii="Aptos" w:hAnsi="Aptos"/>
-                <w:color w:val="BF4E14" w:themeColor="accent2" w:themeShade="BF"/>
-                <w:lang w:val="en-IN"/>
-              </w:rPr>
-            </w:pPr>
-            <w:r>
-              <w:rPr>
-                <w:rFonts w:ascii="Aptos" w:hAnsi="Aptos"/>
-                <w:b/>
-                <w:bCs/>
-                <w:color w:val="BF4E14" w:themeColor="accent2" w:themeShade="BF"/>
+                <w:color w:val="F2CEED" w:themeColor="accent5" w:themeTint="33"/>
+                <w:lang w:val="en-IN"/>
+              </w:rPr>
+            </w:pPr>
+            <w:r>
+              <w:rPr>
+                <w:rFonts w:ascii="Aptos" w:hAnsi="Aptos"/>
+                <w:b/>
+                <w:bCs/>
+                <w:color w:val="F2CEED" w:themeColor="accent5" w:themeTint="33"/>
                 <w:lang w:val="en-IN"/>
               </w:rPr>
               <w:t xml:space="preserve">Position: </w:t>
@@ -3551,7 +3582,7 @@
             <w:r>
               <w:rPr>
                 <w:rFonts w:ascii="Aptos" w:hAnsi="Aptos"/>
-                <w:color w:val="BF4E14" w:themeColor="accent2" w:themeShade="BF"/>
+                <w:color w:val="F2CEED" w:themeColor="accent5" w:themeTint="33"/>
                 <w:lang w:val="en-IN"/>
               </w:rPr>
               <w:t xml:space="preserve"/>
@@ -3563,16 +3594,16 @@
               <w:jc w:val="both"/>
               <w:rPr>
                 <w:rFonts w:ascii="Aptos" w:hAnsi="Aptos"/>
-                <w:color w:val="BF4E14" w:themeColor="accent2" w:themeShade="BF"/>
-                <w:lang w:val="en-IN"/>
-              </w:rPr>
-            </w:pPr>
-            <w:r>
-              <w:rPr>
-                <w:rFonts w:ascii="Aptos" w:hAnsi="Aptos"/>
-                <w:b/>
-                <w:bCs/>
-                <w:color w:val="BF4E14" w:themeColor="accent2" w:themeShade="BF"/>
+                <w:color w:val="F2CEED" w:themeColor="accent5" w:themeTint="33"/>
+                <w:lang w:val="en-IN"/>
+              </w:rPr>
+            </w:pPr>
+            <w:r>
+              <w:rPr>
+                <w:rFonts w:ascii="Aptos" w:hAnsi="Aptos"/>
+                <w:b/>
+                <w:bCs/>
+                <w:color w:val="F2CEED" w:themeColor="accent5" w:themeTint="33"/>
                 <w:lang w:val="en-IN"/>
               </w:rPr>
               <w:t xml:space="preserve">Tel: </w:t>
@@ -3580,7 +3611,7 @@
             <w:r>
               <w:rPr>
                 <w:rFonts w:ascii="Aptos" w:hAnsi="Aptos"/>
-                <w:color w:val="BF4E14" w:themeColor="accent2" w:themeShade="BF"/>
+                <w:color w:val="F2CEED" w:themeColor="accent5" w:themeTint="33"/>
                 <w:lang w:val="en-IN"/>
               </w:rPr>
               <w:t xml:space="preserve"/>
@@ -3601,15 +3632,16 @@
                 <w:rFonts w:ascii="Aptos" w:hAnsi="Aptos"/>
                 <w:b/>
                 <w:bCs/>
-                <w:color w:val="BF4E14" w:themeColor="accent2" w:themeShade="BF"/>
-                <w:lang w:val="en-IN"/>
-              </w:rPr>
+                <w:color w:val="F2CEED" w:themeColor="accent5" w:themeTint="33"/>
+                <w:lang w:val="en-IN"/>
+              </w:rPr>
+              <w:lastRenderedPageBreak/>
               <w:t xml:space="preserve">Email: </w:t>
             </w:r>
             <w:r>
               <w:rPr>
                 <w:rFonts w:ascii="Aptos" w:hAnsi="Aptos"/>
-                <w:color w:val="BF4E14" w:themeColor="accent2" w:themeShade="BF"/>
+                <w:color w:val="F2CEED" w:themeColor="accent5" w:themeTint="33"/>
                 <w:lang w:val="en-IN"/>
               </w:rPr>
               <w:t xml:space="preserve"/>
@@ -3635,6 +3667,7 @@
                 <w:rFonts w:ascii="Aptos" w:hAnsi="Aptos"/>
                 <w:lang w:val="en-IN"/>
               </w:rPr>
+              <w:lastRenderedPageBreak/>
               <w:t xml:space="preserve">Project Quality Assurance Manager</w:t>
             </w:r>
           </w:p>
@@ -4069,16 +4102,16 @@
                 <w:rFonts w:ascii="Aptos" w:hAnsi="Aptos"/>
                 <w:b/>
                 <w:bCs/>
-                <w:color w:val="BF4E14" w:themeColor="accent2" w:themeShade="BF"/>
-                <w:lang w:val="en-IN"/>
-              </w:rPr>
-            </w:pPr>
-            <w:r>
-              <w:rPr>
-                <w:rFonts w:ascii="Aptos" w:hAnsi="Aptos"/>
-                <w:b/>
-                <w:bCs/>
-                <w:color w:val="BF4E14" w:themeColor="accent2" w:themeShade="BF"/>
+                <w:color w:val="F2CEED" w:themeColor="accent5" w:themeTint="33"/>
+                <w:lang w:val="en-IN"/>
+              </w:rPr>
+            </w:pPr>
+            <w:r>
+              <w:rPr>
+                <w:rFonts w:ascii="Aptos" w:hAnsi="Aptos"/>
+                <w:b/>
+                <w:bCs/>
+                <w:color w:val="F2CEED" w:themeColor="accent5" w:themeTint="33"/>
                 <w:lang w:val="en-IN"/>
               </w:rPr>
               <w:t>For References:</w:t>
@@ -4090,16 +4123,16 @@
               <w:jc w:val="both"/>
               <w:rPr>
                 <w:rFonts w:ascii="Aptos" w:hAnsi="Aptos"/>
-                <w:color w:val="BF4E14" w:themeColor="accent2" w:themeShade="BF"/>
-                <w:lang w:val="en-IN"/>
-              </w:rPr>
-            </w:pPr>
-            <w:r>
-              <w:rPr>
-                <w:rFonts w:ascii="Aptos" w:hAnsi="Aptos"/>
-                <w:b/>
-                <w:bCs/>
-                <w:color w:val="BF4E14" w:themeColor="accent2" w:themeShade="BF"/>
+                <w:color w:val="F2CEED" w:themeColor="accent5" w:themeTint="33"/>
+                <w:lang w:val="en-IN"/>
+              </w:rPr>
+            </w:pPr>
+            <w:r>
+              <w:rPr>
+                <w:rFonts w:ascii="Aptos" w:hAnsi="Aptos"/>
+                <w:b/>
+                <w:bCs/>
+                <w:color w:val="F2CEED" w:themeColor="accent5" w:themeTint="33"/>
                 <w:lang w:val="en-IN"/>
               </w:rPr>
               <w:t xml:space="preserve">Name: </w:t>
@@ -4107,7 +4140,7 @@
             <w:r>
               <w:rPr>
                 <w:rFonts w:ascii="Aptos" w:hAnsi="Aptos"/>
-                <w:color w:val="BF4E14" w:themeColor="accent2" w:themeShade="BF"/>
+                <w:color w:val="F2CEED" w:themeColor="accent5" w:themeTint="33"/>
                 <w:lang w:val="en-IN"/>
               </w:rPr>
               <w:t xml:space="preserve"/>
@@ -4119,16 +4152,16 @@
               <w:jc w:val="both"/>
               <w:rPr>
                 <w:rFonts w:ascii="Aptos" w:hAnsi="Aptos"/>
-                <w:color w:val="BF4E14" w:themeColor="accent2" w:themeShade="BF"/>
-                <w:lang w:val="en-IN"/>
-              </w:rPr>
-            </w:pPr>
-            <w:r>
-              <w:rPr>
-                <w:rFonts w:ascii="Aptos" w:hAnsi="Aptos"/>
-                <w:b/>
-                <w:bCs/>
-                <w:color w:val="BF4E14" w:themeColor="accent2" w:themeShade="BF"/>
+                <w:color w:val="F2CEED" w:themeColor="accent5" w:themeTint="33"/>
+                <w:lang w:val="en-IN"/>
+              </w:rPr>
+            </w:pPr>
+            <w:r>
+              <w:rPr>
+                <w:rFonts w:ascii="Aptos" w:hAnsi="Aptos"/>
+                <w:b/>
+                <w:bCs/>
+                <w:color w:val="F2CEED" w:themeColor="accent5" w:themeTint="33"/>
                 <w:lang w:val="en-IN"/>
               </w:rPr>
               <w:t xml:space="preserve">Position: </w:t>
@@ -4136,7 +4169,7 @@
             <w:r>
               <w:rPr>
                 <w:rFonts w:ascii="Aptos" w:hAnsi="Aptos"/>
-                <w:color w:val="BF4E14" w:themeColor="accent2" w:themeShade="BF"/>
+                <w:color w:val="F2CEED" w:themeColor="accent5" w:themeTint="33"/>
                 <w:lang w:val="en-IN"/>
               </w:rPr>
               <w:t xml:space="preserve"/>
@@ -4148,16 +4181,16 @@
               <w:jc w:val="both"/>
               <w:rPr>
                 <w:rFonts w:ascii="Aptos" w:hAnsi="Aptos"/>
-                <w:color w:val="BF4E14" w:themeColor="accent2" w:themeShade="BF"/>
-                <w:lang w:val="en-IN"/>
-              </w:rPr>
-            </w:pPr>
-            <w:r>
-              <w:rPr>
-                <w:rFonts w:ascii="Aptos" w:hAnsi="Aptos"/>
-                <w:b/>
-                <w:bCs/>
-                <w:color w:val="BF4E14" w:themeColor="accent2" w:themeShade="BF"/>
+                <w:color w:val="F2CEED" w:themeColor="accent5" w:themeTint="33"/>
+                <w:lang w:val="en-IN"/>
+              </w:rPr>
+            </w:pPr>
+            <w:r>
+              <w:rPr>
+                <w:rFonts w:ascii="Aptos" w:hAnsi="Aptos"/>
+                <w:b/>
+                <w:bCs/>
+                <w:color w:val="F2CEED" w:themeColor="accent5" w:themeTint="33"/>
                 <w:lang w:val="en-IN"/>
               </w:rPr>
               <w:t xml:space="preserve">Tel: </w:t>
@@ -4165,7 +4198,7 @@
             <w:r>
               <w:rPr>
                 <w:rFonts w:ascii="Aptos" w:hAnsi="Aptos"/>
-                <w:color w:val="BF4E14" w:themeColor="accent2" w:themeShade="BF"/>
+                <w:color w:val="F2CEED" w:themeColor="accent5" w:themeTint="33"/>
                 <w:lang w:val="en-IN"/>
               </w:rPr>
               <w:t xml:space="preserve"/>
@@ -4186,15 +4219,16 @@
                 <w:rFonts w:ascii="Aptos" w:hAnsi="Aptos"/>
                 <w:b/>
                 <w:bCs/>
-                <w:color w:val="BF4E14" w:themeColor="accent2" w:themeShade="BF"/>
-                <w:lang w:val="en-IN"/>
-              </w:rPr>
+                <w:color w:val="F2CEED" w:themeColor="accent5" w:themeTint="33"/>
+                <w:lang w:val="en-IN"/>
+              </w:rPr>
+              <w:lastRenderedPageBreak/>
               <w:t xml:space="preserve">Email: </w:t>
             </w:r>
             <w:r>
               <w:rPr>
                 <w:rFonts w:ascii="Aptos" w:hAnsi="Aptos"/>
-                <w:color w:val="BF4E14" w:themeColor="accent2" w:themeShade="BF"/>
+                <w:color w:val="F2CEED" w:themeColor="accent5" w:themeTint="33"/>
                 <w:lang w:val="en-IN"/>
               </w:rPr>
               <w:t xml:space="preserve"/>
@@ -4220,6 +4254,7 @@
                 <w:rFonts w:ascii="Aptos" w:hAnsi="Aptos"/>
                 <w:lang w:val="en-IN"/>
               </w:rPr>
+              <w:lastRenderedPageBreak/>
               <w:t xml:space="preserve">Portfolio Quality Assurance Manager</w:t>
             </w:r>
           </w:p>
@@ -4654,16 +4689,16 @@
                 <w:rFonts w:ascii="Aptos" w:hAnsi="Aptos"/>
                 <w:b/>
                 <w:bCs/>
-                <w:color w:val="BF4E14" w:themeColor="accent2" w:themeShade="BF"/>
-                <w:lang w:val="en-IN"/>
-              </w:rPr>
-            </w:pPr>
-            <w:r>
-              <w:rPr>
-                <w:rFonts w:ascii="Aptos" w:hAnsi="Aptos"/>
-                <w:b/>
-                <w:bCs/>
-                <w:color w:val="BF4E14" w:themeColor="accent2" w:themeShade="BF"/>
+                <w:color w:val="F2CEED" w:themeColor="accent5" w:themeTint="33"/>
+                <w:lang w:val="en-IN"/>
+              </w:rPr>
+            </w:pPr>
+            <w:r>
+              <w:rPr>
+                <w:rFonts w:ascii="Aptos" w:hAnsi="Aptos"/>
+                <w:b/>
+                <w:bCs/>
+                <w:color w:val="F2CEED" w:themeColor="accent5" w:themeTint="33"/>
                 <w:lang w:val="en-IN"/>
               </w:rPr>
               <w:t>For References:</w:t>
@@ -4675,16 +4710,16 @@
               <w:jc w:val="both"/>
               <w:rPr>
                 <w:rFonts w:ascii="Aptos" w:hAnsi="Aptos"/>
-                <w:color w:val="BF4E14" w:themeColor="accent2" w:themeShade="BF"/>
-                <w:lang w:val="en-IN"/>
-              </w:rPr>
-            </w:pPr>
-            <w:r>
-              <w:rPr>
-                <w:rFonts w:ascii="Aptos" w:hAnsi="Aptos"/>
-                <w:b/>
-                <w:bCs/>
-                <w:color w:val="BF4E14" w:themeColor="accent2" w:themeShade="BF"/>
+                <w:color w:val="F2CEED" w:themeColor="accent5" w:themeTint="33"/>
+                <w:lang w:val="en-IN"/>
+              </w:rPr>
+            </w:pPr>
+            <w:r>
+              <w:rPr>
+                <w:rFonts w:ascii="Aptos" w:hAnsi="Aptos"/>
+                <w:b/>
+                <w:bCs/>
+                <w:color w:val="F2CEED" w:themeColor="accent5" w:themeTint="33"/>
                 <w:lang w:val="en-IN"/>
               </w:rPr>
               <w:t xml:space="preserve">Name: </w:t>
@@ -4692,7 +4727,7 @@
             <w:r>
               <w:rPr>
                 <w:rFonts w:ascii="Aptos" w:hAnsi="Aptos"/>
-                <w:color w:val="BF4E14" w:themeColor="accent2" w:themeShade="BF"/>
+                <w:color w:val="F2CEED" w:themeColor="accent5" w:themeTint="33"/>
                 <w:lang w:val="en-IN"/>
               </w:rPr>
               <w:t xml:space="preserve"/>
@@ -4704,16 +4739,16 @@
               <w:jc w:val="both"/>
               <w:rPr>
                 <w:rFonts w:ascii="Aptos" w:hAnsi="Aptos"/>
-                <w:color w:val="BF4E14" w:themeColor="accent2" w:themeShade="BF"/>
-                <w:lang w:val="en-IN"/>
-              </w:rPr>
-            </w:pPr>
-            <w:r>
-              <w:rPr>
-                <w:rFonts w:ascii="Aptos" w:hAnsi="Aptos"/>
-                <w:b/>
-                <w:bCs/>
-                <w:color w:val="BF4E14" w:themeColor="accent2" w:themeShade="BF"/>
+                <w:color w:val="F2CEED" w:themeColor="accent5" w:themeTint="33"/>
+                <w:lang w:val="en-IN"/>
+              </w:rPr>
+            </w:pPr>
+            <w:r>
+              <w:rPr>
+                <w:rFonts w:ascii="Aptos" w:hAnsi="Aptos"/>
+                <w:b/>
+                <w:bCs/>
+                <w:color w:val="F2CEED" w:themeColor="accent5" w:themeTint="33"/>
                 <w:lang w:val="en-IN"/>
               </w:rPr>
               <w:t xml:space="preserve">Position: </w:t>
@@ -4721,7 +4756,7 @@
             <w:r>
               <w:rPr>
                 <w:rFonts w:ascii="Aptos" w:hAnsi="Aptos"/>
-                <w:color w:val="BF4E14" w:themeColor="accent2" w:themeShade="BF"/>
+                <w:color w:val="F2CEED" w:themeColor="accent5" w:themeTint="33"/>
                 <w:lang w:val="en-IN"/>
               </w:rPr>
               <w:t xml:space="preserve"/>
@@ -4733,16 +4768,16 @@
               <w:jc w:val="both"/>
               <w:rPr>
                 <w:rFonts w:ascii="Aptos" w:hAnsi="Aptos"/>
-                <w:color w:val="BF4E14" w:themeColor="accent2" w:themeShade="BF"/>
-                <w:lang w:val="en-IN"/>
-              </w:rPr>
-            </w:pPr>
-            <w:r>
-              <w:rPr>
-                <w:rFonts w:ascii="Aptos" w:hAnsi="Aptos"/>
-                <w:b/>
-                <w:bCs/>
-                <w:color w:val="BF4E14" w:themeColor="accent2" w:themeShade="BF"/>
+                <w:color w:val="F2CEED" w:themeColor="accent5" w:themeTint="33"/>
+                <w:lang w:val="en-IN"/>
+              </w:rPr>
+            </w:pPr>
+            <w:r>
+              <w:rPr>
+                <w:rFonts w:ascii="Aptos" w:hAnsi="Aptos"/>
+                <w:b/>
+                <w:bCs/>
+                <w:color w:val="F2CEED" w:themeColor="accent5" w:themeTint="33"/>
                 <w:lang w:val="en-IN"/>
               </w:rPr>
               <w:t xml:space="preserve">Tel: </w:t>
@@ -4750,7 +4785,7 @@
             <w:r>
               <w:rPr>
                 <w:rFonts w:ascii="Aptos" w:hAnsi="Aptos"/>
-                <w:color w:val="BF4E14" w:themeColor="accent2" w:themeShade="BF"/>
+                <w:color w:val="F2CEED" w:themeColor="accent5" w:themeTint="33"/>
                 <w:lang w:val="en-IN"/>
               </w:rPr>
               <w:t xml:space="preserve"/>
@@ -4771,15 +4806,16 @@
                 <w:rFonts w:ascii="Aptos" w:hAnsi="Aptos"/>
                 <w:b/>
                 <w:bCs/>
-                <w:color w:val="BF4E14" w:themeColor="accent2" w:themeShade="BF"/>
-                <w:lang w:val="en-IN"/>
-              </w:rPr>
+                <w:color w:val="F2CEED" w:themeColor="accent5" w:themeTint="33"/>
+                <w:lang w:val="en-IN"/>
+              </w:rPr>
+              <w:lastRenderedPageBreak/>
               <w:t xml:space="preserve">Email: </w:t>
             </w:r>
             <w:r>
               <w:rPr>
                 <w:rFonts w:ascii="Aptos" w:hAnsi="Aptos"/>
-                <w:color w:val="BF4E14" w:themeColor="accent2" w:themeShade="BF"/>
+                <w:color w:val="F2CEED" w:themeColor="accent5" w:themeTint="33"/>
                 <w:lang w:val="en-IN"/>
               </w:rPr>
               <w:t xml:space="preserve"/>
@@ -4805,6 +4841,7 @@
                 <w:rFonts w:ascii="Aptos" w:hAnsi="Aptos"/>
                 <w:lang w:val="en-IN"/>
               </w:rPr>
+              <w:lastRenderedPageBreak/>
               <w:t xml:space="preserve">Engineering Technical Lead</w:t>
             </w:r>
           </w:p>
@@ -5239,16 +5276,16 @@
                 <w:rFonts w:ascii="Aptos" w:hAnsi="Aptos"/>
                 <w:b/>
                 <w:bCs/>
-                <w:color w:val="BF4E14" w:themeColor="accent2" w:themeShade="BF"/>
-                <w:lang w:val="en-IN"/>
-              </w:rPr>
-            </w:pPr>
-            <w:r>
-              <w:rPr>
-                <w:rFonts w:ascii="Aptos" w:hAnsi="Aptos"/>
-                <w:b/>
-                <w:bCs/>
-                <w:color w:val="BF4E14" w:themeColor="accent2" w:themeShade="BF"/>
+                <w:color w:val="F2CEED" w:themeColor="accent5" w:themeTint="33"/>
+                <w:lang w:val="en-IN"/>
+              </w:rPr>
+            </w:pPr>
+            <w:r>
+              <w:rPr>
+                <w:rFonts w:ascii="Aptos" w:hAnsi="Aptos"/>
+                <w:b/>
+                <w:bCs/>
+                <w:color w:val="F2CEED" w:themeColor="accent5" w:themeTint="33"/>
                 <w:lang w:val="en-IN"/>
               </w:rPr>
               <w:t>For References:</w:t>
@@ -5260,16 +5297,16 @@
               <w:jc w:val="both"/>
               <w:rPr>
                 <w:rFonts w:ascii="Aptos" w:hAnsi="Aptos"/>
-                <w:color w:val="BF4E14" w:themeColor="accent2" w:themeShade="BF"/>
-                <w:lang w:val="en-IN"/>
-              </w:rPr>
-            </w:pPr>
-            <w:r>
-              <w:rPr>
-                <w:rFonts w:ascii="Aptos" w:hAnsi="Aptos"/>
-                <w:b/>
-                <w:bCs/>
-                <w:color w:val="BF4E14" w:themeColor="accent2" w:themeShade="BF"/>
+                <w:color w:val="F2CEED" w:themeColor="accent5" w:themeTint="33"/>
+                <w:lang w:val="en-IN"/>
+              </w:rPr>
+            </w:pPr>
+            <w:r>
+              <w:rPr>
+                <w:rFonts w:ascii="Aptos" w:hAnsi="Aptos"/>
+                <w:b/>
+                <w:bCs/>
+                <w:color w:val="F2CEED" w:themeColor="accent5" w:themeTint="33"/>
                 <w:lang w:val="en-IN"/>
               </w:rPr>
               <w:t xml:space="preserve">Name: </w:t>
@@ -5277,7 +5314,7 @@
             <w:r>
               <w:rPr>
                 <w:rFonts w:ascii="Aptos" w:hAnsi="Aptos"/>
-                <w:color w:val="BF4E14" w:themeColor="accent2" w:themeShade="BF"/>
+                <w:color w:val="F2CEED" w:themeColor="accent5" w:themeTint="33"/>
                 <w:lang w:val="en-IN"/>
               </w:rPr>
               <w:t xml:space="preserve"/>
@@ -5289,16 +5326,16 @@
               <w:jc w:val="both"/>
               <w:rPr>
                 <w:rFonts w:ascii="Aptos" w:hAnsi="Aptos"/>
-                <w:color w:val="BF4E14" w:themeColor="accent2" w:themeShade="BF"/>
-                <w:lang w:val="en-IN"/>
-              </w:rPr>
-            </w:pPr>
-            <w:r>
-              <w:rPr>
-                <w:rFonts w:ascii="Aptos" w:hAnsi="Aptos"/>
-                <w:b/>
-                <w:bCs/>
-                <w:color w:val="BF4E14" w:themeColor="accent2" w:themeShade="BF"/>
+                <w:color w:val="F2CEED" w:themeColor="accent5" w:themeTint="33"/>
+                <w:lang w:val="en-IN"/>
+              </w:rPr>
+            </w:pPr>
+            <w:r>
+              <w:rPr>
+                <w:rFonts w:ascii="Aptos" w:hAnsi="Aptos"/>
+                <w:b/>
+                <w:bCs/>
+                <w:color w:val="F2CEED" w:themeColor="accent5" w:themeTint="33"/>
                 <w:lang w:val="en-IN"/>
               </w:rPr>
               <w:t xml:space="preserve">Position: </w:t>
@@ -5306,7 +5343,7 @@
             <w:r>
               <w:rPr>
                 <w:rFonts w:ascii="Aptos" w:hAnsi="Aptos"/>
-                <w:color w:val="BF4E14" w:themeColor="accent2" w:themeShade="BF"/>
+                <w:color w:val="F2CEED" w:themeColor="accent5" w:themeTint="33"/>
                 <w:lang w:val="en-IN"/>
               </w:rPr>
               <w:t xml:space="preserve"/>
@@ -5318,16 +5355,16 @@
               <w:jc w:val="both"/>
               <w:rPr>
                 <w:rFonts w:ascii="Aptos" w:hAnsi="Aptos"/>
-                <w:color w:val="BF4E14" w:themeColor="accent2" w:themeShade="BF"/>
-                <w:lang w:val="en-IN"/>
-              </w:rPr>
-            </w:pPr>
-            <w:r>
-              <w:rPr>
-                <w:rFonts w:ascii="Aptos" w:hAnsi="Aptos"/>
-                <w:b/>
-                <w:bCs/>
-                <w:color w:val="BF4E14" w:themeColor="accent2" w:themeShade="BF"/>
+                <w:color w:val="F2CEED" w:themeColor="accent5" w:themeTint="33"/>
+                <w:lang w:val="en-IN"/>
+              </w:rPr>
+            </w:pPr>
+            <w:r>
+              <w:rPr>
+                <w:rFonts w:ascii="Aptos" w:hAnsi="Aptos"/>
+                <w:b/>
+                <w:bCs/>
+                <w:color w:val="F2CEED" w:themeColor="accent5" w:themeTint="33"/>
                 <w:lang w:val="en-IN"/>
               </w:rPr>
               <w:t xml:space="preserve">Tel: </w:t>
@@ -5335,7 +5372,7 @@
             <w:r>
               <w:rPr>
                 <w:rFonts w:ascii="Aptos" w:hAnsi="Aptos"/>
-                <w:color w:val="BF4E14" w:themeColor="accent2" w:themeShade="BF"/>
+                <w:color w:val="F2CEED" w:themeColor="accent5" w:themeTint="33"/>
                 <w:lang w:val="en-IN"/>
               </w:rPr>
               <w:t xml:space="preserve"/>
@@ -5356,15 +5393,16 @@
                 <w:rFonts w:ascii="Aptos" w:hAnsi="Aptos"/>
                 <w:b/>
                 <w:bCs/>
-                <w:color w:val="BF4E14" w:themeColor="accent2" w:themeShade="BF"/>
-                <w:lang w:val="en-IN"/>
-              </w:rPr>
+                <w:color w:val="F2CEED" w:themeColor="accent5" w:themeTint="33"/>
+                <w:lang w:val="en-IN"/>
+              </w:rPr>
+              <w:lastRenderedPageBreak/>
               <w:t xml:space="preserve">Email: </w:t>
             </w:r>
             <w:r>
               <w:rPr>
                 <w:rFonts w:ascii="Aptos" w:hAnsi="Aptos"/>
-                <w:color w:val="BF4E14" w:themeColor="accent2" w:themeShade="BF"/>
+                <w:color w:val="F2CEED" w:themeColor="accent5" w:themeTint="33"/>
                 <w:lang w:val="en-IN"/>
               </w:rPr>
               <w:t xml:space="preserve"/>
@@ -5390,6 +5428,7 @@
                 <w:rFonts w:ascii="Aptos" w:hAnsi="Aptos"/>
                 <w:lang w:val="en-IN"/>
               </w:rPr>
+              <w:lastRenderedPageBreak/>
               <w:t xml:space="preserve">System Engineer</w:t>
             </w:r>
           </w:p>
@@ -7776,12 +7815,12 @@
       </w:pPr>
     </w:p>
     <w:sectPr>
-      <w:headerReference w:type="even" r:id="rId9"/>
-      <w:headerReference w:type="default" r:id="rId10"/>
-      <w:footerReference w:type="even" r:id="rId11"/>
-      <w:footerReference w:type="default" r:id="rId12"/>
-      <w:headerReference w:type="first" r:id="rId13"/>
-      <w:footerReference w:type="first" r:id="rId14"/>
+      <w:headerReference w:type="even" r:id="rId8"/>
+      <w:headerReference w:type="default" r:id="rId9"/>
+      <w:footerReference w:type="even" r:id="rId10"/>
+      <w:footerReference w:type="default" r:id="rId11"/>
+      <w:headerReference w:type="first" r:id="rId12"/>
+      <w:footerReference w:type="first" r:id="rId13"/>
       <w:pgSz w:w="11906" w:h="16838"/>
       <w:pgMar w:top="1440" w:right="1440" w:bottom="1440" w:left="1440" w:header="708" w:footer="122" w:gutter="0"/>
       <w:cols w:space="708"/>

</xml_diff>

<commit_message>
duration, responsibilities & alignment
</commit_message>
<xml_diff>
--- a/outputs/final_cv.docx
+++ b/outputs/final_cv.docx
@@ -83,6 +83,7 @@
         <w:gridCol w:w="4252"/>
       </w:tblGrid>
       <w:tr>
+        <w:trPr/>
         <w:tc>
           <w:tcPr>
             <w:tcW w:w="3828" w:type="dxa"/>
@@ -139,12 +140,13 @@
                 <w:color w:val="E8E8E8" w:themeColor="background2"/>
                 <w:lang w:val="en-US"/>
               </w:rPr>
-              <w:t xml:space="preserve">Quality Assurance Specialist</w:t>
+              <w:t xml:space="preserve">Chief Telecom System Engineer/ Chief Resident Engineer-Telecom (GEC to GMRCL, Ahmedabad Phase-2 Metro Project)</w:t>
             </w:r>
           </w:p>
         </w:tc>
       </w:tr>
       <w:tr>
+        <w:trPr/>
         <w:tc>
           <w:tcPr>
             <w:tcW w:w="3828" w:type="dxa"/>
@@ -203,6 +205,7 @@
         </w:tc>
       </w:tr>
       <w:tr>
+        <w:trPr/>
         <w:tc>
           <w:tcPr>
             <w:tcW w:w="3828" w:type="dxa"/>
@@ -255,12 +258,13 @@
                 <w:bCs/>
                 <w:lang w:val="en-IN"/>
               </w:rPr>
-              <w:t xml:space="preserve">Kiran Bavimani</w:t>
+              <w:t xml:space="preserve">VIPIN PRAKASH SINGH</w:t>
             </w:r>
           </w:p>
         </w:tc>
       </w:tr>
       <w:tr>
+        <w:trPr/>
         <w:tc>
           <w:tcPr>
             <w:tcW w:w="3828" w:type="dxa"/>
@@ -309,12 +313,13 @@
                 <w:rFonts w:asciiTheme="minorHAnsi" w:hAnsiTheme="minorHAnsi"/>
                 <w:lang w:val="en-IN"/>
               </w:rPr>
-              <w:t xml:space="preserve"/>
+              <w:t xml:space="preserve">7th February 1970</w:t>
             </w:r>
           </w:p>
         </w:tc>
       </w:tr>
       <w:tr>
+        <w:trPr/>
         <w:tc>
           <w:tcPr>
             <w:tcW w:w="3828" w:type="dxa"/>
@@ -373,6 +378,7 @@
         </w:tc>
       </w:tr>
       <w:tr>
+        <w:trPr/>
         <w:tc>
           <w:tcPr>
             <w:tcW w:w="3828" w:type="dxa"/>
@@ -450,6 +456,7 @@
         </w:tc>
       </w:tr>
       <w:tr>
+        <w:trPr/>
         <w:tc>
           <w:tcPr>
             <w:tcW w:w="3828" w:type="dxa"/>
@@ -499,9 +506,11 @@
                 <w:rFonts w:asciiTheme="minorHAnsi" w:hAnsiTheme="minorHAnsi"/>
                 <w:lang w:val="en-US"/>
               </w:rPr>
-              <w:t xml:space="preserve">Bachelor of Engineering in Electronics  Communication, Electronics  Communication, Kuvempu University - Government, 1999 to 2003</w:t>
+              <w:t xml:space="preserve">MBA (Project Management), Project Management, Shobhit University, Meerut, U P, 2015</w:t>
               <w:br/>
-              <w:t xml:space="preserve">PGD in MBA IBM, International Business Management, IBM, 2012 to 2013</w:t>
+              <w:t xml:space="preserve">B.E. (INSTRUMENTATION  CONTROL), INSTRUMENTATION  CONTROL, Delhi Institute of Technology (University of Delhi), Now NSIT, Kashmere Gate, Delhi-110006, 1995</w:t>
+              <w:br/>
+              <w:t xml:space="preserve">Certificate course, NGO management, IGNOU Delhi, 2010</w:t>
             </w:r>
           </w:p>
         </w:tc>
@@ -525,9 +534,7 @@
         <w:gridCol w:w="2044"/>
       </w:tblGrid>
       <w:tr>
-        <w:trPr>
-          <w:trHeight w:val="2220"/>
-        </w:trPr>
+        <w:trPr/>
         <w:tc>
           <w:tcPr>
             <w:tcW w:w="2044" w:type="dxa"/>
@@ -617,7 +624,6 @@
       </w:tblGrid>
       <w:tr>
         <w:trPr>
-          <w:trHeight w:val="161"/>
           <w:jc w:val="center"/>
         </w:trPr>
         <w:tc>
@@ -751,7 +757,7 @@
                 <w:rFonts w:asciiTheme="minorHAnsi" w:hAnsiTheme="minorHAnsi"/>
                 <w:lang w:val="en-US"/>
               </w:rPr>
-              <w:t xml:space="preserve">AI tools, MS office, Excel Automation, SAP, EDMS (Mezzoteam), Testing  CM tools (DOORS/PIVS etc), PMP, Lead Auditor IRCA/ISO 9001, SSGB, QMS Foundation, English, Hindi, Kannada, Telugu, French (DELF A1)</w:t>
+              <w:t xml:space="preserve">Ability to lead a project team, Excellent organizational and managerial skills, Good communication and interpersonal skills, Enthusiastic, positive with ability to take decisive steps at critical moments, Experience in working with different teams, Ability to work under stress and multi tasking scenario, Quick learner and can adopt to organization culture quickly, Ability to plan, execute and control an Telecom projects and interfacing with Railway/ DMRC/JMRC/GMRCL technical officials and other contractors, Ability to complete a project in a tight budget and scheduled time, Result- oriented with the ability to coordinate multiples projects and teams simultaneously, To make all necessary arrangements like procurement etc. and coordinate with contractors teams to complete the work in scheduled time, Ability to look after the quality of work to satisfy technical contractual requirements</w:t>
             </w:r>
           </w:p>
         </w:tc>
@@ -1011,6 +1017,25 @@
               <w:jc w:val="both"/>
               <w:rPr>
                 <w:rFonts w:ascii="Aptos" w:hAnsi="Aptos" w:cs="Calibri"/>
+                <w:color w:val="05436E"/>
+                <w:lang w:val="en-US"/>
+              </w:rPr>
+            </w:pPr>
+            <w:r>
+              <w:rPr>
+                <w:rFonts w:ascii="Aptos" w:hAnsi="Aptos" w:cs="Calibri"/>
+                <w:color w:val="05436E"/>
+                <w:lang w:val="en-US"/>
+              </w:rPr>
+              <w:t xml:space="preserve">May 2024 to Present</w:t>
+            </w:r>
+          </w:p>
+          <w:p>
+            <w:pPr>
+              <w:spacing w:before="60" w:after="60" w:line="240" w:lineRule="auto"/>
+              <w:jc w:val="both"/>
+              <w:rPr>
+                <w:rFonts w:ascii="Aptos" w:hAnsi="Aptos" w:cs="Calibri"/>
                 <w:i/>
                 <w:iCs/>
                 <w:color w:val="05436E"/>
@@ -1020,10 +1045,12 @@
             <w:r>
               <w:rPr>
                 <w:rFonts w:ascii="Aptos" w:hAnsi="Aptos" w:cs="Calibri"/>
+                <w:i/>
+                <w:iCs/>
                 <w:color w:val="05436E"/>
                 <w:lang w:val="en-US"/>
               </w:rPr>
-              <w:t xml:space="preserve">10`2024 till date</w:t>
+              <w:t xml:space="preserve">2 Y 1 M</w:t>
             </w:r>
           </w:p>
           <w:p>
@@ -1074,7 +1101,7 @@
                 <w:rFonts w:ascii="Aptos" w:hAnsi="Aptos"/>
                 <w:lang w:val="en-IN"/>
               </w:rPr>
-              <w:t xml:space="preserve">Freelancer</w:t>
+              <w:t xml:space="preserve">Aarvee Engineering Consultants Ltd.</w:t>
             </w:r>
           </w:p>
           <w:p>
@@ -1135,7 +1162,7 @@
                 <w:rFonts w:ascii="Aptos" w:hAnsi="Aptos"/>
                 <w:lang w:val="en-IN"/>
               </w:rPr>
-              <w:t xml:space="preserve">Quality Assurance Specialist</w:t>
+              <w:t xml:space="preserve">Chief Telecom System Engineer/ Chief Resident Engineer-Telecom (GEC to GMRCL, Ahmedabad Phase-2 Metro Project)</w:t>
             </w:r>
           </w:p>
           <w:p>
@@ -1297,7 +1324,7 @@
           <w:p>
             <w:pPr>
               <w:spacing w:before="60" w:after="60" w:line="240" w:lineRule="auto"/>
-              <w:jc w:val="center"/>
+              <w:jc w:val="both"/>
               <w:rPr>
                 <w:rFonts w:ascii="Aptos" w:hAnsi="Aptos"/>
                 <w:lang w:val="en-IN"/>
@@ -1309,7 +1336,7 @@
                 <w:lang w:val="en-IN"/>
               </w:rPr>
               <w:lastRenderedPageBreak/>
-              <w:t xml:space="preserve">Quality Assurance Specialist</w:t>
+              <w:t xml:space="preserve">Chief Telecom System Engineer/ Chief Resident Engineer-Telecom (GEC to GMRCL, Ahmedabad Phase-2 Metro Project)</w:t>
             </w:r>
           </w:p>
           <w:p>
@@ -1332,6 +1359,7 @@
           <w:p>
             <w:pPr>
               <w:spacing w:before="60" w:after="60" w:line="240" w:lineRule="auto"/>
+              <w:jc w:val="both"/>
               <w:rPr>
                 <w:rFonts w:ascii="Aptos" w:hAnsi="Aptos"/>
                 <w:b/>
@@ -1354,73 +1382,76 @@
                 <w:rFonts w:ascii="Aptos" w:hAnsi="Aptos"/>
                 <w:lang w:val="en-IN"/>
               </w:rPr>
+              <w:t xml:space="preserve">Hyderabad, Telangana 500034</w:t>
+            </w:r>
+          </w:p>
+          <w:p>
+            <w:pPr>
+              <w:spacing w:before="60" w:after="60" w:line="240" w:lineRule="auto"/>
+              <w:jc w:val="both"/>
+              <w:rPr>
+                <w:rFonts w:ascii="Aptos" w:hAnsi="Aptos"/>
+                <w:b/>
+                <w:bCs/>
+                <w:color w:val="E97132" w:themeColor="accent2"/>
+                <w:lang w:val="en-IN"/>
+              </w:rPr>
+            </w:pPr>
+          </w:p>
+          <w:p>
+            <w:pPr>
+              <w:spacing w:before="60" w:after="60" w:line="240" w:lineRule="auto"/>
+              <w:jc w:val="both"/>
+              <w:rPr>
+                <w:rFonts w:ascii="Aptos" w:hAnsi="Aptos"/>
+                <w:b/>
+                <w:bCs/>
+                <w:color w:val="156082" w:themeColor="accent1"/>
+                <w:lang w:val="en-IN"/>
+              </w:rPr>
+            </w:pPr>
+            <w:r>
+              <w:rPr>
+                <w:rFonts w:ascii="Aptos" w:hAnsi="Aptos"/>
+                <w:b/>
+                <w:bCs/>
+                <w:lang w:val="en-IN"/>
+              </w:rPr>
+              <w:t>Name of Assignment or Project:</w:t>
+            </w:r>
+            <w:r>
+              <w:rPr>
+                <w:rFonts w:ascii="Aptos" w:hAnsi="Aptos"/>
+                <w:b/>
+                <w:bCs/>
+                <w:color w:val="156082" w:themeColor="accent1"/>
+                <w:lang w:val="en-IN"/>
+              </w:rPr>
+              <w:t xml:space="preserve"> </w:t>
+            </w:r>
+            <w:r>
+              <w:rPr>
+                <w:rFonts w:ascii="Aptos" w:hAnsi="Aptos"/>
+                <w:color w:val="000000" w:themeColor="text1"/>
+                <w:lang w:val="en-IN"/>
+              </w:rPr>
               <w:t xml:space="preserve"/>
             </w:r>
-          </w:p>
-          <w:p>
-            <w:pPr>
-              <w:spacing w:before="60" w:after="60" w:line="240" w:lineRule="auto"/>
-              <w:rPr>
-                <w:rFonts w:ascii="Aptos" w:hAnsi="Aptos"/>
-                <w:b/>
-                <w:bCs/>
-                <w:color w:val="E97132" w:themeColor="accent2"/>
-                <w:lang w:val="en-IN"/>
-              </w:rPr>
-            </w:pPr>
-          </w:p>
-          <w:p>
-            <w:pPr>
-              <w:spacing w:before="60" w:after="60" w:line="240" w:lineRule="auto"/>
-              <w:rPr>
-                <w:rFonts w:ascii="Aptos" w:hAnsi="Aptos"/>
-                <w:b/>
-                <w:bCs/>
-                <w:color w:val="156082" w:themeColor="accent1"/>
-                <w:lang w:val="en-IN"/>
-              </w:rPr>
-            </w:pPr>
-            <w:r>
-              <w:rPr>
-                <w:rFonts w:ascii="Aptos" w:hAnsi="Aptos"/>
-                <w:b/>
-                <w:bCs/>
-                <w:lang w:val="en-IN"/>
-              </w:rPr>
-              <w:t>Name of Assignment or Project:</w:t>
-            </w:r>
-            <w:r>
-              <w:rPr>
-                <w:rFonts w:ascii="Aptos" w:hAnsi="Aptos"/>
-                <w:b/>
-                <w:bCs/>
-                <w:color w:val="156082" w:themeColor="accent1"/>
+            <w:r>
+              <w:rPr>
+                <w:rFonts w:ascii="Aptos" w:hAnsi="Aptos"/>
+                <w:b/>
+                <w:bCs/>
+                <w:color w:val="000000" w:themeColor="text1"/>
                 <w:lang w:val="en-IN"/>
               </w:rPr>
               <w:t xml:space="preserve"> </w:t>
             </w:r>
-            <w:r>
-              <w:rPr>
-                <w:rFonts w:ascii="Aptos" w:hAnsi="Aptos"/>
-                <w:color w:val="156082" w:themeColor="accent1"/>
-                <w:lang w:val="en-IN"/>
-              </w:rPr>
-              <w:t xml:space="preserve"/>
-            </w:r>
-            <w:r>
-              <w:rPr>
-                <w:rFonts w:ascii="Aptos" w:hAnsi="Aptos"/>
-                <w:b/>
-                <w:bCs/>
-                <w:color w:val="156082" w:themeColor="accent1"/>
-                <w:lang w:val="en-IN"/>
-              </w:rPr>
-              <w:t xml:space="preserve"> </w:t>
-            </w:r>
-          </w:p>
-          <w:p>
-            <w:pPr>
-              <w:spacing w:before="60" w:after="60" w:line="240" w:lineRule="auto"/>
+          </w:p>
+          <w:p>
+            <w:pPr>
+              <w:spacing w:before="60" w:after="60" w:line="240" w:lineRule="auto"/>
+              <w:jc w:val="both"/>
               <w:rPr>
                 <w:rFonts w:ascii="Aptos" w:hAnsi="Aptos"/>
                 <w:b/>
@@ -1435,10 +1466,9 @@
           <w:p>
             <w:pPr>
               <w:spacing w:before="60" w:after="60" w:line="240" w:lineRule="auto"/>
-              <w:rPr>
-                <w:rFonts w:ascii="Aptos" w:hAnsi="Aptos"/>
-                <w:b/>
-                <w:bCs/>
+              <w:jc w:val="both"/>
+              <w:rPr>
+                <w:rFonts w:ascii="Aptos" w:hAnsi="Aptos"/>
                 <w:lang w:val="en-IN"/>
               </w:rPr>
             </w:pPr>
@@ -1454,8 +1484,130 @@
             <w:r>
               <w:rPr>
                 <w:rFonts w:ascii="Aptos" w:hAnsi="Aptos"/>
-                <w:b/>
-                <w:bCs/>
+                <w:lang w:val="en-IN"/>
+              </w:rPr>
+              <w:t xml:space="preserve">Gujarat Metro Rail Corporation Limited (GMRCL)</w:t>
+            </w:r>
+          </w:p>
+          <w:p>
+            <w:pPr>
+              <w:spacing w:before="60" w:after="60" w:line="240" w:lineRule="auto"/>
+              <w:jc w:val="both"/>
+              <w:rPr>
+                <w:rFonts w:ascii="Aptos" w:hAnsi="Aptos"/>
+                <w:lang w:val="en-IN"/>
+              </w:rPr>
+            </w:pPr>
+          </w:p>
+          <w:p>
+            <w:pPr>
+              <w:spacing w:before="60" w:after="60" w:line="240" w:lineRule="auto"/>
+              <w:jc w:val="both"/>
+              <w:rPr>
+                <w:rFonts w:ascii="Aptos" w:hAnsi="Aptos"/>
+                <w:lang w:val="en-IN"/>
+              </w:rPr>
+            </w:pPr>
+            <w:r>
+              <w:rPr>
+                <w:rFonts w:ascii="Aptos" w:hAnsi="Aptos"/>
+                <w:b/>
+                <w:bCs/>
+                <w:lang w:val="en-IN"/>
+              </w:rPr>
+              <w:t>Year:</w:t>
+            </w:r>
+            <w:r>
+              <w:rPr>
+                <w:rFonts w:ascii="Aptos" w:hAnsi="Aptos"/>
+                <w:lang w:val="en-IN"/>
+              </w:rPr>
+              <w:t xml:space="preserve"> </w:t>
+            </w:r>
+            <w:r>
+              <w:rPr>
+                <w:rFonts w:ascii="Aptos" w:hAnsi="Aptos"/>
+                <w:lang w:val="en-IN"/>
+              </w:rPr>
+              <w:t xml:space="preserve">May 2024 to Present</w:t>
+            </w:r>
+          </w:p>
+          <w:p>
+            <w:pPr>
+              <w:spacing w:before="60" w:after="60" w:line="240" w:lineRule="auto"/>
+              <w:jc w:val="both"/>
+              <w:rPr>
+                <w:rFonts w:ascii="Aptos" w:hAnsi="Aptos"/>
+                <w:lang w:val="en-IN"/>
+              </w:rPr>
+            </w:pPr>
+          </w:p>
+          <w:p>
+            <w:pPr>
+              <w:spacing w:before="60" w:after="60" w:line="240" w:lineRule="auto"/>
+              <w:jc w:val="both"/>
+              <w:rPr>
+                <w:rFonts w:ascii="Aptos" w:hAnsi="Aptos"/>
+                <w:lang w:val="en-IN"/>
+              </w:rPr>
+            </w:pPr>
+            <w:r>
+              <w:rPr>
+                <w:rFonts w:ascii="Aptos" w:hAnsi="Aptos"/>
+                <w:b/>
+                <w:bCs/>
+                <w:lang w:val="en-IN"/>
+              </w:rPr>
+              <w:t xml:space="preserve">Main Project Features: </w:t>
+            </w:r>
+            <w:r>
+              <w:rPr>
+                <w:rFonts w:ascii="Aptos" w:hAnsi="Aptos"/>
+                <w:lang w:val="en-IN"/>
+              </w:rPr>
+              <w:t xml:space="preserve">22 Nos of Elevated Stations. 1 Nos. of Depots.</w:t>
+            </w:r>
+          </w:p>
+          <w:p>
+            <w:pPr>
+              <w:spacing w:before="60" w:after="60" w:line="240" w:lineRule="auto"/>
+              <w:jc w:val="both"/>
+              <w:rPr>
+                <w:rFonts w:ascii="Aptos" w:hAnsi="Aptos"/>
+                <w:lang w:val="en-IN"/>
+              </w:rPr>
+            </w:pPr>
+          </w:p>
+          <w:p>
+            <w:pPr>
+              <w:spacing w:before="60" w:after="60" w:line="240" w:lineRule="auto"/>
+              <w:jc w:val="both"/>
+              <w:rPr>
+                <w:rFonts w:ascii="Aptos" w:hAnsi="Aptos"/>
+                <w:lang w:val="en-IN"/>
+              </w:rPr>
+            </w:pPr>
+            <w:r>
+              <w:rPr>
+                <w:rFonts w:ascii="Aptos" w:hAnsi="Aptos"/>
+                <w:b/>
+                <w:bCs/>
+                <w:lang w:val="en-IN"/>
+              </w:rPr>
+              <w:t xml:space="preserve">Activities Performed:</w:t>
+            </w:r>
+            <w:r>
+              <w:rPr>
+                <w:rFonts w:ascii="Aptos" w:hAnsi="Aptos"/>
+                <w:b/>
+                <w:bCs/>
+                <w:lang w:val="en-IN"/>
+              </w:rPr>
+              <w:t xml:space="preserve"> </w:t>
+            </w:r>
+            <w:r>
+              <w:rPr>
+                <w:rFonts w:ascii="Aptos" w:hAnsi="Aptos"/>
                 <w:lang w:val="en-IN"/>
               </w:rPr>
               <w:t xml:space="preserve"/>
@@ -1464,61 +1616,29 @@
           <w:p>
             <w:pPr>
               <w:spacing w:before="60" w:after="60" w:line="240" w:lineRule="auto"/>
-              <w:rPr>
-                <w:rFonts w:ascii="Aptos" w:hAnsi="Aptos"/>
-                <w:lang w:val="en-IN"/>
-              </w:rPr>
-            </w:pPr>
-          </w:p>
-          <w:p>
-            <w:pPr>
-              <w:spacing w:before="60" w:after="60" w:line="240" w:lineRule="auto"/>
-              <w:rPr>
-                <w:rFonts w:ascii="Aptos" w:hAnsi="Aptos"/>
-                <w:lang w:val="en-IN"/>
-              </w:rPr>
-            </w:pPr>
-            <w:r>
-              <w:rPr>
-                <w:rFonts w:ascii="Aptos" w:hAnsi="Aptos"/>
-                <w:lang w:val="en-IN"/>
-              </w:rPr>
-              <w:t xml:space="preserve">Year: </w:t>
-            </w:r>
-            <w:r>
-              <w:rPr>
-                <w:rFonts w:ascii="Aptos" w:hAnsi="Aptos"/>
-                <w:lang w:val="en-IN"/>
-              </w:rPr>
-              <w:t xml:space="preserve">10`2024 till date</w:t>
-            </w:r>
-          </w:p>
-          <w:p>
-            <w:pPr>
-              <w:spacing w:before="60" w:after="60" w:line="240" w:lineRule="auto"/>
-              <w:rPr>
-                <w:rFonts w:ascii="Aptos" w:hAnsi="Aptos"/>
-                <w:lang w:val="en-IN"/>
-              </w:rPr>
-            </w:pPr>
-          </w:p>
-          <w:p>
-            <w:pPr>
-              <w:spacing w:before="60" w:after="60" w:line="240" w:lineRule="auto"/>
-              <w:rPr>
-                <w:rFonts w:ascii="Aptos" w:hAnsi="Aptos"/>
-                <w:lang w:val="en-IN"/>
-              </w:rPr>
-            </w:pPr>
-            <w:r>
-              <w:rPr>
-                <w:rFonts w:ascii="Aptos" w:hAnsi="Aptos"/>
-                <w:b/>
-                <w:bCs/>
-                <w:lang w:val="en-IN"/>
-              </w:rPr>
-              <w:t xml:space="preserve">Main Project Features: </w:t>
-            </w:r>
+              <w:jc w:val="both"/>
+              <w:rPr>
+                <w:rFonts w:ascii="Aptos" w:hAnsi="Aptos"/>
+                <w:lang w:val="en-IN"/>
+              </w:rPr>
+            </w:pPr>
+            <w:r>
+              <w:rPr>
+                <w:rFonts w:ascii="Aptos" w:hAnsi="Aptos"/>
+                <w:lang w:val="en-IN"/>
+              </w:rPr>
+              <w:t xml:space="preserve">• Responsible of leading project as per contract and norms of tendering, planning, monitoring, testing and controlling the installation, Testing and commissioning activities of the telecom systems like Passenger Information Display System (PIDS), Public Address System (PAS), Master Clocks System, Tetra (Radio), CCTV, FOTS, OAIT, Telephone System, Cyber Security System and ACS System etc.</w:t>
+            </w:r>
+          </w:p>
+          <w:p>
+            <w:pPr>
+              <w:spacing w:before="60" w:after="60" w:line="240" w:lineRule="auto"/>
+              <w:jc w:val="both"/>
+              <w:rPr>
+                <w:rFonts w:ascii="Aptos" w:hAnsi="Aptos"/>
+                <w:lang w:val="en-US"/>
+              </w:rPr>
+            </w:pPr>
             <w:r>
               <w:rPr>
                 <w:rFonts w:ascii="Aptos" w:hAnsi="Aptos"/>
@@ -1530,46 +1650,69 @@
           <w:p>
             <w:pPr>
               <w:spacing w:before="60" w:after="60" w:line="240" w:lineRule="auto"/>
-              <w:rPr>
-                <w:rFonts w:ascii="Aptos" w:hAnsi="Aptos"/>
-                <w:lang w:val="en-IN"/>
-              </w:rPr>
-            </w:pPr>
-          </w:p>
-          <w:p>
-            <w:pPr>
-              <w:spacing w:before="60" w:after="60" w:line="240" w:lineRule="auto"/>
-              <w:rPr>
-                <w:rFonts w:ascii="Aptos" w:hAnsi="Aptos"/>
-                <w:lang w:val="en-US"/>
-              </w:rPr>
-            </w:pPr>
-            <w:r>
-              <w:rPr>
-                <w:rFonts w:ascii="Aptos" w:hAnsi="Aptos"/>
-                <w:b/>
-                <w:bCs/>
-                <w:lang w:val="en-IN"/>
-              </w:rPr>
-              <w:t>Activities Performed:</w:t>
-            </w:r>
-            <w:r>
-              <w:rPr>
-                <w:rFonts w:ascii="Aptos" w:hAnsi="Aptos"/>
-                <w:b/>
-                <w:bCs/>
-                <w:lang w:val="en-IN"/>
-              </w:rPr>
-              <w:t xml:space="preserve"> </w:t>
-            </w:r>
-            <w:r>
-              <w:rPr>
-                <w:rFonts w:ascii="Aptos" w:hAnsi="Aptos"/>
-                <w:lang w:val="en-IN"/>
-              </w:rPr>
-              <w:t xml:space="preserve">QA: Corporate QMS, Reviews (project, documents, Issues) and Audits (IMS, Supplier Qualification, Issue based)</w:t>
-              <w:br/>
-              <w:t xml:space="preserve">QC: ITP reviews, On Site Inspections (FAT, China), Supplier Procurement Follow-up Actions</w:t>
+              <w:jc w:val="both"/>
+              <w:rPr>
+                <w:rFonts w:ascii="Aptos" w:hAnsi="Aptos"/>
+                <w:lang w:val="en-IN"/>
+              </w:rPr>
+            </w:pPr>
+            <w:r>
+              <w:rPr>
+                <w:rFonts w:ascii="Aptos" w:hAnsi="Aptos"/>
+                <w:lang w:val="en-IN"/>
+              </w:rPr>
+              <w:t xml:space="preserve">• Responsible for testing (IAT, PAT, SAT  ITC) of all telecom sub systems and reviewing design reports, drawings, technical approvals FAT, QA/QC Monitoring and documents of Telecom project.</w:t>
+            </w:r>
+          </w:p>
+          <w:p>
+            <w:pPr>
+              <w:spacing w:before="60" w:after="60" w:line="240" w:lineRule="auto"/>
+              <w:jc w:val="both"/>
+              <w:rPr>
+                <w:rFonts w:ascii="Aptos" w:hAnsi="Aptos"/>
+                <w:lang w:val="en-US"/>
+              </w:rPr>
+            </w:pPr>
+            <w:r>
+              <w:rPr>
+                <w:rFonts w:ascii="Aptos" w:hAnsi="Aptos"/>
+                <w:lang w:val="en-IN"/>
+              </w:rPr>
+              <w:t xml:space="preserve"/>
+            </w:r>
+          </w:p>
+          <w:p>
+            <w:pPr>
+              <w:spacing w:before="60" w:after="60" w:line="240" w:lineRule="auto"/>
+              <w:jc w:val="both"/>
+              <w:rPr>
+                <w:rFonts w:ascii="Aptos" w:hAnsi="Aptos"/>
+                <w:lang w:val="en-IN"/>
+              </w:rPr>
+            </w:pPr>
+            <w:r>
+              <w:rPr>
+                <w:rFonts w:ascii="Aptos" w:hAnsi="Aptos"/>
+                <w:lang w:val="en-IN"/>
+              </w:rPr>
+              <w:t xml:space="preserve">• Responsible for supervision of project, controlling and monitoring of project and contractor’s activities to ensure timely completion of Telecom project within allocated budget.</w:t>
+            </w:r>
+          </w:p>
+          <w:p>
+            <w:pPr>
+              <w:spacing w:before="60" w:after="60" w:line="240" w:lineRule="auto"/>
+              <w:jc w:val="both"/>
+              <w:rPr>
+                <w:rFonts w:ascii="Aptos" w:hAnsi="Aptos"/>
+                <w:lang w:val="en-US"/>
+              </w:rPr>
+            </w:pPr>
+            <w:r>
+              <w:rPr>
+                <w:rFonts w:ascii="Aptos" w:hAnsi="Aptos"/>
+                <w:lang w:val="en-IN"/>
+              </w:rPr>
+              <w:t xml:space="preserve"/>
             </w:r>
             <w:r>
               <w:rPr>
@@ -1598,6 +1741,25 @@
               <w:jc w:val="both"/>
               <w:rPr>
                 <w:rFonts w:ascii="Aptos" w:hAnsi="Aptos" w:cs="Calibri"/>
+                <w:color w:val="05436E"/>
+                <w:lang w:val="en-US"/>
+              </w:rPr>
+            </w:pPr>
+            <w:r>
+              <w:rPr>
+                <w:rFonts w:ascii="Aptos" w:hAnsi="Aptos" w:cs="Calibri"/>
+                <w:color w:val="05436E"/>
+                <w:lang w:val="en-US"/>
+              </w:rPr>
+              <w:t xml:space="preserve">April 2022 to July 2023</w:t>
+            </w:r>
+          </w:p>
+          <w:p>
+            <w:pPr>
+              <w:spacing w:before="60" w:after="60" w:line="240" w:lineRule="auto"/>
+              <w:jc w:val="both"/>
+              <w:rPr>
+                <w:rFonts w:ascii="Aptos" w:hAnsi="Aptos" w:cs="Calibri"/>
                 <w:i/>
                 <w:iCs/>
                 <w:color w:val="05436E"/>
@@ -1607,10 +1769,12 @@
             <w:r>
               <w:rPr>
                 <w:rFonts w:ascii="Aptos" w:hAnsi="Aptos" w:cs="Calibri"/>
+                <w:i/>
+                <w:iCs/>
                 <w:color w:val="05436E"/>
                 <w:lang w:val="en-US"/>
               </w:rPr>
-              <w:t xml:space="preserve">09'19-09'24</w:t>
+              <w:t xml:space="preserve">1 Y 3 M</w:t>
             </w:r>
           </w:p>
           <w:p>
@@ -1661,7 +1825,7 @@
                 <w:rFonts w:ascii="Aptos" w:hAnsi="Aptos"/>
                 <w:lang w:val="en-IN"/>
               </w:rPr>
-              <w:t xml:space="preserve">AECOM</w:t>
+              <w:t xml:space="preserve">Egis India Consulting Engineer Pvt. Ltd</w:t>
             </w:r>
           </w:p>
           <w:p>
@@ -1722,7 +1886,7 @@
                 <w:rFonts w:ascii="Aptos" w:hAnsi="Aptos"/>
                 <w:lang w:val="en-IN"/>
               </w:rPr>
-              <w:t xml:space="preserve">Senior Quality Assurance Expert (SQAE)</w:t>
+              <w:t xml:space="preserve">Dy. Chief Telecom System Engineer/ Chief Resident Engineer-Telecom (GEC to GMRCL, Surat Metro)</w:t>
             </w:r>
           </w:p>
           <w:p>
@@ -1884,7 +2048,7 @@
           <w:p>
             <w:pPr>
               <w:spacing w:before="60" w:after="60" w:line="240" w:lineRule="auto"/>
-              <w:jc w:val="center"/>
+              <w:jc w:val="both"/>
               <w:rPr>
                 <w:rFonts w:ascii="Aptos" w:hAnsi="Aptos"/>
                 <w:lang w:val="en-IN"/>
@@ -1896,7 +2060,7 @@
                 <w:lang w:val="en-IN"/>
               </w:rPr>
               <w:lastRenderedPageBreak/>
-              <w:t xml:space="preserve">Senior Quality Assurance Expert (SQAE)</w:t>
+              <w:t xml:space="preserve">Dy. Chief Telecom System Engineer/ Chief Resident Engineer-Telecom (GEC to GMRCL, Surat Metro)</w:t>
             </w:r>
           </w:p>
           <w:p>
@@ -1919,6 +2083,7 @@
           <w:p>
             <w:pPr>
               <w:spacing w:before="60" w:after="60" w:line="240" w:lineRule="auto"/>
+              <w:jc w:val="both"/>
               <w:rPr>
                 <w:rFonts w:ascii="Aptos" w:hAnsi="Aptos"/>
                 <w:b/>
@@ -1941,12 +2106,13 @@
                 <w:rFonts w:ascii="Aptos" w:hAnsi="Aptos"/>
                 <w:lang w:val="en-IN"/>
               </w:rPr>
-              <w:t xml:space="preserve">Pune</w:t>
-            </w:r>
-          </w:p>
-          <w:p>
-            <w:pPr>
-              <w:spacing w:before="60" w:after="60" w:line="240" w:lineRule="auto"/>
+              <w:t xml:space="preserve">Gurugram, Haryana-122001</w:t>
+            </w:r>
+          </w:p>
+          <w:p>
+            <w:pPr>
+              <w:spacing w:before="60" w:after="60" w:line="240" w:lineRule="auto"/>
+              <w:jc w:val="both"/>
               <w:rPr>
                 <w:rFonts w:ascii="Aptos" w:hAnsi="Aptos"/>
                 <w:b/>
@@ -1959,6 +2125,7 @@
           <w:p>
             <w:pPr>
               <w:spacing w:before="60" w:after="60" w:line="240" w:lineRule="auto"/>
+              <w:jc w:val="both"/>
               <w:rPr>
                 <w:rFonts w:ascii="Aptos" w:hAnsi="Aptos"/>
                 <w:b/>
@@ -1989,7 +2156,7 @@
             <w:r>
               <w:rPr>
                 <w:rFonts w:ascii="Aptos" w:hAnsi="Aptos"/>
-                <w:color w:val="156082" w:themeColor="accent1"/>
+                <w:color w:val="000000" w:themeColor="text1"/>
                 <w:lang w:val="en-IN"/>
               </w:rPr>
               <w:t xml:space="preserve"/>
@@ -1999,7 +2166,7 @@
                 <w:rFonts w:ascii="Aptos" w:hAnsi="Aptos"/>
                 <w:b/>
                 <w:bCs/>
-                <w:color w:val="156082" w:themeColor="accent1"/>
+                <w:color w:val="000000" w:themeColor="text1"/>
                 <w:lang w:val="en-IN"/>
               </w:rPr>
               <w:t xml:space="preserve"> </w:t>
@@ -2008,6 +2175,7 @@
           <w:p>
             <w:pPr>
               <w:spacing w:before="60" w:after="60" w:line="240" w:lineRule="auto"/>
+              <w:jc w:val="both"/>
               <w:rPr>
                 <w:rFonts w:ascii="Aptos" w:hAnsi="Aptos"/>
                 <w:b/>
@@ -2022,10 +2190,9 @@
           <w:p>
             <w:pPr>
               <w:spacing w:before="60" w:after="60" w:line="240" w:lineRule="auto"/>
-              <w:rPr>
-                <w:rFonts w:ascii="Aptos" w:hAnsi="Aptos"/>
-                <w:b/>
-                <w:bCs/>
+              <w:jc w:val="both"/>
+              <w:rPr>
+                <w:rFonts w:ascii="Aptos" w:hAnsi="Aptos"/>
                 <w:lang w:val="en-IN"/>
               </w:rPr>
             </w:pPr>
@@ -2041,57 +2208,68 @@
             <w:r>
               <w:rPr>
                 <w:rFonts w:ascii="Aptos" w:hAnsi="Aptos"/>
-                <w:b/>
-                <w:bCs/>
-                <w:lang w:val="en-IN"/>
-              </w:rPr>
-              <w:t xml:space="preserve">Maha-Metro Rail Corporation</w:t>
-            </w:r>
-          </w:p>
-          <w:p>
-            <w:pPr>
-              <w:spacing w:before="60" w:after="60" w:line="240" w:lineRule="auto"/>
-              <w:rPr>
-                <w:rFonts w:ascii="Aptos" w:hAnsi="Aptos"/>
-                <w:lang w:val="en-IN"/>
-              </w:rPr>
-            </w:pPr>
-          </w:p>
-          <w:p>
-            <w:pPr>
-              <w:spacing w:before="60" w:after="60" w:line="240" w:lineRule="auto"/>
-              <w:rPr>
-                <w:rFonts w:ascii="Aptos" w:hAnsi="Aptos"/>
-                <w:lang w:val="en-IN"/>
-              </w:rPr>
-            </w:pPr>
-            <w:r>
-              <w:rPr>
-                <w:rFonts w:ascii="Aptos" w:hAnsi="Aptos"/>
-                <w:lang w:val="en-IN"/>
-              </w:rPr>
-              <w:t xml:space="preserve">Year: </w:t>
-            </w:r>
-            <w:r>
-              <w:rPr>
-                <w:rFonts w:ascii="Aptos" w:hAnsi="Aptos"/>
-                <w:lang w:val="en-IN"/>
-              </w:rPr>
-              <w:t xml:space="preserve">09'19-09'24</w:t>
-            </w:r>
-          </w:p>
-          <w:p>
-            <w:pPr>
-              <w:spacing w:before="60" w:after="60" w:line="240" w:lineRule="auto"/>
-              <w:rPr>
-                <w:rFonts w:ascii="Aptos" w:hAnsi="Aptos"/>
-                <w:lang w:val="en-IN"/>
-              </w:rPr>
-            </w:pPr>
-          </w:p>
-          <w:p>
-            <w:pPr>
-              <w:spacing w:before="60" w:after="60" w:line="240" w:lineRule="auto"/>
+                <w:lang w:val="en-IN"/>
+              </w:rPr>
+              <w:t xml:space="preserve">Gujarat Metro Rail Corporation Limited (GMRCL)</w:t>
+            </w:r>
+          </w:p>
+          <w:p>
+            <w:pPr>
+              <w:spacing w:before="60" w:after="60" w:line="240" w:lineRule="auto"/>
+              <w:jc w:val="both"/>
+              <w:rPr>
+                <w:rFonts w:ascii="Aptos" w:hAnsi="Aptos"/>
+                <w:lang w:val="en-IN"/>
+              </w:rPr>
+            </w:pPr>
+          </w:p>
+          <w:p>
+            <w:pPr>
+              <w:spacing w:before="60" w:after="60" w:line="240" w:lineRule="auto"/>
+              <w:jc w:val="both"/>
+              <w:rPr>
+                <w:rFonts w:ascii="Aptos" w:hAnsi="Aptos"/>
+                <w:lang w:val="en-IN"/>
+              </w:rPr>
+            </w:pPr>
+            <w:r>
+              <w:rPr>
+                <w:rFonts w:ascii="Aptos" w:hAnsi="Aptos"/>
+                <w:b/>
+                <w:bCs/>
+                <w:lang w:val="en-IN"/>
+              </w:rPr>
+              <w:t>Year:</w:t>
+            </w:r>
+            <w:r>
+              <w:rPr>
+                <w:rFonts w:ascii="Aptos" w:hAnsi="Aptos"/>
+                <w:lang w:val="en-IN"/>
+              </w:rPr>
+              <w:t xml:space="preserve"> </w:t>
+            </w:r>
+            <w:r>
+              <w:rPr>
+                <w:rFonts w:ascii="Aptos" w:hAnsi="Aptos"/>
+                <w:lang w:val="en-IN"/>
+              </w:rPr>
+              <w:t xml:space="preserve">April 2022 to July 2023</w:t>
+            </w:r>
+          </w:p>
+          <w:p>
+            <w:pPr>
+              <w:spacing w:before="60" w:after="60" w:line="240" w:lineRule="auto"/>
+              <w:jc w:val="both"/>
+              <w:rPr>
+                <w:rFonts w:ascii="Aptos" w:hAnsi="Aptos"/>
+                <w:lang w:val="en-IN"/>
+              </w:rPr>
+            </w:pPr>
+          </w:p>
+          <w:p>
+            <w:pPr>
+              <w:spacing w:before="60" w:after="60" w:line="240" w:lineRule="auto"/>
+              <w:jc w:val="both"/>
               <w:rPr>
                 <w:rFonts w:ascii="Aptos" w:hAnsi="Aptos"/>
                 <w:lang w:val="en-IN"/>
@@ -2111,34 +2289,36 @@
                 <w:rFonts w:ascii="Aptos" w:hAnsi="Aptos"/>
                 <w:lang w:val="en-IN"/>
               </w:rPr>
-              <w:t xml:space="preserve">Telecom/Power Supply/Traction/Telecom/MEP/L/TVS-ECS/PSD/Signalling/Rolling Stock/AFC/S etc</w:t>
-            </w:r>
-          </w:p>
-          <w:p>
-            <w:pPr>
-              <w:spacing w:before="60" w:after="60" w:line="240" w:lineRule="auto"/>
-              <w:rPr>
-                <w:rFonts w:ascii="Aptos" w:hAnsi="Aptos"/>
-                <w:lang w:val="en-IN"/>
-              </w:rPr>
-            </w:pPr>
-          </w:p>
-          <w:p>
-            <w:pPr>
-              <w:spacing w:before="60" w:after="60" w:line="240" w:lineRule="auto"/>
-              <w:rPr>
-                <w:rFonts w:ascii="Aptos" w:hAnsi="Aptos"/>
-                <w:lang w:val="en-US"/>
-              </w:rPr>
-            </w:pPr>
-            <w:r>
-              <w:rPr>
-                <w:rFonts w:ascii="Aptos" w:hAnsi="Aptos"/>
-                <w:b/>
-                <w:bCs/>
-                <w:lang w:val="en-IN"/>
-              </w:rPr>
-              <w:t>Activities Performed:</w:t>
+              <w:t xml:space="preserve">Corridor-1, 6 Nos. of UG Stations, Chowk bazar to Kapodhra and Elevated Stations-14 Nos. Corridor-2, Bheshan to Saroli, 18 Nos of Elevated Stations. 2 Nos. of Depots.</w:t>
+            </w:r>
+          </w:p>
+          <w:p>
+            <w:pPr>
+              <w:spacing w:before="60" w:after="60" w:line="240" w:lineRule="auto"/>
+              <w:jc w:val="both"/>
+              <w:rPr>
+                <w:rFonts w:ascii="Aptos" w:hAnsi="Aptos"/>
+                <w:lang w:val="en-IN"/>
+              </w:rPr>
+            </w:pPr>
+          </w:p>
+          <w:p>
+            <w:pPr>
+              <w:spacing w:before="60" w:after="60" w:line="240" w:lineRule="auto"/>
+              <w:jc w:val="both"/>
+              <w:rPr>
+                <w:rFonts w:ascii="Aptos" w:hAnsi="Aptos"/>
+                <w:lang w:val="en-IN"/>
+              </w:rPr>
+            </w:pPr>
+            <w:r>
+              <w:rPr>
+                <w:rFonts w:ascii="Aptos" w:hAnsi="Aptos"/>
+                <w:b/>
+                <w:bCs/>
+                <w:lang w:val="en-IN"/>
+              </w:rPr>
+              <w:t xml:space="preserve">Activities Performed:</w:t>
             </w:r>
             <w:r>
               <w:rPr>
@@ -2154,15 +2334,109 @@
                 <w:rFonts w:ascii="Aptos" w:hAnsi="Aptos"/>
                 <w:lang w:val="en-IN"/>
               </w:rPr>
-              <w:t xml:space="preserve">QA Surveillance role, handling 14+ Contractors in PMC/GC role to Maha-Metro Rail Corporation</w:t>
-              <w:br/>
-              <w:t xml:space="preserve">Established, Tailored  Maintain internal QMS(Manual); Approved Contractors` QMS, Mentor/Trained teams</w:t>
-              <w:br/>
-              <w:t xml:space="preserve">Approved QA/QC plans(+MS/ITP/Checklists), QA/QC resources based on expertise review</w:t>
-              <w:br/>
-              <w:t xml:space="preserve">Witnessed critical RFIs/FAT events of Material/Installation/Testing activities</w:t>
-              <w:br/>
-              <w:t xml:space="preserve">Implemented Site QA/QC plans through regular Audits/Site Visits/Reviews/RCAs  related records (KPIs/OBS/NCRs/Snag list)</w:t>
+              <w:t xml:space="preserve"/>
+            </w:r>
+          </w:p>
+          <w:p>
+            <w:pPr>
+              <w:spacing w:before="60" w:after="60" w:line="240" w:lineRule="auto"/>
+              <w:jc w:val="both"/>
+              <w:rPr>
+                <w:rFonts w:ascii="Aptos" w:hAnsi="Aptos"/>
+                <w:lang w:val="en-IN"/>
+              </w:rPr>
+            </w:pPr>
+            <w:r>
+              <w:rPr>
+                <w:rFonts w:ascii="Aptos" w:hAnsi="Aptos"/>
+                <w:lang w:val="en-IN"/>
+              </w:rPr>
+              <w:t xml:space="preserve">• Responsible of leading project as per contract and norms of tendering, planning, monitoring, testing and controlling the installation and commissioning activities of the telecom systems like Passenger Information Display System (PIDS), Public Address System (PAS), Master Clocks System, Tetra, CCTV, FOTS, Telephone System and ACS System etc.</w:t>
+            </w:r>
+          </w:p>
+          <w:p>
+            <w:pPr>
+              <w:spacing w:before="60" w:after="60" w:line="240" w:lineRule="auto"/>
+              <w:jc w:val="both"/>
+              <w:rPr>
+                <w:rFonts w:ascii="Aptos" w:hAnsi="Aptos"/>
+                <w:lang w:val="en-US"/>
+              </w:rPr>
+            </w:pPr>
+            <w:r>
+              <w:rPr>
+                <w:rFonts w:ascii="Aptos" w:hAnsi="Aptos"/>
+                <w:lang w:val="en-IN"/>
+              </w:rPr>
+              <w:t xml:space="preserve"/>
+            </w:r>
+          </w:p>
+          <w:p>
+            <w:pPr>
+              <w:spacing w:before="60" w:after="60" w:line="240" w:lineRule="auto"/>
+              <w:jc w:val="both"/>
+              <w:rPr>
+                <w:rFonts w:ascii="Aptos" w:hAnsi="Aptos"/>
+                <w:lang w:val="en-IN"/>
+              </w:rPr>
+            </w:pPr>
+            <w:r>
+              <w:rPr>
+                <w:rFonts w:ascii="Aptos" w:hAnsi="Aptos"/>
+                <w:lang w:val="en-IN"/>
+              </w:rPr>
+              <w:t xml:space="preserve">• Responsible for testing (IAT, PAT, SAT  ITC) of all telecom sub systems and reviewing design reports, drawings, technical approvals FAT, QA/QC Monitoring and documents of Telecom project.</w:t>
+            </w:r>
+          </w:p>
+          <w:p>
+            <w:pPr>
+              <w:spacing w:before="60" w:after="60" w:line="240" w:lineRule="auto"/>
+              <w:jc w:val="both"/>
+              <w:rPr>
+                <w:rFonts w:ascii="Aptos" w:hAnsi="Aptos"/>
+                <w:lang w:val="en-US"/>
+              </w:rPr>
+            </w:pPr>
+            <w:r>
+              <w:rPr>
+                <w:rFonts w:ascii="Aptos" w:hAnsi="Aptos"/>
+                <w:lang w:val="en-IN"/>
+              </w:rPr>
+              <w:t xml:space="preserve"/>
+            </w:r>
+          </w:p>
+          <w:p>
+            <w:pPr>
+              <w:spacing w:before="60" w:after="60" w:line="240" w:lineRule="auto"/>
+              <w:jc w:val="both"/>
+              <w:rPr>
+                <w:rFonts w:ascii="Aptos" w:hAnsi="Aptos"/>
+                <w:lang w:val="en-IN"/>
+              </w:rPr>
+            </w:pPr>
+            <w:r>
+              <w:rPr>
+                <w:rFonts w:ascii="Aptos" w:hAnsi="Aptos"/>
+                <w:lang w:val="en-IN"/>
+              </w:rPr>
+              <w:t xml:space="preserve">• Responsible for supervision of project, controlling and monitoring of project and contractor’s activities to ensure timely completion of Telecom project within allocated budget.</w:t>
+            </w:r>
+          </w:p>
+          <w:p>
+            <w:pPr>
+              <w:spacing w:before="60" w:after="60" w:line="240" w:lineRule="auto"/>
+              <w:jc w:val="both"/>
+              <w:rPr>
+                <w:rFonts w:ascii="Aptos" w:hAnsi="Aptos"/>
+                <w:lang w:val="en-US"/>
+              </w:rPr>
+            </w:pPr>
+            <w:r>
+              <w:rPr>
+                <w:rFonts w:ascii="Aptos" w:hAnsi="Aptos"/>
+                <w:lang w:val="en-IN"/>
+              </w:rPr>
+              <w:t xml:space="preserve"/>
             </w:r>
             <w:r>
               <w:rPr>
@@ -2191,6 +2465,25 @@
               <w:jc w:val="both"/>
               <w:rPr>
                 <w:rFonts w:ascii="Aptos" w:hAnsi="Aptos" w:cs="Calibri"/>
+                <w:color w:val="05436E"/>
+                <w:lang w:val="en-US"/>
+              </w:rPr>
+            </w:pPr>
+            <w:r>
+              <w:rPr>
+                <w:rFonts w:ascii="Aptos" w:hAnsi="Aptos" w:cs="Calibri"/>
+                <w:color w:val="05436E"/>
+                <w:lang w:val="en-US"/>
+              </w:rPr>
+              <w:t xml:space="preserve">May 2021 to September 2021</w:t>
+            </w:r>
+          </w:p>
+          <w:p>
+            <w:pPr>
+              <w:spacing w:before="60" w:after="60" w:line="240" w:lineRule="auto"/>
+              <w:jc w:val="both"/>
+              <w:rPr>
+                <w:rFonts w:ascii="Aptos" w:hAnsi="Aptos" w:cs="Calibri"/>
                 <w:i/>
                 <w:iCs/>
                 <w:color w:val="05436E"/>
@@ -2200,10 +2493,12 @@
             <w:r>
               <w:rPr>
                 <w:rFonts w:ascii="Aptos" w:hAnsi="Aptos" w:cs="Calibri"/>
+                <w:i/>
+                <w:iCs/>
                 <w:color w:val="05436E"/>
                 <w:lang w:val="en-US"/>
               </w:rPr>
-              <w:t xml:space="preserve">03'2018-08'2019</w:t>
+              <w:t xml:space="preserve">4 M</w:t>
             </w:r>
           </w:p>
           <w:p>
@@ -2254,7 +2549,7 @@
                 <w:rFonts w:ascii="Aptos" w:hAnsi="Aptos"/>
                 <w:lang w:val="en-IN"/>
               </w:rPr>
-              <w:t xml:space="preserve">EEPL</w:t>
+              <w:t xml:space="preserve">Rail Mechatronics Pvt. Ltd</w:t>
             </w:r>
           </w:p>
           <w:p>
@@ -2315,7 +2610,7 @@
                 <w:rFonts w:ascii="Aptos" w:hAnsi="Aptos"/>
                 <w:lang w:val="en-IN"/>
               </w:rPr>
-              <w:t xml:space="preserve">Founder Quality Director</w:t>
+              <w:t xml:space="preserve">Project Head-TCAS 1</w:t>
             </w:r>
           </w:p>
           <w:p>
@@ -2477,7 +2772,7 @@
           <w:p>
             <w:pPr>
               <w:spacing w:before="60" w:after="60" w:line="240" w:lineRule="auto"/>
-              <w:jc w:val="center"/>
+              <w:jc w:val="both"/>
               <w:rPr>
                 <w:rFonts w:ascii="Aptos" w:hAnsi="Aptos"/>
                 <w:lang w:val="en-IN"/>
@@ -2489,7 +2784,7 @@
                 <w:lang w:val="en-IN"/>
               </w:rPr>
               <w:lastRenderedPageBreak/>
-              <w:t xml:space="preserve">Founder Quality Director</w:t>
+              <w:t xml:space="preserve">Project Head-TCAS 1</w:t>
             </w:r>
           </w:p>
           <w:p>
@@ -2512,6 +2807,7 @@
           <w:p>
             <w:pPr>
               <w:spacing w:before="60" w:after="60" w:line="240" w:lineRule="auto"/>
+              <w:jc w:val="both"/>
               <w:rPr>
                 <w:rFonts w:ascii="Aptos" w:hAnsi="Aptos"/>
                 <w:b/>
@@ -2534,12 +2830,13 @@
                 <w:rFonts w:ascii="Aptos" w:hAnsi="Aptos"/>
                 <w:lang w:val="en-IN"/>
               </w:rPr>
-              <w:t xml:space="preserve">India</w:t>
-            </w:r>
-          </w:p>
-          <w:p>
-            <w:pPr>
-              <w:spacing w:before="60" w:after="60" w:line="240" w:lineRule="auto"/>
+              <w:t xml:space="preserve">Sonipat, Haryana-131301</w:t>
+            </w:r>
+          </w:p>
+          <w:p>
+            <w:pPr>
+              <w:spacing w:before="60" w:after="60" w:line="240" w:lineRule="auto"/>
+              <w:jc w:val="both"/>
               <w:rPr>
                 <w:rFonts w:ascii="Aptos" w:hAnsi="Aptos"/>
                 <w:b/>
@@ -2552,6 +2849,7 @@
           <w:p>
             <w:pPr>
               <w:spacing w:before="60" w:after="60" w:line="240" w:lineRule="auto"/>
+              <w:jc w:val="both"/>
               <w:rPr>
                 <w:rFonts w:ascii="Aptos" w:hAnsi="Aptos"/>
                 <w:b/>
@@ -2582,7 +2880,7 @@
             <w:r>
               <w:rPr>
                 <w:rFonts w:ascii="Aptos" w:hAnsi="Aptos"/>
-                <w:color w:val="156082" w:themeColor="accent1"/>
+                <w:color w:val="000000" w:themeColor="text1"/>
                 <w:lang w:val="en-IN"/>
               </w:rPr>
               <w:t xml:space="preserve"/>
@@ -2592,7 +2890,7 @@
                 <w:rFonts w:ascii="Aptos" w:hAnsi="Aptos"/>
                 <w:b/>
                 <w:bCs/>
-                <w:color w:val="156082" w:themeColor="accent1"/>
+                <w:color w:val="000000" w:themeColor="text1"/>
                 <w:lang w:val="en-IN"/>
               </w:rPr>
               <w:t xml:space="preserve"> </w:t>
@@ -2601,6 +2899,7 @@
           <w:p>
             <w:pPr>
               <w:spacing w:before="60" w:after="60" w:line="240" w:lineRule="auto"/>
+              <w:jc w:val="both"/>
               <w:rPr>
                 <w:rFonts w:ascii="Aptos" w:hAnsi="Aptos"/>
                 <w:b/>
@@ -2615,10 +2914,9 @@
           <w:p>
             <w:pPr>
               <w:spacing w:before="60" w:after="60" w:line="240" w:lineRule="auto"/>
-              <w:rPr>
-                <w:rFonts w:ascii="Aptos" w:hAnsi="Aptos"/>
-                <w:b/>
-                <w:bCs/>
+              <w:jc w:val="both"/>
+              <w:rPr>
+                <w:rFonts w:ascii="Aptos" w:hAnsi="Aptos"/>
                 <w:lang w:val="en-IN"/>
               </w:rPr>
             </w:pPr>
@@ -2634,8 +2932,85 @@
             <w:r>
               <w:rPr>
                 <w:rFonts w:ascii="Aptos" w:hAnsi="Aptos"/>
-                <w:b/>
-                <w:bCs/>
+                <w:lang w:val="en-IN"/>
+              </w:rPr>
+              <w:t xml:space="preserve">South Central Railway (SCR)</w:t>
+            </w:r>
+          </w:p>
+          <w:p>
+            <w:pPr>
+              <w:spacing w:before="60" w:after="60" w:line="240" w:lineRule="auto"/>
+              <w:jc w:val="both"/>
+              <w:rPr>
+                <w:rFonts w:ascii="Aptos" w:hAnsi="Aptos"/>
+                <w:lang w:val="en-IN"/>
+              </w:rPr>
+            </w:pPr>
+          </w:p>
+          <w:p>
+            <w:pPr>
+              <w:spacing w:before="60" w:after="60" w:line="240" w:lineRule="auto"/>
+              <w:jc w:val="both"/>
+              <w:rPr>
+                <w:rFonts w:ascii="Aptos" w:hAnsi="Aptos"/>
+                <w:lang w:val="en-IN"/>
+              </w:rPr>
+            </w:pPr>
+            <w:r>
+              <w:rPr>
+                <w:rFonts w:ascii="Aptos" w:hAnsi="Aptos"/>
+                <w:b/>
+                <w:bCs/>
+                <w:lang w:val="en-IN"/>
+              </w:rPr>
+              <w:t>Year:</w:t>
+            </w:r>
+            <w:r>
+              <w:rPr>
+                <w:rFonts w:ascii="Aptos" w:hAnsi="Aptos"/>
+                <w:lang w:val="en-IN"/>
+              </w:rPr>
+              <w:t xml:space="preserve"> </w:t>
+            </w:r>
+            <w:r>
+              <w:rPr>
+                <w:rFonts w:ascii="Aptos" w:hAnsi="Aptos"/>
+                <w:lang w:val="en-IN"/>
+              </w:rPr>
+              <w:t xml:space="preserve">May 2021 to September 2021</w:t>
+            </w:r>
+          </w:p>
+          <w:p>
+            <w:pPr>
+              <w:spacing w:before="60" w:after="60" w:line="240" w:lineRule="auto"/>
+              <w:jc w:val="both"/>
+              <w:rPr>
+                <w:rFonts w:ascii="Aptos" w:hAnsi="Aptos"/>
+                <w:lang w:val="en-IN"/>
+              </w:rPr>
+            </w:pPr>
+          </w:p>
+          <w:p>
+            <w:pPr>
+              <w:spacing w:before="60" w:after="60" w:line="240" w:lineRule="auto"/>
+              <w:jc w:val="both"/>
+              <w:rPr>
+                <w:rFonts w:ascii="Aptos" w:hAnsi="Aptos"/>
+                <w:lang w:val="en-IN"/>
+              </w:rPr>
+            </w:pPr>
+            <w:r>
+              <w:rPr>
+                <w:rFonts w:ascii="Aptos" w:hAnsi="Aptos"/>
+                <w:b/>
+                <w:bCs/>
+                <w:lang w:val="en-IN"/>
+              </w:rPr>
+              <w:t xml:space="preserve">Main Project Features: </w:t>
+            </w:r>
+            <w:r>
+              <w:rPr>
+                <w:rFonts w:ascii="Aptos" w:hAnsi="Aptos"/>
                 <w:lang w:val="en-IN"/>
               </w:rPr>
               <w:t xml:space="preserve"/>
@@ -2644,94 +3019,30 @@
           <w:p>
             <w:pPr>
               <w:spacing w:before="60" w:after="60" w:line="240" w:lineRule="auto"/>
-              <w:rPr>
-                <w:rFonts w:ascii="Aptos" w:hAnsi="Aptos"/>
-                <w:lang w:val="en-IN"/>
-              </w:rPr>
-            </w:pPr>
-          </w:p>
-          <w:p>
-            <w:pPr>
-              <w:spacing w:before="60" w:after="60" w:line="240" w:lineRule="auto"/>
-              <w:rPr>
-                <w:rFonts w:ascii="Aptos" w:hAnsi="Aptos"/>
-                <w:lang w:val="en-IN"/>
-              </w:rPr>
-            </w:pPr>
-            <w:r>
-              <w:rPr>
-                <w:rFonts w:ascii="Aptos" w:hAnsi="Aptos"/>
-                <w:lang w:val="en-IN"/>
-              </w:rPr>
-              <w:t xml:space="preserve">Year: </w:t>
-            </w:r>
-            <w:r>
-              <w:rPr>
-                <w:rFonts w:ascii="Aptos" w:hAnsi="Aptos"/>
-                <w:lang w:val="en-IN"/>
-              </w:rPr>
-              <w:t xml:space="preserve">03'2018-08'2019</w:t>
-            </w:r>
-          </w:p>
-          <w:p>
-            <w:pPr>
-              <w:spacing w:before="60" w:after="60" w:line="240" w:lineRule="auto"/>
-              <w:rPr>
-                <w:rFonts w:ascii="Aptos" w:hAnsi="Aptos"/>
-                <w:lang w:val="en-IN"/>
-              </w:rPr>
-            </w:pPr>
-          </w:p>
-          <w:p>
-            <w:pPr>
-              <w:spacing w:before="60" w:after="60" w:line="240" w:lineRule="auto"/>
-              <w:rPr>
-                <w:rFonts w:ascii="Aptos" w:hAnsi="Aptos"/>
-                <w:lang w:val="en-IN"/>
-              </w:rPr>
-            </w:pPr>
-            <w:r>
-              <w:rPr>
-                <w:rFonts w:ascii="Aptos" w:hAnsi="Aptos"/>
-                <w:b/>
-                <w:bCs/>
-                <w:lang w:val="en-IN"/>
-              </w:rPr>
-              <w:t xml:space="preserve">Main Project Features: </w:t>
-            </w:r>
-            <w:r>
-              <w:rPr>
-                <w:rFonts w:ascii="Aptos" w:hAnsi="Aptos"/>
-                <w:lang w:val="en-IN"/>
-              </w:rPr>
-              <w:t xml:space="preserve">ELV / Embedded Systems (IoT Hardware and Software) and Supplier Management</w:t>
-            </w:r>
-          </w:p>
-          <w:p>
-            <w:pPr>
-              <w:spacing w:before="60" w:after="60" w:line="240" w:lineRule="auto"/>
-              <w:rPr>
-                <w:rFonts w:ascii="Aptos" w:hAnsi="Aptos"/>
-                <w:lang w:val="en-IN"/>
-              </w:rPr>
-            </w:pPr>
-          </w:p>
-          <w:p>
-            <w:pPr>
-              <w:spacing w:before="60" w:after="60" w:line="240" w:lineRule="auto"/>
-              <w:rPr>
-                <w:rFonts w:ascii="Aptos" w:hAnsi="Aptos"/>
-                <w:lang w:val="en-US"/>
-              </w:rPr>
-            </w:pPr>
-            <w:r>
-              <w:rPr>
-                <w:rFonts w:ascii="Aptos" w:hAnsi="Aptos"/>
-                <w:b/>
-                <w:bCs/>
-                <w:lang w:val="en-IN"/>
-              </w:rPr>
-              <w:t>Activities Performed:</w:t>
+              <w:jc w:val="both"/>
+              <w:rPr>
+                <w:rFonts w:ascii="Aptos" w:hAnsi="Aptos"/>
+                <w:lang w:val="en-IN"/>
+              </w:rPr>
+            </w:pPr>
+          </w:p>
+          <w:p>
+            <w:pPr>
+              <w:spacing w:before="60" w:after="60" w:line="240" w:lineRule="auto"/>
+              <w:jc w:val="both"/>
+              <w:rPr>
+                <w:rFonts w:ascii="Aptos" w:hAnsi="Aptos"/>
+                <w:lang w:val="en-IN"/>
+              </w:rPr>
+            </w:pPr>
+            <w:r>
+              <w:rPr>
+                <w:rFonts w:ascii="Aptos" w:hAnsi="Aptos"/>
+                <w:b/>
+                <w:bCs/>
+                <w:lang w:val="en-IN"/>
+              </w:rPr>
+              <w:t xml:space="preserve">Activities Performed:</w:t>
             </w:r>
             <w:r>
               <w:rPr>
@@ -2747,11 +3058,211 @@
                 <w:rFonts w:ascii="Aptos" w:hAnsi="Aptos"/>
                 <w:lang w:val="en-IN"/>
               </w:rPr>
-              <w:t xml:space="preserve">SPOC for QA/QC activities from Concept-Implementation of IoT products</w:t>
-              <w:br/>
-              <w:t xml:space="preserve">Established and maintained the QMS implementing the “Culture of Quality” with focus on COPQ</w:t>
-              <w:br/>
-              <w:t xml:space="preserve">Supplier Management (Qualification, Audits and performance monitoring)</w:t>
+              <w:t xml:space="preserve"/>
+            </w:r>
+          </w:p>
+          <w:p>
+            <w:pPr>
+              <w:spacing w:before="60" w:after="60" w:line="240" w:lineRule="auto"/>
+              <w:jc w:val="both"/>
+              <w:rPr>
+                <w:rFonts w:ascii="Aptos" w:hAnsi="Aptos"/>
+                <w:lang w:val="en-IN"/>
+              </w:rPr>
+            </w:pPr>
+            <w:r>
+              <w:rPr>
+                <w:rFonts w:ascii="Aptos" w:hAnsi="Aptos"/>
+                <w:lang w:val="en-IN"/>
+              </w:rPr>
+              <w:t xml:space="preserve">• Responsible for planning the entire work execution of Train Collision Avoidance System (TCAS) Telecom projects in Indian Railways.</w:t>
+            </w:r>
+          </w:p>
+          <w:p>
+            <w:pPr>
+              <w:spacing w:before="60" w:after="60" w:line="240" w:lineRule="auto"/>
+              <w:jc w:val="both"/>
+              <w:rPr>
+                <w:rFonts w:ascii="Aptos" w:hAnsi="Aptos"/>
+                <w:lang w:val="en-US"/>
+              </w:rPr>
+            </w:pPr>
+            <w:r>
+              <w:rPr>
+                <w:rFonts w:ascii="Aptos" w:hAnsi="Aptos"/>
+                <w:lang w:val="en-IN"/>
+              </w:rPr>
+              <w:t xml:space="preserve"/>
+            </w:r>
+          </w:p>
+          <w:p>
+            <w:pPr>
+              <w:spacing w:before="60" w:after="60" w:line="240" w:lineRule="auto"/>
+              <w:jc w:val="both"/>
+              <w:rPr>
+                <w:rFonts w:ascii="Aptos" w:hAnsi="Aptos"/>
+                <w:lang w:val="en-IN"/>
+              </w:rPr>
+            </w:pPr>
+            <w:r>
+              <w:rPr>
+                <w:rFonts w:ascii="Aptos" w:hAnsi="Aptos"/>
+                <w:lang w:val="en-IN"/>
+              </w:rPr>
+              <w:t xml:space="preserve">• To do the interfacing with Railway officials and clients/OEMs.</w:t>
+            </w:r>
+          </w:p>
+          <w:p>
+            <w:pPr>
+              <w:spacing w:before="60" w:after="60" w:line="240" w:lineRule="auto"/>
+              <w:jc w:val="both"/>
+              <w:rPr>
+                <w:rFonts w:ascii="Aptos" w:hAnsi="Aptos"/>
+                <w:lang w:val="en-US"/>
+              </w:rPr>
+            </w:pPr>
+            <w:r>
+              <w:rPr>
+                <w:rFonts w:ascii="Aptos" w:hAnsi="Aptos"/>
+                <w:lang w:val="en-IN"/>
+              </w:rPr>
+              <w:t xml:space="preserve"/>
+            </w:r>
+          </w:p>
+          <w:p>
+            <w:pPr>
+              <w:spacing w:before="60" w:after="60" w:line="240" w:lineRule="auto"/>
+              <w:jc w:val="both"/>
+              <w:rPr>
+                <w:rFonts w:ascii="Aptos" w:hAnsi="Aptos"/>
+                <w:lang w:val="en-IN"/>
+              </w:rPr>
+            </w:pPr>
+            <w:r>
+              <w:rPr>
+                <w:rFonts w:ascii="Aptos" w:hAnsi="Aptos"/>
+                <w:lang w:val="en-IN"/>
+              </w:rPr>
+              <w:t xml:space="preserve">• Responsible for controlling and monitoring of TCAS projects to ensure timely completion.</w:t>
+            </w:r>
+          </w:p>
+          <w:p>
+            <w:pPr>
+              <w:spacing w:before="60" w:after="60" w:line="240" w:lineRule="auto"/>
+              <w:jc w:val="both"/>
+              <w:rPr>
+                <w:rFonts w:ascii="Aptos" w:hAnsi="Aptos"/>
+                <w:lang w:val="en-US"/>
+              </w:rPr>
+            </w:pPr>
+            <w:r>
+              <w:rPr>
+                <w:rFonts w:ascii="Aptos" w:hAnsi="Aptos"/>
+                <w:lang w:val="en-IN"/>
+              </w:rPr>
+              <w:t xml:space="preserve"/>
+            </w:r>
+          </w:p>
+          <w:p>
+            <w:pPr>
+              <w:spacing w:before="60" w:after="60" w:line="240" w:lineRule="auto"/>
+              <w:jc w:val="both"/>
+              <w:rPr>
+                <w:rFonts w:ascii="Aptos" w:hAnsi="Aptos"/>
+                <w:lang w:val="en-IN"/>
+              </w:rPr>
+            </w:pPr>
+            <w:r>
+              <w:rPr>
+                <w:rFonts w:ascii="Aptos" w:hAnsi="Aptos"/>
+                <w:lang w:val="en-IN"/>
+              </w:rPr>
+              <w:t xml:space="preserve">• Execution work of Loco TCAS has been completed successfully in Mauli Ali Loco Shed, Hyderabad in Loco No. 13408, 13225, 13314, 13377, 13254 and 13395.</w:t>
+            </w:r>
+          </w:p>
+          <w:p>
+            <w:pPr>
+              <w:spacing w:before="60" w:after="60" w:line="240" w:lineRule="auto"/>
+              <w:jc w:val="both"/>
+              <w:rPr>
+                <w:rFonts w:ascii="Aptos" w:hAnsi="Aptos"/>
+                <w:lang w:val="en-US"/>
+              </w:rPr>
+            </w:pPr>
+            <w:r>
+              <w:rPr>
+                <w:rFonts w:ascii="Aptos" w:hAnsi="Aptos"/>
+                <w:lang w:val="en-IN"/>
+              </w:rPr>
+              <w:t xml:space="preserve"/>
+            </w:r>
+          </w:p>
+          <w:p>
+            <w:pPr>
+              <w:spacing w:before="60" w:after="60" w:line="240" w:lineRule="auto"/>
+              <w:jc w:val="both"/>
+              <w:rPr>
+                <w:rFonts w:ascii="Aptos" w:hAnsi="Aptos"/>
+                <w:lang w:val="en-IN"/>
+              </w:rPr>
+            </w:pPr>
+            <w:r>
+              <w:rPr>
+                <w:rFonts w:ascii="Aptos" w:hAnsi="Aptos"/>
+                <w:lang w:val="en-IN"/>
+              </w:rPr>
+              <w:t xml:space="preserve">• Execution work of Loco TCAS has been completed successfully in Diesel Loco Shed, Guntakal, Andhra Pradesh in Loco No. 11392 and 13236.</w:t>
+            </w:r>
+          </w:p>
+          <w:p>
+            <w:pPr>
+              <w:spacing w:before="60" w:after="60" w:line="240" w:lineRule="auto"/>
+              <w:jc w:val="both"/>
+              <w:rPr>
+                <w:rFonts w:ascii="Aptos" w:hAnsi="Aptos"/>
+                <w:lang w:val="en-US"/>
+              </w:rPr>
+            </w:pPr>
+            <w:r>
+              <w:rPr>
+                <w:rFonts w:ascii="Aptos" w:hAnsi="Aptos"/>
+                <w:lang w:val="en-IN"/>
+              </w:rPr>
+              <w:t xml:space="preserve"/>
+            </w:r>
+          </w:p>
+          <w:p>
+            <w:pPr>
+              <w:spacing w:before="60" w:after="60" w:line="240" w:lineRule="auto"/>
+              <w:jc w:val="both"/>
+              <w:rPr>
+                <w:rFonts w:ascii="Aptos" w:hAnsi="Aptos"/>
+                <w:lang w:val="en-IN"/>
+              </w:rPr>
+            </w:pPr>
+            <w:r>
+              <w:rPr>
+                <w:rFonts w:ascii="Aptos" w:hAnsi="Aptos"/>
+                <w:lang w:val="en-IN"/>
+              </w:rPr>
+              <w:t xml:space="preserve">• Execution work of Loco TCAS has been completed successfully in Electric Loco Shed, Vijaywada, Andhra Pradesh in Loco No 25032.</w:t>
+            </w:r>
+          </w:p>
+          <w:p>
+            <w:pPr>
+              <w:spacing w:before="60" w:after="60" w:line="240" w:lineRule="auto"/>
+              <w:jc w:val="both"/>
+              <w:rPr>
+                <w:rFonts w:ascii="Aptos" w:hAnsi="Aptos"/>
+                <w:lang w:val="en-US"/>
+              </w:rPr>
+            </w:pPr>
+            <w:r>
+              <w:rPr>
+                <w:rFonts w:ascii="Aptos" w:hAnsi="Aptos"/>
+                <w:lang w:val="en-IN"/>
+              </w:rPr>
+              <w:t xml:space="preserve"/>
             </w:r>
             <w:r>
               <w:rPr>
@@ -2780,6 +3291,25 @@
               <w:jc w:val="both"/>
               <w:rPr>
                 <w:rFonts w:ascii="Aptos" w:hAnsi="Aptos" w:cs="Calibri"/>
+                <w:color w:val="05436E"/>
+                <w:lang w:val="en-US"/>
+              </w:rPr>
+            </w:pPr>
+            <w:r>
+              <w:rPr>
+                <w:rFonts w:ascii="Aptos" w:hAnsi="Aptos" w:cs="Calibri"/>
+                <w:color w:val="05436E"/>
+                <w:lang w:val="en-US"/>
+              </w:rPr>
+              <w:t xml:space="preserve">December 2019 to May 2021</w:t>
+            </w:r>
+          </w:p>
+          <w:p>
+            <w:pPr>
+              <w:spacing w:before="60" w:after="60" w:line="240" w:lineRule="auto"/>
+              <w:jc w:val="both"/>
+              <w:rPr>
+                <w:rFonts w:ascii="Aptos" w:hAnsi="Aptos" w:cs="Calibri"/>
                 <w:i/>
                 <w:iCs/>
                 <w:color w:val="05436E"/>
@@ -2789,10 +3319,12 @@
             <w:r>
               <w:rPr>
                 <w:rFonts w:ascii="Aptos" w:hAnsi="Aptos" w:cs="Calibri"/>
+                <w:i/>
+                <w:iCs/>
                 <w:color w:val="05436E"/>
                 <w:lang w:val="en-US"/>
               </w:rPr>
-              <w:t xml:space="preserve">01'16-02'18</w:t>
+              <w:t xml:space="preserve">1 Y 5 M</w:t>
             </w:r>
           </w:p>
           <w:p>
@@ -2843,7 +3375,7 @@
                 <w:rFonts w:ascii="Aptos" w:hAnsi="Aptos"/>
                 <w:lang w:val="en-IN"/>
               </w:rPr>
-              <w:t xml:space="preserve">Thales Gulf</w:t>
+              <w:t xml:space="preserve">S. S. Enterprises</w:t>
             </w:r>
           </w:p>
           <w:p>
@@ -2904,7 +3436,7 @@
                 <w:rFonts w:ascii="Aptos" w:hAnsi="Aptos"/>
                 <w:lang w:val="en-IN"/>
               </w:rPr>
-              <w:t xml:space="preserve">Global Quality Assurance Manager</w:t>
+              <w:t xml:space="preserve">Consultant-Telecom for Business Development in Telecom field</w:t>
             </w:r>
           </w:p>
           <w:p>
@@ -3066,7 +3598,7 @@
           <w:p>
             <w:pPr>
               <w:spacing w:before="60" w:after="60" w:line="240" w:lineRule="auto"/>
-              <w:jc w:val="center"/>
+              <w:jc w:val="both"/>
               <w:rPr>
                 <w:rFonts w:ascii="Aptos" w:hAnsi="Aptos"/>
                 <w:lang w:val="en-IN"/>
@@ -3078,7 +3610,7 @@
                 <w:lang w:val="en-IN"/>
               </w:rPr>
               <w:lastRenderedPageBreak/>
-              <w:t xml:space="preserve">Global Quality Assurance Manager</w:t>
+              <w:t xml:space="preserve">Consultant-Telecom for Business Development in Telecom field</w:t>
             </w:r>
           </w:p>
           <w:p>
@@ -3101,6 +3633,7 @@
           <w:p>
             <w:pPr>
               <w:spacing w:before="60" w:after="60" w:line="240" w:lineRule="auto"/>
+              <w:jc w:val="both"/>
               <w:rPr>
                 <w:rFonts w:ascii="Aptos" w:hAnsi="Aptos"/>
                 <w:b/>
@@ -3123,12 +3656,13 @@
                 <w:rFonts w:ascii="Aptos" w:hAnsi="Aptos"/>
                 <w:lang w:val="en-IN"/>
               </w:rPr>
-              <w:t xml:space="preserve">Qatar</w:t>
-            </w:r>
-          </w:p>
-          <w:p>
-            <w:pPr>
-              <w:spacing w:before="60" w:after="60" w:line="240" w:lineRule="auto"/>
+              <w:t xml:space="preserve">New Delhi-110059</w:t>
+            </w:r>
+          </w:p>
+          <w:p>
+            <w:pPr>
+              <w:spacing w:before="60" w:after="60" w:line="240" w:lineRule="auto"/>
+              <w:jc w:val="both"/>
               <w:rPr>
                 <w:rFonts w:ascii="Aptos" w:hAnsi="Aptos"/>
                 <w:b/>
@@ -3141,6 +3675,7 @@
           <w:p>
             <w:pPr>
               <w:spacing w:before="60" w:after="60" w:line="240" w:lineRule="auto"/>
+              <w:jc w:val="both"/>
               <w:rPr>
                 <w:rFonts w:ascii="Aptos" w:hAnsi="Aptos"/>
                 <w:b/>
@@ -3171,7 +3706,7 @@
             <w:r>
               <w:rPr>
                 <w:rFonts w:ascii="Aptos" w:hAnsi="Aptos"/>
-                <w:color w:val="156082" w:themeColor="accent1"/>
+                <w:color w:val="000000" w:themeColor="text1"/>
                 <w:lang w:val="en-IN"/>
               </w:rPr>
               <w:t xml:space="preserve"/>
@@ -3181,7 +3716,7 @@
                 <w:rFonts w:ascii="Aptos" w:hAnsi="Aptos"/>
                 <w:b/>
                 <w:bCs/>
-                <w:color w:val="156082" w:themeColor="accent1"/>
+                <w:color w:val="000000" w:themeColor="text1"/>
                 <w:lang w:val="en-IN"/>
               </w:rPr>
               <w:t xml:space="preserve"> </w:t>
@@ -3190,6 +3725,7 @@
           <w:p>
             <w:pPr>
               <w:spacing w:before="60" w:after="60" w:line="240" w:lineRule="auto"/>
+              <w:jc w:val="both"/>
               <w:rPr>
                 <w:rFonts w:ascii="Aptos" w:hAnsi="Aptos"/>
                 <w:b/>
@@ -3204,10 +3740,9 @@
           <w:p>
             <w:pPr>
               <w:spacing w:before="60" w:after="60" w:line="240" w:lineRule="auto"/>
-              <w:rPr>
-                <w:rFonts w:ascii="Aptos" w:hAnsi="Aptos"/>
-                <w:b/>
-                <w:bCs/>
+              <w:jc w:val="both"/>
+              <w:rPr>
+                <w:rFonts w:ascii="Aptos" w:hAnsi="Aptos"/>
                 <w:lang w:val="en-IN"/>
               </w:rPr>
             </w:pPr>
@@ -3223,8 +3758,6 @@
             <w:r>
               <w:rPr>
                 <w:rFonts w:ascii="Aptos" w:hAnsi="Aptos"/>
-                <w:b/>
-                <w:bCs/>
                 <w:lang w:val="en-IN"/>
               </w:rPr>
               <w:t xml:space="preserve"/>
@@ -3233,47 +3766,60 @@
           <w:p>
             <w:pPr>
               <w:spacing w:before="60" w:after="60" w:line="240" w:lineRule="auto"/>
-              <w:rPr>
-                <w:rFonts w:ascii="Aptos" w:hAnsi="Aptos"/>
-                <w:lang w:val="en-IN"/>
-              </w:rPr>
-            </w:pPr>
-          </w:p>
-          <w:p>
-            <w:pPr>
-              <w:spacing w:before="60" w:after="60" w:line="240" w:lineRule="auto"/>
-              <w:rPr>
-                <w:rFonts w:ascii="Aptos" w:hAnsi="Aptos"/>
-                <w:lang w:val="en-IN"/>
-              </w:rPr>
-            </w:pPr>
-            <w:r>
-              <w:rPr>
-                <w:rFonts w:ascii="Aptos" w:hAnsi="Aptos"/>
-                <w:lang w:val="en-IN"/>
-              </w:rPr>
-              <w:t xml:space="preserve">Year: </w:t>
-            </w:r>
-            <w:r>
-              <w:rPr>
-                <w:rFonts w:ascii="Aptos" w:hAnsi="Aptos"/>
-                <w:lang w:val="en-IN"/>
-              </w:rPr>
-              <w:t xml:space="preserve">01'16-02'18</w:t>
-            </w:r>
-          </w:p>
-          <w:p>
-            <w:pPr>
-              <w:spacing w:before="60" w:after="60" w:line="240" w:lineRule="auto"/>
-              <w:rPr>
-                <w:rFonts w:ascii="Aptos" w:hAnsi="Aptos"/>
-                <w:lang w:val="en-IN"/>
-              </w:rPr>
-            </w:pPr>
-          </w:p>
-          <w:p>
-            <w:pPr>
-              <w:spacing w:before="60" w:after="60" w:line="240" w:lineRule="auto"/>
+              <w:jc w:val="both"/>
+              <w:rPr>
+                <w:rFonts w:ascii="Aptos" w:hAnsi="Aptos"/>
+                <w:lang w:val="en-IN"/>
+              </w:rPr>
+            </w:pPr>
+          </w:p>
+          <w:p>
+            <w:pPr>
+              <w:spacing w:before="60" w:after="60" w:line="240" w:lineRule="auto"/>
+              <w:jc w:val="both"/>
+              <w:rPr>
+                <w:rFonts w:ascii="Aptos" w:hAnsi="Aptos"/>
+                <w:lang w:val="en-IN"/>
+              </w:rPr>
+            </w:pPr>
+            <w:r>
+              <w:rPr>
+                <w:rFonts w:ascii="Aptos" w:hAnsi="Aptos"/>
+                <w:b/>
+                <w:bCs/>
+                <w:lang w:val="en-IN"/>
+              </w:rPr>
+              <w:t>Year:</w:t>
+            </w:r>
+            <w:r>
+              <w:rPr>
+                <w:rFonts w:ascii="Aptos" w:hAnsi="Aptos"/>
+                <w:lang w:val="en-IN"/>
+              </w:rPr>
+              <w:t xml:space="preserve"> </w:t>
+            </w:r>
+            <w:r>
+              <w:rPr>
+                <w:rFonts w:ascii="Aptos" w:hAnsi="Aptos"/>
+                <w:lang w:val="en-IN"/>
+              </w:rPr>
+              <w:t xml:space="preserve">December 2019 to May 2021</w:t>
+            </w:r>
+          </w:p>
+          <w:p>
+            <w:pPr>
+              <w:spacing w:before="60" w:after="60" w:line="240" w:lineRule="auto"/>
+              <w:jc w:val="both"/>
+              <w:rPr>
+                <w:rFonts w:ascii="Aptos" w:hAnsi="Aptos"/>
+                <w:lang w:val="en-IN"/>
+              </w:rPr>
+            </w:pPr>
+          </w:p>
+          <w:p>
+            <w:pPr>
+              <w:spacing w:before="60" w:after="60" w:line="240" w:lineRule="auto"/>
+              <w:jc w:val="both"/>
               <w:rPr>
                 <w:rFonts w:ascii="Aptos" w:hAnsi="Aptos"/>
                 <w:lang w:val="en-IN"/>
@@ -3293,34 +3839,36 @@
                 <w:rFonts w:ascii="Aptos" w:hAnsi="Aptos"/>
                 <w:lang w:val="en-IN"/>
               </w:rPr>
-              <w:t xml:space="preserve">ELV / Communication and Control Systems (CCS) – 15 Sub-Systems (Telecom/PIS/PAS/Radio/FPS/BIM etc)</w:t>
-            </w:r>
-          </w:p>
-          <w:p>
-            <w:pPr>
-              <w:spacing w:before="60" w:after="60" w:line="240" w:lineRule="auto"/>
-              <w:rPr>
-                <w:rFonts w:ascii="Aptos" w:hAnsi="Aptos"/>
-                <w:lang w:val="en-IN"/>
-              </w:rPr>
-            </w:pPr>
-          </w:p>
-          <w:p>
-            <w:pPr>
-              <w:spacing w:before="60" w:after="60" w:line="240" w:lineRule="auto"/>
-              <w:rPr>
-                <w:rFonts w:ascii="Aptos" w:hAnsi="Aptos"/>
-                <w:lang w:val="en-US"/>
-              </w:rPr>
-            </w:pPr>
-            <w:r>
-              <w:rPr>
-                <w:rFonts w:ascii="Aptos" w:hAnsi="Aptos"/>
-                <w:b/>
-                <w:bCs/>
-                <w:lang w:val="en-IN"/>
-              </w:rPr>
-              <w:t>Activities Performed:</w:t>
+              <w:t xml:space="preserve"/>
+            </w:r>
+          </w:p>
+          <w:p>
+            <w:pPr>
+              <w:spacing w:before="60" w:after="60" w:line="240" w:lineRule="auto"/>
+              <w:jc w:val="both"/>
+              <w:rPr>
+                <w:rFonts w:ascii="Aptos" w:hAnsi="Aptos"/>
+                <w:lang w:val="en-IN"/>
+              </w:rPr>
+            </w:pPr>
+          </w:p>
+          <w:p>
+            <w:pPr>
+              <w:spacing w:before="60" w:after="60" w:line="240" w:lineRule="auto"/>
+              <w:jc w:val="both"/>
+              <w:rPr>
+                <w:rFonts w:ascii="Aptos" w:hAnsi="Aptos"/>
+                <w:lang w:val="en-IN"/>
+              </w:rPr>
+            </w:pPr>
+            <w:r>
+              <w:rPr>
+                <w:rFonts w:ascii="Aptos" w:hAnsi="Aptos"/>
+                <w:b/>
+                <w:bCs/>
+                <w:lang w:val="en-IN"/>
+              </w:rPr>
+              <w:t xml:space="preserve">Activities Performed:</w:t>
             </w:r>
             <w:r>
               <w:rPr>
@@ -3336,11 +3884,109 @@
                 <w:rFonts w:ascii="Aptos" w:hAnsi="Aptos"/>
                 <w:lang w:val="en-IN"/>
               </w:rPr>
-              <w:t xml:space="preserve">QMS: Tailor  Implement Corporate (Chorus)/Customer processes and train the Thales teams and sub-contractors</w:t>
-              <w:br/>
-              <w:t xml:space="preserve">Corporate QMS implementation (+SHE), ISO certification (9001:2015), Tailoring to Customer Process</w:t>
-              <w:br/>
-              <w:t xml:space="preserve">QA/QC – PQP/WMS/ITP/MAR/RI/RFIs/Calibration/NCRs, Execution, Reporting, Audits, Supplier Quality, Site Quality QC teams (internal and Sub-contractors) during Material/Installation/T phases</w:t>
+              <w:t xml:space="preserve"/>
+            </w:r>
+          </w:p>
+          <w:p>
+            <w:pPr>
+              <w:spacing w:before="60" w:after="60" w:line="240" w:lineRule="auto"/>
+              <w:jc w:val="both"/>
+              <w:rPr>
+                <w:rFonts w:ascii="Aptos" w:hAnsi="Aptos"/>
+                <w:lang w:val="en-IN"/>
+              </w:rPr>
+            </w:pPr>
+            <w:r>
+              <w:rPr>
+                <w:rFonts w:ascii="Aptos" w:hAnsi="Aptos"/>
+                <w:lang w:val="en-IN"/>
+              </w:rPr>
+              <w:t xml:space="preserve">• Responsible for expand the business and innovate new technologies to implement in Telecom domain.</w:t>
+            </w:r>
+          </w:p>
+          <w:p>
+            <w:pPr>
+              <w:spacing w:before="60" w:after="60" w:line="240" w:lineRule="auto"/>
+              <w:jc w:val="both"/>
+              <w:rPr>
+                <w:rFonts w:ascii="Aptos" w:hAnsi="Aptos"/>
+                <w:lang w:val="en-US"/>
+              </w:rPr>
+            </w:pPr>
+            <w:r>
+              <w:rPr>
+                <w:rFonts w:ascii="Aptos" w:hAnsi="Aptos"/>
+                <w:lang w:val="en-IN"/>
+              </w:rPr>
+              <w:t xml:space="preserve"/>
+            </w:r>
+          </w:p>
+          <w:p>
+            <w:pPr>
+              <w:spacing w:before="60" w:after="60" w:line="240" w:lineRule="auto"/>
+              <w:jc w:val="both"/>
+              <w:rPr>
+                <w:rFonts w:ascii="Aptos" w:hAnsi="Aptos"/>
+                <w:lang w:val="en-IN"/>
+              </w:rPr>
+            </w:pPr>
+            <w:r>
+              <w:rPr>
+                <w:rFonts w:ascii="Aptos" w:hAnsi="Aptos"/>
+                <w:lang w:val="en-IN"/>
+              </w:rPr>
+              <w:t xml:space="preserve">• To do the interfacing with officials for getting new Telecom Projects in Metro and Railways.</w:t>
+            </w:r>
+          </w:p>
+          <w:p>
+            <w:pPr>
+              <w:spacing w:before="60" w:after="60" w:line="240" w:lineRule="auto"/>
+              <w:jc w:val="both"/>
+              <w:rPr>
+                <w:rFonts w:ascii="Aptos" w:hAnsi="Aptos"/>
+                <w:lang w:val="en-US"/>
+              </w:rPr>
+            </w:pPr>
+            <w:r>
+              <w:rPr>
+                <w:rFonts w:ascii="Aptos" w:hAnsi="Aptos"/>
+                <w:lang w:val="en-IN"/>
+              </w:rPr>
+              <w:t xml:space="preserve"/>
+            </w:r>
+          </w:p>
+          <w:p>
+            <w:pPr>
+              <w:spacing w:before="60" w:after="60" w:line="240" w:lineRule="auto"/>
+              <w:jc w:val="both"/>
+              <w:rPr>
+                <w:rFonts w:ascii="Aptos" w:hAnsi="Aptos"/>
+                <w:lang w:val="en-IN"/>
+              </w:rPr>
+            </w:pPr>
+            <w:r>
+              <w:rPr>
+                <w:rFonts w:ascii="Aptos" w:hAnsi="Aptos"/>
+                <w:lang w:val="en-IN"/>
+              </w:rPr>
+              <w:t xml:space="preserve">• Responsible for making strategic partnership with reputed organizations.</w:t>
+            </w:r>
+          </w:p>
+          <w:p>
+            <w:pPr>
+              <w:spacing w:before="60" w:after="60" w:line="240" w:lineRule="auto"/>
+              <w:jc w:val="both"/>
+              <w:rPr>
+                <w:rFonts w:ascii="Aptos" w:hAnsi="Aptos"/>
+                <w:lang w:val="en-US"/>
+              </w:rPr>
+            </w:pPr>
+            <w:r>
+              <w:rPr>
+                <w:rFonts w:ascii="Aptos" w:hAnsi="Aptos"/>
+                <w:lang w:val="en-IN"/>
+              </w:rPr>
+              <w:t xml:space="preserve"/>
             </w:r>
             <w:r>
               <w:rPr>
@@ -3369,6 +4015,25 @@
               <w:jc w:val="both"/>
               <w:rPr>
                 <w:rFonts w:ascii="Aptos" w:hAnsi="Aptos" w:cs="Calibri"/>
+                <w:color w:val="05436E"/>
+                <w:lang w:val="en-US"/>
+              </w:rPr>
+            </w:pPr>
+            <w:r>
+              <w:rPr>
+                <w:rFonts w:ascii="Aptos" w:hAnsi="Aptos" w:cs="Calibri"/>
+                <w:color w:val="05436E"/>
+                <w:lang w:val="en-US"/>
+              </w:rPr>
+              <w:t xml:space="preserve">July 2012 to December 2019</w:t>
+            </w:r>
+          </w:p>
+          <w:p>
+            <w:pPr>
+              <w:spacing w:before="60" w:after="60" w:line="240" w:lineRule="auto"/>
+              <w:jc w:val="both"/>
+              <w:rPr>
+                <w:rFonts w:ascii="Aptos" w:hAnsi="Aptos" w:cs="Calibri"/>
                 <w:i/>
                 <w:iCs/>
                 <w:color w:val="05436E"/>
@@ -3378,10 +4043,12 @@
             <w:r>
               <w:rPr>
                 <w:rFonts w:ascii="Aptos" w:hAnsi="Aptos" w:cs="Calibri"/>
+                <w:i/>
+                <w:iCs/>
                 <w:color w:val="05436E"/>
                 <w:lang w:val="en-US"/>
               </w:rPr>
-              <w:t xml:space="preserve">07'12-01'16</w:t>
+              <w:t xml:space="preserve">7 Y 5 M</w:t>
             </w:r>
           </w:p>
           <w:p>
@@ -3432,7 +4099,7 @@
                 <w:rFonts w:ascii="Aptos" w:hAnsi="Aptos"/>
                 <w:lang w:val="en-IN"/>
               </w:rPr>
-              <w:t xml:space="preserve">Thales India</w:t>
+              <w:t xml:space="preserve">Autometers Alliance Limited</w:t>
             </w:r>
           </w:p>
           <w:p>
@@ -3493,7 +4160,7 @@
                 <w:rFonts w:ascii="Aptos" w:hAnsi="Aptos"/>
                 <w:lang w:val="en-IN"/>
               </w:rPr>
-              <w:t xml:space="preserve">Project Quality Assurance Manager</w:t>
+              <w:t xml:space="preserve">Manager-Project (Metro-Telecom)</w:t>
             </w:r>
           </w:p>
           <w:p>
@@ -3655,7 +4322,7 @@
           <w:p>
             <w:pPr>
               <w:spacing w:before="60" w:after="60" w:line="240" w:lineRule="auto"/>
-              <w:jc w:val="center"/>
+              <w:jc w:val="both"/>
               <w:rPr>
                 <w:rFonts w:ascii="Aptos" w:hAnsi="Aptos"/>
                 <w:lang w:val="en-IN"/>
@@ -3667,7 +4334,7 @@
                 <w:lang w:val="en-IN"/>
               </w:rPr>
               <w:lastRenderedPageBreak/>
-              <w:t xml:space="preserve">Project Quality Assurance Manager</w:t>
+              <w:t xml:space="preserve">Manager-Project (Metro-Telecom)</w:t>
             </w:r>
           </w:p>
           <w:p>
@@ -3690,6 +4357,7 @@
           <w:p>
             <w:pPr>
               <w:spacing w:before="60" w:after="60" w:line="240" w:lineRule="auto"/>
+              <w:jc w:val="both"/>
               <w:rPr>
                 <w:rFonts w:ascii="Aptos" w:hAnsi="Aptos"/>
                 <w:b/>
@@ -3712,12 +4380,13 @@
                 <w:rFonts w:ascii="Aptos" w:hAnsi="Aptos"/>
                 <w:lang w:val="en-IN"/>
               </w:rPr>
-              <w:t xml:space="preserve">Bengaluru</w:t>
-            </w:r>
-          </w:p>
-          <w:p>
-            <w:pPr>
-              <w:spacing w:before="60" w:after="60" w:line="240" w:lineRule="auto"/>
+              <w:t xml:space="preserve">Noida</w:t>
+            </w:r>
+          </w:p>
+          <w:p>
+            <w:pPr>
+              <w:spacing w:before="60" w:after="60" w:line="240" w:lineRule="auto"/>
+              <w:jc w:val="both"/>
               <w:rPr>
                 <w:rFonts w:ascii="Aptos" w:hAnsi="Aptos"/>
                 <w:b/>
@@ -3730,6 +4399,7 @@
           <w:p>
             <w:pPr>
               <w:spacing w:before="60" w:after="60" w:line="240" w:lineRule="auto"/>
+              <w:jc w:val="both"/>
               <w:rPr>
                 <w:rFonts w:ascii="Aptos" w:hAnsi="Aptos"/>
                 <w:b/>
@@ -3760,7 +4430,7 @@
             <w:r>
               <w:rPr>
                 <w:rFonts w:ascii="Aptos" w:hAnsi="Aptos"/>
-                <w:color w:val="156082" w:themeColor="accent1"/>
+                <w:color w:val="000000" w:themeColor="text1"/>
                 <w:lang w:val="en-IN"/>
               </w:rPr>
               <w:t xml:space="preserve"/>
@@ -3770,7 +4440,7 @@
                 <w:rFonts w:ascii="Aptos" w:hAnsi="Aptos"/>
                 <w:b/>
                 <w:bCs/>
-                <w:color w:val="156082" w:themeColor="accent1"/>
+                <w:color w:val="000000" w:themeColor="text1"/>
                 <w:lang w:val="en-IN"/>
               </w:rPr>
               <w:t xml:space="preserve"> </w:t>
@@ -3779,6 +4449,7 @@
           <w:p>
             <w:pPr>
               <w:spacing w:before="60" w:after="60" w:line="240" w:lineRule="auto"/>
+              <w:jc w:val="both"/>
               <w:rPr>
                 <w:rFonts w:ascii="Aptos" w:hAnsi="Aptos"/>
                 <w:b/>
@@ -3793,10 +4464,9 @@
           <w:p>
             <w:pPr>
               <w:spacing w:before="60" w:after="60" w:line="240" w:lineRule="auto"/>
-              <w:rPr>
-                <w:rFonts w:ascii="Aptos" w:hAnsi="Aptos"/>
-                <w:b/>
-                <w:bCs/>
+              <w:jc w:val="both"/>
+              <w:rPr>
+                <w:rFonts w:ascii="Aptos" w:hAnsi="Aptos"/>
                 <w:lang w:val="en-IN"/>
               </w:rPr>
             </w:pPr>
@@ -3812,8 +4482,6 @@
             <w:r>
               <w:rPr>
                 <w:rFonts w:ascii="Aptos" w:hAnsi="Aptos"/>
-                <w:b/>
-                <w:bCs/>
                 <w:lang w:val="en-IN"/>
               </w:rPr>
               <w:t xml:space="preserve"/>
@@ -3822,47 +4490,60 @@
           <w:p>
             <w:pPr>
               <w:spacing w:before="60" w:after="60" w:line="240" w:lineRule="auto"/>
-              <w:rPr>
-                <w:rFonts w:ascii="Aptos" w:hAnsi="Aptos"/>
-                <w:lang w:val="en-IN"/>
-              </w:rPr>
-            </w:pPr>
-          </w:p>
-          <w:p>
-            <w:pPr>
-              <w:spacing w:before="60" w:after="60" w:line="240" w:lineRule="auto"/>
-              <w:rPr>
-                <w:rFonts w:ascii="Aptos" w:hAnsi="Aptos"/>
-                <w:lang w:val="en-IN"/>
-              </w:rPr>
-            </w:pPr>
-            <w:r>
-              <w:rPr>
-                <w:rFonts w:ascii="Aptos" w:hAnsi="Aptos"/>
-                <w:lang w:val="en-IN"/>
-              </w:rPr>
-              <w:t xml:space="preserve">Year: </w:t>
-            </w:r>
-            <w:r>
-              <w:rPr>
-                <w:rFonts w:ascii="Aptos" w:hAnsi="Aptos"/>
-                <w:lang w:val="en-IN"/>
-              </w:rPr>
-              <w:t xml:space="preserve">07'12-01'16</w:t>
-            </w:r>
-          </w:p>
-          <w:p>
-            <w:pPr>
-              <w:spacing w:before="60" w:after="60" w:line="240" w:lineRule="auto"/>
-              <w:rPr>
-                <w:rFonts w:ascii="Aptos" w:hAnsi="Aptos"/>
-                <w:lang w:val="en-IN"/>
-              </w:rPr>
-            </w:pPr>
-          </w:p>
-          <w:p>
-            <w:pPr>
-              <w:spacing w:before="60" w:after="60" w:line="240" w:lineRule="auto"/>
+              <w:jc w:val="both"/>
+              <w:rPr>
+                <w:rFonts w:ascii="Aptos" w:hAnsi="Aptos"/>
+                <w:lang w:val="en-IN"/>
+              </w:rPr>
+            </w:pPr>
+          </w:p>
+          <w:p>
+            <w:pPr>
+              <w:spacing w:before="60" w:after="60" w:line="240" w:lineRule="auto"/>
+              <w:jc w:val="both"/>
+              <w:rPr>
+                <w:rFonts w:ascii="Aptos" w:hAnsi="Aptos"/>
+                <w:lang w:val="en-IN"/>
+              </w:rPr>
+            </w:pPr>
+            <w:r>
+              <w:rPr>
+                <w:rFonts w:ascii="Aptos" w:hAnsi="Aptos"/>
+                <w:b/>
+                <w:bCs/>
+                <w:lang w:val="en-IN"/>
+              </w:rPr>
+              <w:t>Year:</w:t>
+            </w:r>
+            <w:r>
+              <w:rPr>
+                <w:rFonts w:ascii="Aptos" w:hAnsi="Aptos"/>
+                <w:lang w:val="en-IN"/>
+              </w:rPr>
+              <w:t xml:space="preserve"> </w:t>
+            </w:r>
+            <w:r>
+              <w:rPr>
+                <w:rFonts w:ascii="Aptos" w:hAnsi="Aptos"/>
+                <w:lang w:val="en-IN"/>
+              </w:rPr>
+              <w:t xml:space="preserve">July 2012 to December 2019</w:t>
+            </w:r>
+          </w:p>
+          <w:p>
+            <w:pPr>
+              <w:spacing w:before="60" w:after="60" w:line="240" w:lineRule="auto"/>
+              <w:jc w:val="both"/>
+              <w:rPr>
+                <w:rFonts w:ascii="Aptos" w:hAnsi="Aptos"/>
+                <w:lang w:val="en-IN"/>
+              </w:rPr>
+            </w:pPr>
+          </w:p>
+          <w:p>
+            <w:pPr>
+              <w:spacing w:before="60" w:after="60" w:line="240" w:lineRule="auto"/>
+              <w:jc w:val="both"/>
               <w:rPr>
                 <w:rFonts w:ascii="Aptos" w:hAnsi="Aptos"/>
                 <w:lang w:val="en-IN"/>
@@ -3882,34 +4563,36 @@
                 <w:rFonts w:ascii="Aptos" w:hAnsi="Aptos"/>
                 <w:lang w:val="en-IN"/>
               </w:rPr>
-              <w:t xml:space="preserve">ELV / Embedded Systems (Aircraft Hardware and Software) and Aircraft Material inspections (before assembling)</w:t>
-            </w:r>
-          </w:p>
-          <w:p>
-            <w:pPr>
-              <w:spacing w:before="60" w:after="60" w:line="240" w:lineRule="auto"/>
-              <w:rPr>
-                <w:rFonts w:ascii="Aptos" w:hAnsi="Aptos"/>
-                <w:lang w:val="en-IN"/>
-              </w:rPr>
-            </w:pPr>
-          </w:p>
-          <w:p>
-            <w:pPr>
-              <w:spacing w:before="60" w:after="60" w:line="240" w:lineRule="auto"/>
-              <w:rPr>
-                <w:rFonts w:ascii="Aptos" w:hAnsi="Aptos"/>
-                <w:lang w:val="en-US"/>
-              </w:rPr>
-            </w:pPr>
-            <w:r>
-              <w:rPr>
-                <w:rFonts w:ascii="Aptos" w:hAnsi="Aptos"/>
-                <w:b/>
-                <w:bCs/>
-                <w:lang w:val="en-IN"/>
-              </w:rPr>
-              <w:t>Activities Performed:</w:t>
+              <w:t xml:space="preserve"/>
+            </w:r>
+          </w:p>
+          <w:p>
+            <w:pPr>
+              <w:spacing w:before="60" w:after="60" w:line="240" w:lineRule="auto"/>
+              <w:jc w:val="both"/>
+              <w:rPr>
+                <w:rFonts w:ascii="Aptos" w:hAnsi="Aptos"/>
+                <w:lang w:val="en-IN"/>
+              </w:rPr>
+            </w:pPr>
+          </w:p>
+          <w:p>
+            <w:pPr>
+              <w:spacing w:before="60" w:after="60" w:line="240" w:lineRule="auto"/>
+              <w:jc w:val="both"/>
+              <w:rPr>
+                <w:rFonts w:ascii="Aptos" w:hAnsi="Aptos"/>
+                <w:lang w:val="en-IN"/>
+              </w:rPr>
+            </w:pPr>
+            <w:r>
+              <w:rPr>
+                <w:rFonts w:ascii="Aptos" w:hAnsi="Aptos"/>
+                <w:b/>
+                <w:bCs/>
+                <w:lang w:val="en-IN"/>
+              </w:rPr>
+              <w:t xml:space="preserve">Activities Performed:</w:t>
             </w:r>
             <w:r>
               <w:rPr>
@@ -3925,11 +4608,177 @@
                 <w:rFonts w:ascii="Aptos" w:hAnsi="Aptos"/>
                 <w:lang w:val="en-IN"/>
               </w:rPr>
-              <w:t xml:space="preserve">QMS: Implemented Corporate QMS (Chorus 2.0 CPO, Tailoring, trainings, deployment etc.); ISO 9001 certification</w:t>
-              <w:br/>
-              <w:t xml:space="preserve">Planning: PQP, WMS/ITPs/Checklists for project including reviews and approvals of offset partner deliverables</w:t>
-              <w:br/>
-              <w:t xml:space="preserve">Engineering QA: Gate reviews, Software sampling tests/Build Checks, CSAT, Quality Advice, Track Actions</w:t>
+              <w:t xml:space="preserve"/>
+            </w:r>
+          </w:p>
+          <w:p>
+            <w:pPr>
+              <w:spacing w:before="60" w:after="60" w:line="240" w:lineRule="auto"/>
+              <w:jc w:val="both"/>
+              <w:rPr>
+                <w:rFonts w:ascii="Aptos" w:hAnsi="Aptos"/>
+                <w:lang w:val="en-IN"/>
+              </w:rPr>
+            </w:pPr>
+            <w:r>
+              <w:rPr>
+                <w:rFonts w:ascii="Aptos" w:hAnsi="Aptos"/>
+                <w:lang w:val="en-IN"/>
+              </w:rPr>
+              <w:t xml:space="preserve">• Responsible for planning, monitoring and controlling the installation and commissioning activities of the telecom systems like Passenger Information Display System (PIDS), Public Address System (PAS), Master Clocks System, Radio, CCTV, FOTS, Telephone System and S UPS System.</w:t>
+            </w:r>
+          </w:p>
+          <w:p>
+            <w:pPr>
+              <w:spacing w:before="60" w:after="60" w:line="240" w:lineRule="auto"/>
+              <w:jc w:val="both"/>
+              <w:rPr>
+                <w:rFonts w:ascii="Aptos" w:hAnsi="Aptos"/>
+                <w:lang w:val="en-US"/>
+              </w:rPr>
+            </w:pPr>
+            <w:r>
+              <w:rPr>
+                <w:rFonts w:ascii="Aptos" w:hAnsi="Aptos"/>
+                <w:lang w:val="en-IN"/>
+              </w:rPr>
+              <w:t xml:space="preserve"/>
+            </w:r>
+          </w:p>
+          <w:p>
+            <w:pPr>
+              <w:spacing w:before="60" w:after="60" w:line="240" w:lineRule="auto"/>
+              <w:jc w:val="both"/>
+              <w:rPr>
+                <w:rFonts w:ascii="Aptos" w:hAnsi="Aptos"/>
+                <w:lang w:val="en-IN"/>
+              </w:rPr>
+            </w:pPr>
+            <w:r>
+              <w:rPr>
+                <w:rFonts w:ascii="Aptos" w:hAnsi="Aptos"/>
+                <w:lang w:val="en-IN"/>
+              </w:rPr>
+              <w:t xml:space="preserve">• Responsible for monitoring and controlling the installation and commissioning teams including subcontractor’s teams.</w:t>
+            </w:r>
+          </w:p>
+          <w:p>
+            <w:pPr>
+              <w:spacing w:before="60" w:after="60" w:line="240" w:lineRule="auto"/>
+              <w:jc w:val="both"/>
+              <w:rPr>
+                <w:rFonts w:ascii="Aptos" w:hAnsi="Aptos"/>
+                <w:lang w:val="en-US"/>
+              </w:rPr>
+            </w:pPr>
+            <w:r>
+              <w:rPr>
+                <w:rFonts w:ascii="Aptos" w:hAnsi="Aptos"/>
+                <w:lang w:val="en-IN"/>
+              </w:rPr>
+              <w:t xml:space="preserve"/>
+            </w:r>
+          </w:p>
+          <w:p>
+            <w:pPr>
+              <w:spacing w:before="60" w:after="60" w:line="240" w:lineRule="auto"/>
+              <w:jc w:val="both"/>
+              <w:rPr>
+                <w:rFonts w:ascii="Aptos" w:hAnsi="Aptos"/>
+                <w:lang w:val="en-IN"/>
+              </w:rPr>
+            </w:pPr>
+            <w:r>
+              <w:rPr>
+                <w:rFonts w:ascii="Aptos" w:hAnsi="Aptos"/>
+                <w:lang w:val="en-IN"/>
+              </w:rPr>
+              <w:t xml:space="preserve">• Sending progress reports and site constraints to the Customer  Internal Top Management and raising issues with solutions to the customer.</w:t>
+            </w:r>
+          </w:p>
+          <w:p>
+            <w:pPr>
+              <w:spacing w:before="60" w:after="60" w:line="240" w:lineRule="auto"/>
+              <w:jc w:val="both"/>
+              <w:rPr>
+                <w:rFonts w:ascii="Aptos" w:hAnsi="Aptos"/>
+                <w:lang w:val="en-US"/>
+              </w:rPr>
+            </w:pPr>
+            <w:r>
+              <w:rPr>
+                <w:rFonts w:ascii="Aptos" w:hAnsi="Aptos"/>
+                <w:lang w:val="en-IN"/>
+              </w:rPr>
+              <w:t xml:space="preserve"/>
+            </w:r>
+          </w:p>
+          <w:p>
+            <w:pPr>
+              <w:spacing w:before="60" w:after="60" w:line="240" w:lineRule="auto"/>
+              <w:jc w:val="both"/>
+              <w:rPr>
+                <w:rFonts w:ascii="Aptos" w:hAnsi="Aptos"/>
+                <w:lang w:val="en-IN"/>
+              </w:rPr>
+            </w:pPr>
+            <w:r>
+              <w:rPr>
+                <w:rFonts w:ascii="Aptos" w:hAnsi="Aptos"/>
+                <w:lang w:val="en-IN"/>
+              </w:rPr>
+              <w:t xml:space="preserve">• Responsible for testing (PAT, SAT  ITC) and commissioning of Telecom systems along with DMRC/JMRC officials.</w:t>
+            </w:r>
+          </w:p>
+          <w:p>
+            <w:pPr>
+              <w:spacing w:before="60" w:after="60" w:line="240" w:lineRule="auto"/>
+              <w:jc w:val="both"/>
+              <w:rPr>
+                <w:rFonts w:ascii="Aptos" w:hAnsi="Aptos"/>
+                <w:lang w:val="en-US"/>
+              </w:rPr>
+            </w:pPr>
+            <w:r>
+              <w:rPr>
+                <w:rFonts w:ascii="Aptos" w:hAnsi="Aptos"/>
+                <w:lang w:val="en-IN"/>
+              </w:rPr>
+              <w:t xml:space="preserve"/>
+            </w:r>
+          </w:p>
+          <w:p>
+            <w:pPr>
+              <w:spacing w:before="60" w:after="60" w:line="240" w:lineRule="auto"/>
+              <w:jc w:val="both"/>
+              <w:rPr>
+                <w:rFonts w:ascii="Aptos" w:hAnsi="Aptos"/>
+                <w:lang w:val="en-IN"/>
+              </w:rPr>
+            </w:pPr>
+            <w:r>
+              <w:rPr>
+                <w:rFonts w:ascii="Aptos" w:hAnsi="Aptos"/>
+                <w:lang w:val="en-IN"/>
+              </w:rPr>
+              <w:t xml:space="preserve">• Responsible for interfacing with DMRC/JMRC officers and other system contractors like Detailed Design Consultants (Architect), Civil Contractors, E Contractors, Traction, ECS, SCADA contractors and Signalling contractors to solve site related issues.</w:t>
+            </w:r>
+          </w:p>
+          <w:p>
+            <w:pPr>
+              <w:spacing w:before="60" w:after="60" w:line="240" w:lineRule="auto"/>
+              <w:jc w:val="both"/>
+              <w:rPr>
+                <w:rFonts w:ascii="Aptos" w:hAnsi="Aptos"/>
+                <w:lang w:val="en-US"/>
+              </w:rPr>
+            </w:pPr>
+            <w:r>
+              <w:rPr>
+                <w:rFonts w:ascii="Aptos" w:hAnsi="Aptos"/>
+                <w:lang w:val="en-IN"/>
+              </w:rPr>
+              <w:t xml:space="preserve"/>
             </w:r>
             <w:r>
               <w:rPr>
@@ -3958,6 +4807,25 @@
               <w:jc w:val="both"/>
               <w:rPr>
                 <w:rFonts w:ascii="Aptos" w:hAnsi="Aptos" w:cs="Calibri"/>
+                <w:color w:val="05436E"/>
+                <w:lang w:val="en-US"/>
+              </w:rPr>
+            </w:pPr>
+            <w:r>
+              <w:rPr>
+                <w:rFonts w:ascii="Aptos" w:hAnsi="Aptos" w:cs="Calibri"/>
+                <w:color w:val="05436E"/>
+                <w:lang w:val="en-US"/>
+              </w:rPr>
+              <w:t xml:space="preserve">January 2003 to July 2012</w:t>
+            </w:r>
+          </w:p>
+          <w:p>
+            <w:pPr>
+              <w:spacing w:before="60" w:after="60" w:line="240" w:lineRule="auto"/>
+              <w:jc w:val="both"/>
+              <w:rPr>
+                <w:rFonts w:ascii="Aptos" w:hAnsi="Aptos" w:cs="Calibri"/>
                 <w:i/>
                 <w:iCs/>
                 <w:color w:val="05436E"/>
@@ -3967,10 +4835,12 @@
             <w:r>
               <w:rPr>
                 <w:rFonts w:ascii="Aptos" w:hAnsi="Aptos" w:cs="Calibri"/>
+                <w:i/>
+                <w:iCs/>
                 <w:color w:val="05436E"/>
                 <w:lang w:val="en-US"/>
               </w:rPr>
-              <w:t xml:space="preserve">10'08-06'12</w:t>
+              <w:t xml:space="preserve">9 Y 6 M</w:t>
             </w:r>
           </w:p>
           <w:p>
@@ -4021,7 +4891,7 @@
                 <w:rFonts w:ascii="Aptos" w:hAnsi="Aptos"/>
                 <w:lang w:val="en-IN"/>
               </w:rPr>
-              <w:t xml:space="preserve">Thales</w:t>
+              <w:t xml:space="preserve">Apkon Enterprises</w:t>
             </w:r>
           </w:p>
           <w:p>
@@ -4082,7 +4952,7 @@
                 <w:rFonts w:ascii="Aptos" w:hAnsi="Aptos"/>
                 <w:lang w:val="en-IN"/>
               </w:rPr>
-              <w:t xml:space="preserve">Portfolio Quality Assurance Manager</w:t>
+              <w:t xml:space="preserve">Project Manager (Metro and Railway Telecom)</w:t>
             </w:r>
           </w:p>
           <w:p>
@@ -4244,7 +5114,7 @@
           <w:p>
             <w:pPr>
               <w:spacing w:before="60" w:after="60" w:line="240" w:lineRule="auto"/>
-              <w:jc w:val="center"/>
+              <w:jc w:val="both"/>
               <w:rPr>
                 <w:rFonts w:ascii="Aptos" w:hAnsi="Aptos"/>
                 <w:lang w:val="en-IN"/>
@@ -4256,7 +5126,7 @@
                 <w:lang w:val="en-IN"/>
               </w:rPr>
               <w:lastRenderedPageBreak/>
-              <w:t xml:space="preserve">Portfolio Quality Assurance Manager</w:t>
+              <w:t xml:space="preserve">Project Manager (Metro and Railway Telecom)</w:t>
             </w:r>
           </w:p>
           <w:p>
@@ -4279,6 +5149,7 @@
           <w:p>
             <w:pPr>
               <w:spacing w:before="60" w:after="60" w:line="240" w:lineRule="auto"/>
+              <w:jc w:val="both"/>
               <w:rPr>
                 <w:rFonts w:ascii="Aptos" w:hAnsi="Aptos"/>
                 <w:b/>
@@ -4301,12 +5172,13 @@
                 <w:rFonts w:ascii="Aptos" w:hAnsi="Aptos"/>
                 <w:lang w:val="en-IN"/>
               </w:rPr>
-              <w:t xml:space="preserve">Chennai</w:t>
-            </w:r>
-          </w:p>
-          <w:p>
-            <w:pPr>
-              <w:spacing w:before="60" w:after="60" w:line="240" w:lineRule="auto"/>
+              <w:t xml:space="preserve">Dwarka, New Delhi</w:t>
+            </w:r>
+          </w:p>
+          <w:p>
+            <w:pPr>
+              <w:spacing w:before="60" w:after="60" w:line="240" w:lineRule="auto"/>
+              <w:jc w:val="both"/>
               <w:rPr>
                 <w:rFonts w:ascii="Aptos" w:hAnsi="Aptos"/>
                 <w:b/>
@@ -4319,6 +5191,7 @@
           <w:p>
             <w:pPr>
               <w:spacing w:before="60" w:after="60" w:line="240" w:lineRule="auto"/>
+              <w:jc w:val="both"/>
               <w:rPr>
                 <w:rFonts w:ascii="Aptos" w:hAnsi="Aptos"/>
                 <w:b/>
@@ -4349,7 +5222,7 @@
             <w:r>
               <w:rPr>
                 <w:rFonts w:ascii="Aptos" w:hAnsi="Aptos"/>
-                <w:color w:val="156082" w:themeColor="accent1"/>
+                <w:color w:val="000000" w:themeColor="text1"/>
                 <w:lang w:val="en-IN"/>
               </w:rPr>
               <w:t xml:space="preserve"/>
@@ -4359,7 +5232,7 @@
                 <w:rFonts w:ascii="Aptos" w:hAnsi="Aptos"/>
                 <w:b/>
                 <w:bCs/>
-                <w:color w:val="156082" w:themeColor="accent1"/>
+                <w:color w:val="000000" w:themeColor="text1"/>
                 <w:lang w:val="en-IN"/>
               </w:rPr>
               <w:t xml:space="preserve"> </w:t>
@@ -4368,6 +5241,7 @@
           <w:p>
             <w:pPr>
               <w:spacing w:before="60" w:after="60" w:line="240" w:lineRule="auto"/>
+              <w:jc w:val="both"/>
               <w:rPr>
                 <w:rFonts w:ascii="Aptos" w:hAnsi="Aptos"/>
                 <w:b/>
@@ -4382,10 +5256,9 @@
           <w:p>
             <w:pPr>
               <w:spacing w:before="60" w:after="60" w:line="240" w:lineRule="auto"/>
-              <w:rPr>
-                <w:rFonts w:ascii="Aptos" w:hAnsi="Aptos"/>
-                <w:b/>
-                <w:bCs/>
+              <w:jc w:val="both"/>
+              <w:rPr>
+                <w:rFonts w:ascii="Aptos" w:hAnsi="Aptos"/>
                 <w:lang w:val="en-IN"/>
               </w:rPr>
             </w:pPr>
@@ -4401,8 +5274,6 @@
             <w:r>
               <w:rPr>
                 <w:rFonts w:ascii="Aptos" w:hAnsi="Aptos"/>
-                <w:b/>
-                <w:bCs/>
                 <w:lang w:val="en-IN"/>
               </w:rPr>
               <w:t xml:space="preserve"/>
@@ -4411,47 +5282,60 @@
           <w:p>
             <w:pPr>
               <w:spacing w:before="60" w:after="60" w:line="240" w:lineRule="auto"/>
-              <w:rPr>
-                <w:rFonts w:ascii="Aptos" w:hAnsi="Aptos"/>
-                <w:lang w:val="en-IN"/>
-              </w:rPr>
-            </w:pPr>
-          </w:p>
-          <w:p>
-            <w:pPr>
-              <w:spacing w:before="60" w:after="60" w:line="240" w:lineRule="auto"/>
-              <w:rPr>
-                <w:rFonts w:ascii="Aptos" w:hAnsi="Aptos"/>
-                <w:lang w:val="en-IN"/>
-              </w:rPr>
-            </w:pPr>
-            <w:r>
-              <w:rPr>
-                <w:rFonts w:ascii="Aptos" w:hAnsi="Aptos"/>
-                <w:lang w:val="en-IN"/>
-              </w:rPr>
-              <w:t xml:space="preserve">Year: </w:t>
-            </w:r>
-            <w:r>
-              <w:rPr>
-                <w:rFonts w:ascii="Aptos" w:hAnsi="Aptos"/>
-                <w:lang w:val="en-IN"/>
-              </w:rPr>
-              <w:t xml:space="preserve">10'08-06'12</w:t>
-            </w:r>
-          </w:p>
-          <w:p>
-            <w:pPr>
-              <w:spacing w:before="60" w:after="60" w:line="240" w:lineRule="auto"/>
-              <w:rPr>
-                <w:rFonts w:ascii="Aptos" w:hAnsi="Aptos"/>
-                <w:lang w:val="en-IN"/>
-              </w:rPr>
-            </w:pPr>
-          </w:p>
-          <w:p>
-            <w:pPr>
-              <w:spacing w:before="60" w:after="60" w:line="240" w:lineRule="auto"/>
+              <w:jc w:val="both"/>
+              <w:rPr>
+                <w:rFonts w:ascii="Aptos" w:hAnsi="Aptos"/>
+                <w:lang w:val="en-IN"/>
+              </w:rPr>
+            </w:pPr>
+          </w:p>
+          <w:p>
+            <w:pPr>
+              <w:spacing w:before="60" w:after="60" w:line="240" w:lineRule="auto"/>
+              <w:jc w:val="both"/>
+              <w:rPr>
+                <w:rFonts w:ascii="Aptos" w:hAnsi="Aptos"/>
+                <w:lang w:val="en-IN"/>
+              </w:rPr>
+            </w:pPr>
+            <w:r>
+              <w:rPr>
+                <w:rFonts w:ascii="Aptos" w:hAnsi="Aptos"/>
+                <w:b/>
+                <w:bCs/>
+                <w:lang w:val="en-IN"/>
+              </w:rPr>
+              <w:t>Year:</w:t>
+            </w:r>
+            <w:r>
+              <w:rPr>
+                <w:rFonts w:ascii="Aptos" w:hAnsi="Aptos"/>
+                <w:lang w:val="en-IN"/>
+              </w:rPr>
+              <w:t xml:space="preserve"> </w:t>
+            </w:r>
+            <w:r>
+              <w:rPr>
+                <w:rFonts w:ascii="Aptos" w:hAnsi="Aptos"/>
+                <w:lang w:val="en-IN"/>
+              </w:rPr>
+              <w:t xml:space="preserve">January 2003 to July 2012</w:t>
+            </w:r>
+          </w:p>
+          <w:p>
+            <w:pPr>
+              <w:spacing w:before="60" w:after="60" w:line="240" w:lineRule="auto"/>
+              <w:jc w:val="both"/>
+              <w:rPr>
+                <w:rFonts w:ascii="Aptos" w:hAnsi="Aptos"/>
+                <w:lang w:val="en-IN"/>
+              </w:rPr>
+            </w:pPr>
+          </w:p>
+          <w:p>
+            <w:pPr>
+              <w:spacing w:before="60" w:after="60" w:line="240" w:lineRule="auto"/>
+              <w:jc w:val="both"/>
               <w:rPr>
                 <w:rFonts w:ascii="Aptos" w:hAnsi="Aptos"/>
                 <w:lang w:val="en-IN"/>
@@ -4471,34 +5355,36 @@
                 <w:rFonts w:ascii="Aptos" w:hAnsi="Aptos"/>
                 <w:lang w:val="en-IN"/>
               </w:rPr>
-              <w:t xml:space="preserve">ELV / Embedded Systems (Aircraft Hardware and Software) and Aircraft Material inspections (before assembling)</w:t>
-            </w:r>
-          </w:p>
-          <w:p>
-            <w:pPr>
-              <w:spacing w:before="60" w:after="60" w:line="240" w:lineRule="auto"/>
-              <w:rPr>
-                <w:rFonts w:ascii="Aptos" w:hAnsi="Aptos"/>
-                <w:lang w:val="en-IN"/>
-              </w:rPr>
-            </w:pPr>
-          </w:p>
-          <w:p>
-            <w:pPr>
-              <w:spacing w:before="60" w:after="60" w:line="240" w:lineRule="auto"/>
-              <w:rPr>
-                <w:rFonts w:ascii="Aptos" w:hAnsi="Aptos"/>
-                <w:lang w:val="en-US"/>
-              </w:rPr>
-            </w:pPr>
-            <w:r>
-              <w:rPr>
-                <w:rFonts w:ascii="Aptos" w:hAnsi="Aptos"/>
-                <w:b/>
-                <w:bCs/>
-                <w:lang w:val="en-IN"/>
-              </w:rPr>
-              <w:t>Activities Performed:</w:t>
+              <w:t xml:space="preserve"/>
+            </w:r>
+          </w:p>
+          <w:p>
+            <w:pPr>
+              <w:spacing w:before="60" w:after="60" w:line="240" w:lineRule="auto"/>
+              <w:jc w:val="both"/>
+              <w:rPr>
+                <w:rFonts w:ascii="Aptos" w:hAnsi="Aptos"/>
+                <w:lang w:val="en-IN"/>
+              </w:rPr>
+            </w:pPr>
+          </w:p>
+          <w:p>
+            <w:pPr>
+              <w:spacing w:before="60" w:after="60" w:line="240" w:lineRule="auto"/>
+              <w:jc w:val="both"/>
+              <w:rPr>
+                <w:rFonts w:ascii="Aptos" w:hAnsi="Aptos"/>
+                <w:lang w:val="en-IN"/>
+              </w:rPr>
+            </w:pPr>
+            <w:r>
+              <w:rPr>
+                <w:rFonts w:ascii="Aptos" w:hAnsi="Aptos"/>
+                <w:b/>
+                <w:bCs/>
+                <w:lang w:val="en-IN"/>
+              </w:rPr>
+              <w:t xml:space="preserve">Activities Performed:</w:t>
             </w:r>
             <w:r>
               <w:rPr>
@@ -4514,9 +5400,211 @@
                 <w:rFonts w:ascii="Aptos" w:hAnsi="Aptos"/>
                 <w:lang w:val="en-IN"/>
               </w:rPr>
-              <w:t xml:space="preserve">QAQC Planning (PQP), WMS/SOPs, Inspections for the entity projects and Portfolios</w:t>
-              <w:br/>
-              <w:t xml:space="preserve">Key involvement in Stage Gate reviews (PDR/CDR/FAI etc) (Equivalent to Design and FAT)</w:t>
+              <w:t xml:space="preserve"/>
+            </w:r>
+          </w:p>
+          <w:p>
+            <w:pPr>
+              <w:spacing w:before="60" w:after="60" w:line="240" w:lineRule="auto"/>
+              <w:jc w:val="both"/>
+              <w:rPr>
+                <w:rFonts w:ascii="Aptos" w:hAnsi="Aptos"/>
+                <w:lang w:val="en-IN"/>
+              </w:rPr>
+            </w:pPr>
+            <w:r>
+              <w:rPr>
+                <w:rFonts w:ascii="Aptos" w:hAnsi="Aptos"/>
+                <w:lang w:val="en-IN"/>
+              </w:rPr>
+              <w:t xml:space="preserve">• Responsible for planning, monitoring and controlling the installation and commissioning activities of the Telecom system (CCTV).</w:t>
+            </w:r>
+          </w:p>
+          <w:p>
+            <w:pPr>
+              <w:spacing w:before="60" w:after="60" w:line="240" w:lineRule="auto"/>
+              <w:jc w:val="both"/>
+              <w:rPr>
+                <w:rFonts w:ascii="Aptos" w:hAnsi="Aptos"/>
+                <w:lang w:val="en-US"/>
+              </w:rPr>
+            </w:pPr>
+            <w:r>
+              <w:rPr>
+                <w:rFonts w:ascii="Aptos" w:hAnsi="Aptos"/>
+                <w:lang w:val="en-IN"/>
+              </w:rPr>
+              <w:t xml:space="preserve"/>
+            </w:r>
+          </w:p>
+          <w:p>
+            <w:pPr>
+              <w:spacing w:before="60" w:after="60" w:line="240" w:lineRule="auto"/>
+              <w:jc w:val="both"/>
+              <w:rPr>
+                <w:rFonts w:ascii="Aptos" w:hAnsi="Aptos"/>
+                <w:lang w:val="en-IN"/>
+              </w:rPr>
+            </w:pPr>
+            <w:r>
+              <w:rPr>
+                <w:rFonts w:ascii="Aptos" w:hAnsi="Aptos"/>
+                <w:lang w:val="en-IN"/>
+              </w:rPr>
+              <w:t xml:space="preserve">• Responsible for planning, implementation, Monitoring and Controlling the Metro/Railway Telecom projects.</w:t>
+            </w:r>
+          </w:p>
+          <w:p>
+            <w:pPr>
+              <w:spacing w:before="60" w:after="60" w:line="240" w:lineRule="auto"/>
+              <w:jc w:val="both"/>
+              <w:rPr>
+                <w:rFonts w:ascii="Aptos" w:hAnsi="Aptos"/>
+                <w:lang w:val="en-US"/>
+              </w:rPr>
+            </w:pPr>
+            <w:r>
+              <w:rPr>
+                <w:rFonts w:ascii="Aptos" w:hAnsi="Aptos"/>
+                <w:lang w:val="en-IN"/>
+              </w:rPr>
+              <w:t xml:space="preserve"/>
+            </w:r>
+          </w:p>
+          <w:p>
+            <w:pPr>
+              <w:spacing w:before="60" w:after="60" w:line="240" w:lineRule="auto"/>
+              <w:jc w:val="both"/>
+              <w:rPr>
+                <w:rFonts w:ascii="Aptos" w:hAnsi="Aptos"/>
+                <w:lang w:val="en-IN"/>
+              </w:rPr>
+            </w:pPr>
+            <w:r>
+              <w:rPr>
+                <w:rFonts w:ascii="Aptos" w:hAnsi="Aptos"/>
+                <w:lang w:val="en-IN"/>
+              </w:rPr>
+              <w:t xml:space="preserve">• To do the liaison with Govt./ Railway technical officers and staff.</w:t>
+            </w:r>
+          </w:p>
+          <w:p>
+            <w:pPr>
+              <w:spacing w:before="60" w:after="60" w:line="240" w:lineRule="auto"/>
+              <w:jc w:val="both"/>
+              <w:rPr>
+                <w:rFonts w:ascii="Aptos" w:hAnsi="Aptos"/>
+                <w:lang w:val="en-US"/>
+              </w:rPr>
+            </w:pPr>
+            <w:r>
+              <w:rPr>
+                <w:rFonts w:ascii="Aptos" w:hAnsi="Aptos"/>
+                <w:lang w:val="en-IN"/>
+              </w:rPr>
+              <w:t xml:space="preserve"/>
+            </w:r>
+          </w:p>
+          <w:p>
+            <w:pPr>
+              <w:spacing w:before="60" w:after="60" w:line="240" w:lineRule="auto"/>
+              <w:jc w:val="both"/>
+              <w:rPr>
+                <w:rFonts w:ascii="Aptos" w:hAnsi="Aptos"/>
+                <w:lang w:val="en-IN"/>
+              </w:rPr>
+            </w:pPr>
+            <w:r>
+              <w:rPr>
+                <w:rFonts w:ascii="Aptos" w:hAnsi="Aptos"/>
+                <w:lang w:val="en-IN"/>
+              </w:rPr>
+              <w:t xml:space="preserve">• Completed successfully Projects in Railway Telecommunication works including Trenching, Cable Laying of Telecom/power/ OFC cables, Erection of apparatus cases/junction boxes, Panel/Route Relay Interlocking (our RRI system with more than 50 routes is working successfully in Ghaziabad Railway Station for Yard), Installation of Point Machines, Data Loggers, Axel Counters(SSDAC  MSDAC), Level Crossing Gates and Train Protection  Warning System (Ansaldo STS) in Delhi-Agra section etc.</w:t>
+            </w:r>
+          </w:p>
+          <w:p>
+            <w:pPr>
+              <w:spacing w:before="60" w:after="60" w:line="240" w:lineRule="auto"/>
+              <w:jc w:val="both"/>
+              <w:rPr>
+                <w:rFonts w:ascii="Aptos" w:hAnsi="Aptos"/>
+                <w:lang w:val="en-US"/>
+              </w:rPr>
+            </w:pPr>
+            <w:r>
+              <w:rPr>
+                <w:rFonts w:ascii="Aptos" w:hAnsi="Aptos"/>
+                <w:lang w:val="en-IN"/>
+              </w:rPr>
+              <w:t xml:space="preserve"/>
+            </w:r>
+          </w:p>
+          <w:p>
+            <w:pPr>
+              <w:spacing w:before="60" w:after="60" w:line="240" w:lineRule="auto"/>
+              <w:jc w:val="both"/>
+              <w:rPr>
+                <w:rFonts w:ascii="Aptos" w:hAnsi="Aptos"/>
+                <w:lang w:val="en-IN"/>
+              </w:rPr>
+            </w:pPr>
+            <w:r>
+              <w:rPr>
+                <w:rFonts w:ascii="Aptos" w:hAnsi="Aptos"/>
+                <w:lang w:val="en-IN"/>
+              </w:rPr>
+              <w:t xml:space="preserve">• Responsible for supervising site Telecom project works and monitor sub- contractor’s teams.</w:t>
+            </w:r>
+          </w:p>
+          <w:p>
+            <w:pPr>
+              <w:spacing w:before="60" w:after="60" w:line="240" w:lineRule="auto"/>
+              <w:jc w:val="both"/>
+              <w:rPr>
+                <w:rFonts w:ascii="Aptos" w:hAnsi="Aptos"/>
+                <w:lang w:val="en-US"/>
+              </w:rPr>
+            </w:pPr>
+            <w:r>
+              <w:rPr>
+                <w:rFonts w:ascii="Aptos" w:hAnsi="Aptos"/>
+                <w:lang w:val="en-IN"/>
+              </w:rPr>
+              <w:t xml:space="preserve"/>
+            </w:r>
+          </w:p>
+          <w:p>
+            <w:pPr>
+              <w:spacing w:before="60" w:after="60" w:line="240" w:lineRule="auto"/>
+              <w:jc w:val="both"/>
+              <w:rPr>
+                <w:rFonts w:ascii="Aptos" w:hAnsi="Aptos"/>
+                <w:lang w:val="en-IN"/>
+              </w:rPr>
+            </w:pPr>
+            <w:r>
+              <w:rPr>
+                <w:rFonts w:ascii="Aptos" w:hAnsi="Aptos"/>
+                <w:lang w:val="en-IN"/>
+              </w:rPr>
+              <w:t xml:space="preserve">• To do the liaison with Indian Railway technical officers and staff.</w:t>
+            </w:r>
+          </w:p>
+          <w:p>
+            <w:pPr>
+              <w:spacing w:before="60" w:after="60" w:line="240" w:lineRule="auto"/>
+              <w:jc w:val="both"/>
+              <w:rPr>
+                <w:rFonts w:ascii="Aptos" w:hAnsi="Aptos"/>
+                <w:lang w:val="en-US"/>
+              </w:rPr>
+            </w:pPr>
+            <w:r>
+              <w:rPr>
+                <w:rFonts w:ascii="Aptos" w:hAnsi="Aptos"/>
+                <w:lang w:val="en-IN"/>
+              </w:rPr>
+              <w:t xml:space="preserve"/>
             </w:r>
             <w:r>
               <w:rPr>
@@ -4545,6 +5633,25 @@
               <w:jc w:val="both"/>
               <w:rPr>
                 <w:rFonts w:ascii="Aptos" w:hAnsi="Aptos" w:cs="Calibri"/>
+                <w:color w:val="05436E"/>
+                <w:lang w:val="en-US"/>
+              </w:rPr>
+            </w:pPr>
+            <w:r>
+              <w:rPr>
+                <w:rFonts w:ascii="Aptos" w:hAnsi="Aptos" w:cs="Calibri"/>
+                <w:color w:val="05436E"/>
+                <w:lang w:val="en-US"/>
+              </w:rPr>
+              <w:t xml:space="preserve">February 2000 to September 2002</w:t>
+            </w:r>
+          </w:p>
+          <w:p>
+            <w:pPr>
+              <w:spacing w:before="60" w:after="60" w:line="240" w:lineRule="auto"/>
+              <w:jc w:val="both"/>
+              <w:rPr>
+                <w:rFonts w:ascii="Aptos" w:hAnsi="Aptos" w:cs="Calibri"/>
                 <w:i/>
                 <w:iCs/>
                 <w:color w:val="05436E"/>
@@ -4554,10 +5661,12 @@
             <w:r>
               <w:rPr>
                 <w:rFonts w:ascii="Aptos" w:hAnsi="Aptos" w:cs="Calibri"/>
+                <w:i/>
+                <w:iCs/>
                 <w:color w:val="05436E"/>
                 <w:lang w:val="en-US"/>
               </w:rPr>
-              <w:t xml:space="preserve">04'07-10'08</w:t>
+              <w:t xml:space="preserve">2 Y 7 M</w:t>
             </w:r>
           </w:p>
           <w:p>
@@ -4608,7 +5717,7 @@
                 <w:rFonts w:ascii="Aptos" w:hAnsi="Aptos"/>
                 <w:lang w:val="en-IN"/>
               </w:rPr>
-              <w:t xml:space="preserve">Thales</w:t>
+              <w:t xml:space="preserve">NRB Enterprises</w:t>
             </w:r>
           </w:p>
           <w:p>
@@ -4669,7 +5778,7 @@
                 <w:rFonts w:ascii="Aptos" w:hAnsi="Aptos"/>
                 <w:lang w:val="en-IN"/>
               </w:rPr>
-              <w:t xml:space="preserve">Engineering Technical Lead</w:t>
+              <w:t xml:space="preserve">Site Engineer (Railway Telecom Project)</w:t>
             </w:r>
           </w:p>
           <w:p>
@@ -4831,7 +5940,7 @@
           <w:p>
             <w:pPr>
               <w:spacing w:before="60" w:after="60" w:line="240" w:lineRule="auto"/>
-              <w:jc w:val="center"/>
+              <w:jc w:val="both"/>
               <w:rPr>
                 <w:rFonts w:ascii="Aptos" w:hAnsi="Aptos"/>
                 <w:lang w:val="en-IN"/>
@@ -4843,7 +5952,7 @@
                 <w:lang w:val="en-IN"/>
               </w:rPr>
               <w:lastRenderedPageBreak/>
-              <w:t xml:space="preserve">Engineering Technical Lead</w:t>
+              <w:t xml:space="preserve">Site Engineer (Railway Telecom Project)</w:t>
             </w:r>
           </w:p>
           <w:p>
@@ -4866,6 +5975,7 @@
           <w:p>
             <w:pPr>
               <w:spacing w:before="60" w:after="60" w:line="240" w:lineRule="auto"/>
+              <w:jc w:val="both"/>
               <w:rPr>
                 <w:rFonts w:ascii="Aptos" w:hAnsi="Aptos"/>
                 <w:b/>
@@ -4888,73 +5998,76 @@
                 <w:rFonts w:ascii="Aptos" w:hAnsi="Aptos"/>
                 <w:lang w:val="en-IN"/>
               </w:rPr>
+              <w:t xml:space="preserve">Delhi-110051</w:t>
+            </w:r>
+          </w:p>
+          <w:p>
+            <w:pPr>
+              <w:spacing w:before="60" w:after="60" w:line="240" w:lineRule="auto"/>
+              <w:jc w:val="both"/>
+              <w:rPr>
+                <w:rFonts w:ascii="Aptos" w:hAnsi="Aptos"/>
+                <w:b/>
+                <w:bCs/>
+                <w:color w:val="E97132" w:themeColor="accent2"/>
+                <w:lang w:val="en-IN"/>
+              </w:rPr>
+            </w:pPr>
+          </w:p>
+          <w:p>
+            <w:pPr>
+              <w:spacing w:before="60" w:after="60" w:line="240" w:lineRule="auto"/>
+              <w:jc w:val="both"/>
+              <w:rPr>
+                <w:rFonts w:ascii="Aptos" w:hAnsi="Aptos"/>
+                <w:b/>
+                <w:bCs/>
+                <w:color w:val="156082" w:themeColor="accent1"/>
+                <w:lang w:val="en-IN"/>
+              </w:rPr>
+            </w:pPr>
+            <w:r>
+              <w:rPr>
+                <w:rFonts w:ascii="Aptos" w:hAnsi="Aptos"/>
+                <w:b/>
+                <w:bCs/>
+                <w:lang w:val="en-IN"/>
+              </w:rPr>
+              <w:t>Name of Assignment or Project:</w:t>
+            </w:r>
+            <w:r>
+              <w:rPr>
+                <w:rFonts w:ascii="Aptos" w:hAnsi="Aptos"/>
+                <w:b/>
+                <w:bCs/>
+                <w:color w:val="156082" w:themeColor="accent1"/>
+                <w:lang w:val="en-IN"/>
+              </w:rPr>
+              <w:t xml:space="preserve"> </w:t>
+            </w:r>
+            <w:r>
+              <w:rPr>
+                <w:rFonts w:ascii="Aptos" w:hAnsi="Aptos"/>
+                <w:color w:val="000000" w:themeColor="text1"/>
+                <w:lang w:val="en-IN"/>
+              </w:rPr>
               <w:t xml:space="preserve"/>
             </w:r>
-          </w:p>
-          <w:p>
-            <w:pPr>
-              <w:spacing w:before="60" w:after="60" w:line="240" w:lineRule="auto"/>
-              <w:rPr>
-                <w:rFonts w:ascii="Aptos" w:hAnsi="Aptos"/>
-                <w:b/>
-                <w:bCs/>
-                <w:color w:val="E97132" w:themeColor="accent2"/>
-                <w:lang w:val="en-IN"/>
-              </w:rPr>
-            </w:pPr>
-          </w:p>
-          <w:p>
-            <w:pPr>
-              <w:spacing w:before="60" w:after="60" w:line="240" w:lineRule="auto"/>
-              <w:rPr>
-                <w:rFonts w:ascii="Aptos" w:hAnsi="Aptos"/>
-                <w:b/>
-                <w:bCs/>
-                <w:color w:val="156082" w:themeColor="accent1"/>
-                <w:lang w:val="en-IN"/>
-              </w:rPr>
-            </w:pPr>
-            <w:r>
-              <w:rPr>
-                <w:rFonts w:ascii="Aptos" w:hAnsi="Aptos"/>
-                <w:b/>
-                <w:bCs/>
-                <w:lang w:val="en-IN"/>
-              </w:rPr>
-              <w:t>Name of Assignment or Project:</w:t>
-            </w:r>
-            <w:r>
-              <w:rPr>
-                <w:rFonts w:ascii="Aptos" w:hAnsi="Aptos"/>
-                <w:b/>
-                <w:bCs/>
-                <w:color w:val="156082" w:themeColor="accent1"/>
+            <w:r>
+              <w:rPr>
+                <w:rFonts w:ascii="Aptos" w:hAnsi="Aptos"/>
+                <w:b/>
+                <w:bCs/>
+                <w:color w:val="000000" w:themeColor="text1"/>
                 <w:lang w:val="en-IN"/>
               </w:rPr>
               <w:t xml:space="preserve"> </w:t>
             </w:r>
-            <w:r>
-              <w:rPr>
-                <w:rFonts w:ascii="Aptos" w:hAnsi="Aptos"/>
-                <w:color w:val="156082" w:themeColor="accent1"/>
-                <w:lang w:val="en-IN"/>
-              </w:rPr>
-              <w:t xml:space="preserve"/>
-            </w:r>
-            <w:r>
-              <w:rPr>
-                <w:rFonts w:ascii="Aptos" w:hAnsi="Aptos"/>
-                <w:b/>
-                <w:bCs/>
-                <w:color w:val="156082" w:themeColor="accent1"/>
-                <w:lang w:val="en-IN"/>
-              </w:rPr>
-              <w:t xml:space="preserve"> </w:t>
-            </w:r>
-          </w:p>
-          <w:p>
-            <w:pPr>
-              <w:spacing w:before="60" w:after="60" w:line="240" w:lineRule="auto"/>
+          </w:p>
+          <w:p>
+            <w:pPr>
+              <w:spacing w:before="60" w:after="60" w:line="240" w:lineRule="auto"/>
+              <w:jc w:val="both"/>
               <w:rPr>
                 <w:rFonts w:ascii="Aptos" w:hAnsi="Aptos"/>
                 <w:b/>
@@ -4969,10 +6082,9 @@
           <w:p>
             <w:pPr>
               <w:spacing w:before="60" w:after="60" w:line="240" w:lineRule="auto"/>
-              <w:rPr>
-                <w:rFonts w:ascii="Aptos" w:hAnsi="Aptos"/>
-                <w:b/>
-                <w:bCs/>
+              <w:jc w:val="both"/>
+              <w:rPr>
+                <w:rFonts w:ascii="Aptos" w:hAnsi="Aptos"/>
                 <w:lang w:val="en-IN"/>
               </w:rPr>
             </w:pPr>
@@ -4988,8 +6100,6 @@
             <w:r>
               <w:rPr>
                 <w:rFonts w:ascii="Aptos" w:hAnsi="Aptos"/>
-                <w:b/>
-                <w:bCs/>
                 <w:lang w:val="en-IN"/>
               </w:rPr>
               <w:t xml:space="preserve"/>
@@ -4998,47 +6108,60 @@
           <w:p>
             <w:pPr>
               <w:spacing w:before="60" w:after="60" w:line="240" w:lineRule="auto"/>
-              <w:rPr>
-                <w:rFonts w:ascii="Aptos" w:hAnsi="Aptos"/>
-                <w:lang w:val="en-IN"/>
-              </w:rPr>
-            </w:pPr>
-          </w:p>
-          <w:p>
-            <w:pPr>
-              <w:spacing w:before="60" w:after="60" w:line="240" w:lineRule="auto"/>
-              <w:rPr>
-                <w:rFonts w:ascii="Aptos" w:hAnsi="Aptos"/>
-                <w:lang w:val="en-IN"/>
-              </w:rPr>
-            </w:pPr>
-            <w:r>
-              <w:rPr>
-                <w:rFonts w:ascii="Aptos" w:hAnsi="Aptos"/>
-                <w:lang w:val="en-IN"/>
-              </w:rPr>
-              <w:t xml:space="preserve">Year: </w:t>
-            </w:r>
-            <w:r>
-              <w:rPr>
-                <w:rFonts w:ascii="Aptos" w:hAnsi="Aptos"/>
-                <w:lang w:val="en-IN"/>
-              </w:rPr>
-              <w:t xml:space="preserve">04'07-10'08</w:t>
-            </w:r>
-          </w:p>
-          <w:p>
-            <w:pPr>
-              <w:spacing w:before="60" w:after="60" w:line="240" w:lineRule="auto"/>
-              <w:rPr>
-                <w:rFonts w:ascii="Aptos" w:hAnsi="Aptos"/>
-                <w:lang w:val="en-IN"/>
-              </w:rPr>
-            </w:pPr>
-          </w:p>
-          <w:p>
-            <w:pPr>
-              <w:spacing w:before="60" w:after="60" w:line="240" w:lineRule="auto"/>
+              <w:jc w:val="both"/>
+              <w:rPr>
+                <w:rFonts w:ascii="Aptos" w:hAnsi="Aptos"/>
+                <w:lang w:val="en-IN"/>
+              </w:rPr>
+            </w:pPr>
+          </w:p>
+          <w:p>
+            <w:pPr>
+              <w:spacing w:before="60" w:after="60" w:line="240" w:lineRule="auto"/>
+              <w:jc w:val="both"/>
+              <w:rPr>
+                <w:rFonts w:ascii="Aptos" w:hAnsi="Aptos"/>
+                <w:lang w:val="en-IN"/>
+              </w:rPr>
+            </w:pPr>
+            <w:r>
+              <w:rPr>
+                <w:rFonts w:ascii="Aptos" w:hAnsi="Aptos"/>
+                <w:b/>
+                <w:bCs/>
+                <w:lang w:val="en-IN"/>
+              </w:rPr>
+              <w:t>Year:</w:t>
+            </w:r>
+            <w:r>
+              <w:rPr>
+                <w:rFonts w:ascii="Aptos" w:hAnsi="Aptos"/>
+                <w:lang w:val="en-IN"/>
+              </w:rPr>
+              <w:t xml:space="preserve"> </w:t>
+            </w:r>
+            <w:r>
+              <w:rPr>
+                <w:rFonts w:ascii="Aptos" w:hAnsi="Aptos"/>
+                <w:lang w:val="en-IN"/>
+              </w:rPr>
+              <w:t xml:space="preserve">February 2000 to September 2002</w:t>
+            </w:r>
+          </w:p>
+          <w:p>
+            <w:pPr>
+              <w:spacing w:before="60" w:after="60" w:line="240" w:lineRule="auto"/>
+              <w:jc w:val="both"/>
+              <w:rPr>
+                <w:rFonts w:ascii="Aptos" w:hAnsi="Aptos"/>
+                <w:lang w:val="en-IN"/>
+              </w:rPr>
+            </w:pPr>
+          </w:p>
+          <w:p>
+            <w:pPr>
+              <w:spacing w:before="60" w:after="60" w:line="240" w:lineRule="auto"/>
+              <w:jc w:val="both"/>
               <w:rPr>
                 <w:rFonts w:ascii="Aptos" w:hAnsi="Aptos"/>
                 <w:lang w:val="en-IN"/>
@@ -5058,34 +6181,36 @@
                 <w:rFonts w:ascii="Aptos" w:hAnsi="Aptos"/>
                 <w:lang w:val="en-IN"/>
               </w:rPr>
-              <w:t xml:space="preserve">Aircraft HMI Software – LLR(Requirements), Design, Coding and Testing</w:t>
-            </w:r>
-          </w:p>
-          <w:p>
-            <w:pPr>
-              <w:spacing w:before="60" w:after="60" w:line="240" w:lineRule="auto"/>
-              <w:rPr>
-                <w:rFonts w:ascii="Aptos" w:hAnsi="Aptos"/>
-                <w:lang w:val="en-IN"/>
-              </w:rPr>
-            </w:pPr>
-          </w:p>
-          <w:p>
-            <w:pPr>
-              <w:spacing w:before="60" w:after="60" w:line="240" w:lineRule="auto"/>
-              <w:rPr>
-                <w:rFonts w:ascii="Aptos" w:hAnsi="Aptos"/>
-                <w:lang w:val="en-US"/>
-              </w:rPr>
-            </w:pPr>
-            <w:r>
-              <w:rPr>
-                <w:rFonts w:ascii="Aptos" w:hAnsi="Aptos"/>
-                <w:b/>
-                <w:bCs/>
-                <w:lang w:val="en-IN"/>
-              </w:rPr>
-              <w:t>Activities Performed:</w:t>
+              <w:t xml:space="preserve"/>
+            </w:r>
+          </w:p>
+          <w:p>
+            <w:pPr>
+              <w:spacing w:before="60" w:after="60" w:line="240" w:lineRule="auto"/>
+              <w:jc w:val="both"/>
+              <w:rPr>
+                <w:rFonts w:ascii="Aptos" w:hAnsi="Aptos"/>
+                <w:lang w:val="en-IN"/>
+              </w:rPr>
+            </w:pPr>
+          </w:p>
+          <w:p>
+            <w:pPr>
+              <w:spacing w:before="60" w:after="60" w:line="240" w:lineRule="auto"/>
+              <w:jc w:val="both"/>
+              <w:rPr>
+                <w:rFonts w:ascii="Aptos" w:hAnsi="Aptos"/>
+                <w:lang w:val="en-IN"/>
+              </w:rPr>
+            </w:pPr>
+            <w:r>
+              <w:rPr>
+                <w:rFonts w:ascii="Aptos" w:hAnsi="Aptos"/>
+                <w:b/>
+                <w:bCs/>
+                <w:lang w:val="en-IN"/>
+              </w:rPr>
+              <w:t xml:space="preserve">Activities Performed:</w:t>
             </w:r>
             <w:r>
               <w:rPr>
@@ -5101,9 +6226,41 @@
                 <w:rFonts w:ascii="Aptos" w:hAnsi="Aptos"/>
                 <w:lang w:val="en-IN"/>
               </w:rPr>
-              <w:t xml:space="preserve">Project Initiation (France), planning, training (ADA language), execution, and monitoring control (client reporting)</w:t>
-              <w:br/>
-              <w:t xml:space="preserve">Requirement analysis, reviews, LLRs, design (CDS: HMI-GUI), coding (OOTH/DO178B), debug and unit testing</w:t>
+              <w:t xml:space="preserve"/>
+            </w:r>
+          </w:p>
+          <w:p>
+            <w:pPr>
+              <w:spacing w:before="60" w:after="60" w:line="240" w:lineRule="auto"/>
+              <w:jc w:val="both"/>
+              <w:rPr>
+                <w:rFonts w:ascii="Aptos" w:hAnsi="Aptos"/>
+                <w:lang w:val="en-IN"/>
+              </w:rPr>
+            </w:pPr>
+            <w:r>
+              <w:rPr>
+                <w:rFonts w:ascii="Aptos" w:hAnsi="Aptos"/>
+                <w:lang w:val="en-IN"/>
+              </w:rPr>
+              <w:t xml:space="preserve">• Responsible for Installation, commissioning  maintenance work of Railway Telecom equipment like Telephones-Exchange System etc.</w:t>
+            </w:r>
+          </w:p>
+          <w:p>
+            <w:pPr>
+              <w:spacing w:before="60" w:after="60" w:line="240" w:lineRule="auto"/>
+              <w:jc w:val="both"/>
+              <w:rPr>
+                <w:rFonts w:ascii="Aptos" w:hAnsi="Aptos"/>
+                <w:lang w:val="en-US"/>
+              </w:rPr>
+            </w:pPr>
+            <w:r>
+              <w:rPr>
+                <w:rFonts w:ascii="Aptos" w:hAnsi="Aptos"/>
+                <w:lang w:val="en-IN"/>
+              </w:rPr>
+              <w:t xml:space="preserve"/>
             </w:r>
             <w:r>
               <w:rPr>
@@ -5132,6 +6289,25 @@
               <w:jc w:val="both"/>
               <w:rPr>
                 <w:rFonts w:ascii="Aptos" w:hAnsi="Aptos" w:cs="Calibri"/>
+                <w:color w:val="05436E"/>
+                <w:lang w:val="en-US"/>
+              </w:rPr>
+            </w:pPr>
+            <w:r>
+              <w:rPr>
+                <w:rFonts w:ascii="Aptos" w:hAnsi="Aptos" w:cs="Calibri"/>
+                <w:color w:val="05436E"/>
+                <w:lang w:val="en-US"/>
+              </w:rPr>
+              <w:t xml:space="preserve">November1996 to December 1999</w:t>
+            </w:r>
+          </w:p>
+          <w:p>
+            <w:pPr>
+              <w:spacing w:before="60" w:after="60" w:line="240" w:lineRule="auto"/>
+              <w:jc w:val="both"/>
+              <w:rPr>
+                <w:rFonts w:ascii="Aptos" w:hAnsi="Aptos" w:cs="Calibri"/>
                 <w:i/>
                 <w:iCs/>
                 <w:color w:val="05436E"/>
@@ -5141,10 +6317,12 @@
             <w:r>
               <w:rPr>
                 <w:rFonts w:ascii="Aptos" w:hAnsi="Aptos" w:cs="Calibri"/>
+                <w:i/>
+                <w:iCs/>
                 <w:color w:val="05436E"/>
                 <w:lang w:val="en-US"/>
               </w:rPr>
-              <w:t xml:space="preserve">11'2003-03'2007</w:t>
+              <w:t xml:space="preserve"/>
             </w:r>
           </w:p>
           <w:p>
@@ -5195,7 +6373,7 @@
                 <w:rFonts w:ascii="Aptos" w:hAnsi="Aptos"/>
                 <w:lang w:val="en-IN"/>
               </w:rPr>
-              <w:t xml:space="preserve">Honeywell</w:t>
+              <w:t xml:space="preserve">M/S PAITECH INSTRUMENTS PVT. LTD</w:t>
             </w:r>
           </w:p>
           <w:p>
@@ -5256,7 +6434,7 @@
                 <w:rFonts w:ascii="Aptos" w:hAnsi="Aptos"/>
                 <w:lang w:val="en-IN"/>
               </w:rPr>
-              <w:t xml:space="preserve">System Engineer</w:t>
+              <w:t xml:space="preserve">Sales  Service Engineer</w:t>
             </w:r>
           </w:p>
           <w:p>
@@ -5418,7 +6596,7 @@
           <w:p>
             <w:pPr>
               <w:spacing w:before="60" w:after="60" w:line="240" w:lineRule="auto"/>
-              <w:jc w:val="center"/>
+              <w:jc w:val="both"/>
               <w:rPr>
                 <w:rFonts w:ascii="Aptos" w:hAnsi="Aptos"/>
                 <w:lang w:val="en-IN"/>
@@ -5430,7 +6608,7 @@
                 <w:lang w:val="en-IN"/>
               </w:rPr>
               <w:lastRenderedPageBreak/>
-              <w:t xml:space="preserve">System Engineer</w:t>
+              <w:t xml:space="preserve">Sales  Service Engineer</w:t>
             </w:r>
           </w:p>
           <w:p>
@@ -5453,6 +6631,7 @@
           <w:p>
             <w:pPr>
               <w:spacing w:before="60" w:after="60" w:line="240" w:lineRule="auto"/>
+              <w:jc w:val="both"/>
               <w:rPr>
                 <w:rFonts w:ascii="Aptos" w:hAnsi="Aptos"/>
                 <w:b/>
@@ -5475,73 +6654,76 @@
                 <w:rFonts w:ascii="Aptos" w:hAnsi="Aptos"/>
                 <w:lang w:val="en-IN"/>
               </w:rPr>
+              <w:t xml:space="preserve">Karol Bagh, New Delhi</w:t>
+            </w:r>
+          </w:p>
+          <w:p>
+            <w:pPr>
+              <w:spacing w:before="60" w:after="60" w:line="240" w:lineRule="auto"/>
+              <w:jc w:val="both"/>
+              <w:rPr>
+                <w:rFonts w:ascii="Aptos" w:hAnsi="Aptos"/>
+                <w:b/>
+                <w:bCs/>
+                <w:color w:val="E97132" w:themeColor="accent2"/>
+                <w:lang w:val="en-IN"/>
+              </w:rPr>
+            </w:pPr>
+          </w:p>
+          <w:p>
+            <w:pPr>
+              <w:spacing w:before="60" w:after="60" w:line="240" w:lineRule="auto"/>
+              <w:jc w:val="both"/>
+              <w:rPr>
+                <w:rFonts w:ascii="Aptos" w:hAnsi="Aptos"/>
+                <w:b/>
+                <w:bCs/>
+                <w:color w:val="156082" w:themeColor="accent1"/>
+                <w:lang w:val="en-IN"/>
+              </w:rPr>
+            </w:pPr>
+            <w:r>
+              <w:rPr>
+                <w:rFonts w:ascii="Aptos" w:hAnsi="Aptos"/>
+                <w:b/>
+                <w:bCs/>
+                <w:lang w:val="en-IN"/>
+              </w:rPr>
+              <w:t>Name of Assignment or Project:</w:t>
+            </w:r>
+            <w:r>
+              <w:rPr>
+                <w:rFonts w:ascii="Aptos" w:hAnsi="Aptos"/>
+                <w:b/>
+                <w:bCs/>
+                <w:color w:val="156082" w:themeColor="accent1"/>
+                <w:lang w:val="en-IN"/>
+              </w:rPr>
+              <w:t xml:space="preserve"> </w:t>
+            </w:r>
+            <w:r>
+              <w:rPr>
+                <w:rFonts w:ascii="Aptos" w:hAnsi="Aptos"/>
+                <w:color w:val="000000" w:themeColor="text1"/>
+                <w:lang w:val="en-IN"/>
+              </w:rPr>
               <w:t xml:space="preserve"/>
             </w:r>
-          </w:p>
-          <w:p>
-            <w:pPr>
-              <w:spacing w:before="60" w:after="60" w:line="240" w:lineRule="auto"/>
-              <w:rPr>
-                <w:rFonts w:ascii="Aptos" w:hAnsi="Aptos"/>
-                <w:b/>
-                <w:bCs/>
-                <w:color w:val="E97132" w:themeColor="accent2"/>
-                <w:lang w:val="en-IN"/>
-              </w:rPr>
-            </w:pPr>
-          </w:p>
-          <w:p>
-            <w:pPr>
-              <w:spacing w:before="60" w:after="60" w:line="240" w:lineRule="auto"/>
-              <w:rPr>
-                <w:rFonts w:ascii="Aptos" w:hAnsi="Aptos"/>
-                <w:b/>
-                <w:bCs/>
-                <w:color w:val="156082" w:themeColor="accent1"/>
-                <w:lang w:val="en-IN"/>
-              </w:rPr>
-            </w:pPr>
-            <w:r>
-              <w:rPr>
-                <w:rFonts w:ascii="Aptos" w:hAnsi="Aptos"/>
-                <w:b/>
-                <w:bCs/>
-                <w:lang w:val="en-IN"/>
-              </w:rPr>
-              <w:t>Name of Assignment or Project:</w:t>
-            </w:r>
-            <w:r>
-              <w:rPr>
-                <w:rFonts w:ascii="Aptos" w:hAnsi="Aptos"/>
-                <w:b/>
-                <w:bCs/>
-                <w:color w:val="156082" w:themeColor="accent1"/>
+            <w:r>
+              <w:rPr>
+                <w:rFonts w:ascii="Aptos" w:hAnsi="Aptos"/>
+                <w:b/>
+                <w:bCs/>
+                <w:color w:val="000000" w:themeColor="text1"/>
                 <w:lang w:val="en-IN"/>
               </w:rPr>
               <w:t xml:space="preserve"> </w:t>
             </w:r>
-            <w:r>
-              <w:rPr>
-                <w:rFonts w:ascii="Aptos" w:hAnsi="Aptos"/>
-                <w:color w:val="156082" w:themeColor="accent1"/>
-                <w:lang w:val="en-IN"/>
-              </w:rPr>
-              <w:t xml:space="preserve"/>
-            </w:r>
-            <w:r>
-              <w:rPr>
-                <w:rFonts w:ascii="Aptos" w:hAnsi="Aptos"/>
-                <w:b/>
-                <w:bCs/>
-                <w:color w:val="156082" w:themeColor="accent1"/>
-                <w:lang w:val="en-IN"/>
-              </w:rPr>
-              <w:t xml:space="preserve"> </w:t>
-            </w:r>
-          </w:p>
-          <w:p>
-            <w:pPr>
-              <w:spacing w:before="60" w:after="60" w:line="240" w:lineRule="auto"/>
+          </w:p>
+          <w:p>
+            <w:pPr>
+              <w:spacing w:before="60" w:after="60" w:line="240" w:lineRule="auto"/>
+              <w:jc w:val="both"/>
               <w:rPr>
                 <w:rFonts w:ascii="Aptos" w:hAnsi="Aptos"/>
                 <w:b/>
@@ -5556,10 +6738,9 @@
           <w:p>
             <w:pPr>
               <w:spacing w:before="60" w:after="60" w:line="240" w:lineRule="auto"/>
-              <w:rPr>
-                <w:rFonts w:ascii="Aptos" w:hAnsi="Aptos"/>
-                <w:b/>
-                <w:bCs/>
+              <w:jc w:val="both"/>
+              <w:rPr>
+                <w:rFonts w:ascii="Aptos" w:hAnsi="Aptos"/>
                 <w:lang w:val="en-IN"/>
               </w:rPr>
             </w:pPr>
@@ -5575,57 +6756,68 @@
             <w:r>
               <w:rPr>
                 <w:rFonts w:ascii="Aptos" w:hAnsi="Aptos"/>
-                <w:b/>
-                <w:bCs/>
-                <w:lang w:val="en-IN"/>
-              </w:rPr>
-              <w:t xml:space="preserve">ADA/DRDO</w:t>
-            </w:r>
-          </w:p>
-          <w:p>
-            <w:pPr>
-              <w:spacing w:before="60" w:after="60" w:line="240" w:lineRule="auto"/>
-              <w:rPr>
-                <w:rFonts w:ascii="Aptos" w:hAnsi="Aptos"/>
-                <w:lang w:val="en-IN"/>
-              </w:rPr>
-            </w:pPr>
-          </w:p>
-          <w:p>
-            <w:pPr>
-              <w:spacing w:before="60" w:after="60" w:line="240" w:lineRule="auto"/>
-              <w:rPr>
-                <w:rFonts w:ascii="Aptos" w:hAnsi="Aptos"/>
-                <w:lang w:val="en-IN"/>
-              </w:rPr>
-            </w:pPr>
-            <w:r>
-              <w:rPr>
-                <w:rFonts w:ascii="Aptos" w:hAnsi="Aptos"/>
-                <w:lang w:val="en-IN"/>
-              </w:rPr>
-              <w:t xml:space="preserve">Year: </w:t>
-            </w:r>
-            <w:r>
-              <w:rPr>
-                <w:rFonts w:ascii="Aptos" w:hAnsi="Aptos"/>
-                <w:lang w:val="en-IN"/>
-              </w:rPr>
-              <w:t xml:space="preserve">11'2003-03'2007</w:t>
-            </w:r>
-          </w:p>
-          <w:p>
-            <w:pPr>
-              <w:spacing w:before="60" w:after="60" w:line="240" w:lineRule="auto"/>
-              <w:rPr>
-                <w:rFonts w:ascii="Aptos" w:hAnsi="Aptos"/>
-                <w:lang w:val="en-IN"/>
-              </w:rPr>
-            </w:pPr>
-          </w:p>
-          <w:p>
-            <w:pPr>
-              <w:spacing w:before="60" w:after="60" w:line="240" w:lineRule="auto"/>
+                <w:lang w:val="en-IN"/>
+              </w:rPr>
+              <w:t xml:space="preserve"/>
+            </w:r>
+          </w:p>
+          <w:p>
+            <w:pPr>
+              <w:spacing w:before="60" w:after="60" w:line="240" w:lineRule="auto"/>
+              <w:jc w:val="both"/>
+              <w:rPr>
+                <w:rFonts w:ascii="Aptos" w:hAnsi="Aptos"/>
+                <w:lang w:val="en-IN"/>
+              </w:rPr>
+            </w:pPr>
+          </w:p>
+          <w:p>
+            <w:pPr>
+              <w:spacing w:before="60" w:after="60" w:line="240" w:lineRule="auto"/>
+              <w:jc w:val="both"/>
+              <w:rPr>
+                <w:rFonts w:ascii="Aptos" w:hAnsi="Aptos"/>
+                <w:lang w:val="en-IN"/>
+              </w:rPr>
+            </w:pPr>
+            <w:r>
+              <w:rPr>
+                <w:rFonts w:ascii="Aptos" w:hAnsi="Aptos"/>
+                <w:b/>
+                <w:bCs/>
+                <w:lang w:val="en-IN"/>
+              </w:rPr>
+              <w:t>Year:</w:t>
+            </w:r>
+            <w:r>
+              <w:rPr>
+                <w:rFonts w:ascii="Aptos" w:hAnsi="Aptos"/>
+                <w:lang w:val="en-IN"/>
+              </w:rPr>
+              <w:t xml:space="preserve"> </w:t>
+            </w:r>
+            <w:r>
+              <w:rPr>
+                <w:rFonts w:ascii="Aptos" w:hAnsi="Aptos"/>
+                <w:lang w:val="en-IN"/>
+              </w:rPr>
+              <w:t xml:space="preserve">November1996 to December 1999</w:t>
+            </w:r>
+          </w:p>
+          <w:p>
+            <w:pPr>
+              <w:spacing w:before="60" w:after="60" w:line="240" w:lineRule="auto"/>
+              <w:jc w:val="both"/>
+              <w:rPr>
+                <w:rFonts w:ascii="Aptos" w:hAnsi="Aptos"/>
+                <w:lang w:val="en-IN"/>
+              </w:rPr>
+            </w:pPr>
+          </w:p>
+          <w:p>
+            <w:pPr>
+              <w:spacing w:before="60" w:after="60" w:line="240" w:lineRule="auto"/>
+              <w:jc w:val="both"/>
               <w:rPr>
                 <w:rFonts w:ascii="Aptos" w:hAnsi="Aptos"/>
                 <w:lang w:val="en-IN"/>
@@ -5645,34 +6837,36 @@
                 <w:rFonts w:ascii="Aptos" w:hAnsi="Aptos"/>
                 <w:lang w:val="en-IN"/>
               </w:rPr>
-              <w:t xml:space="preserve">A380 AESS Testing (ADIS, FDR and BITE) in compliance to DO178B in line with PSAC, SDP, IVVP etc</w:t>
-            </w:r>
-          </w:p>
-          <w:p>
-            <w:pPr>
-              <w:spacing w:before="60" w:after="60" w:line="240" w:lineRule="auto"/>
-              <w:rPr>
-                <w:rFonts w:ascii="Aptos" w:hAnsi="Aptos"/>
-                <w:lang w:val="en-IN"/>
-              </w:rPr>
-            </w:pPr>
-          </w:p>
-          <w:p>
-            <w:pPr>
-              <w:spacing w:before="60" w:after="60" w:line="240" w:lineRule="auto"/>
-              <w:rPr>
-                <w:rFonts w:ascii="Aptos" w:hAnsi="Aptos"/>
-                <w:lang w:val="en-US"/>
-              </w:rPr>
-            </w:pPr>
-            <w:r>
-              <w:rPr>
-                <w:rFonts w:ascii="Aptos" w:hAnsi="Aptos"/>
-                <w:b/>
-                <w:bCs/>
-                <w:lang w:val="en-IN"/>
-              </w:rPr>
-              <w:t>Activities Performed:</w:t>
+              <w:t xml:space="preserve"/>
+            </w:r>
+          </w:p>
+          <w:p>
+            <w:pPr>
+              <w:spacing w:before="60" w:after="60" w:line="240" w:lineRule="auto"/>
+              <w:jc w:val="both"/>
+              <w:rPr>
+                <w:rFonts w:ascii="Aptos" w:hAnsi="Aptos"/>
+                <w:lang w:val="en-IN"/>
+              </w:rPr>
+            </w:pPr>
+          </w:p>
+          <w:p>
+            <w:pPr>
+              <w:spacing w:before="60" w:after="60" w:line="240" w:lineRule="auto"/>
+              <w:jc w:val="both"/>
+              <w:rPr>
+                <w:rFonts w:ascii="Aptos" w:hAnsi="Aptos"/>
+                <w:lang w:val="en-IN"/>
+              </w:rPr>
+            </w:pPr>
+            <w:r>
+              <w:rPr>
+                <w:rFonts w:ascii="Aptos" w:hAnsi="Aptos"/>
+                <w:b/>
+                <w:bCs/>
+                <w:lang w:val="en-IN"/>
+              </w:rPr>
+              <w:t xml:space="preserve">Activities Performed:</w:t>
             </w:r>
             <w:r>
               <w:rPr>
@@ -5688,9 +6882,41 @@
                 <w:rFonts w:ascii="Aptos" w:hAnsi="Aptos"/>
                 <w:lang w:val="en-IN"/>
               </w:rPr>
-              <w:t xml:space="preserve">System Engineer (Testing) for A380 Aircraft Surveillance System (IHAS-ADIS)</w:t>
-              <w:br/>
-              <w:t xml:space="preserve">System Engineer (Testing) for Radar SDP - Light Combat Aircraft (Tejas)</w:t>
+              <w:t xml:space="preserve"/>
+            </w:r>
+          </w:p>
+          <w:p>
+            <w:pPr>
+              <w:spacing w:before="60" w:after="60" w:line="240" w:lineRule="auto"/>
+              <w:jc w:val="both"/>
+              <w:rPr>
+                <w:rFonts w:ascii="Aptos" w:hAnsi="Aptos"/>
+                <w:lang w:val="en-IN"/>
+              </w:rPr>
+            </w:pPr>
+            <w:r>
+              <w:rPr>
+                <w:rFonts w:ascii="Aptos" w:hAnsi="Aptos"/>
+                <w:lang w:val="en-IN"/>
+              </w:rPr>
+              <w:t xml:space="preserve">• Responsible for sales and servicing of equipment like Data Retrieve Systems  Finger Print Matching System of Australian  U.K. companies.</w:t>
+            </w:r>
+          </w:p>
+          <w:p>
+            <w:pPr>
+              <w:spacing w:before="60" w:after="60" w:line="240" w:lineRule="auto"/>
+              <w:jc w:val="both"/>
+              <w:rPr>
+                <w:rFonts w:ascii="Aptos" w:hAnsi="Aptos"/>
+                <w:lang w:val="en-US"/>
+              </w:rPr>
+            </w:pPr>
+            <w:r>
+              <w:rPr>
+                <w:rFonts w:ascii="Aptos" w:hAnsi="Aptos"/>
+                <w:lang w:val="en-IN"/>
+              </w:rPr>
+              <w:t xml:space="preserve"/>
             </w:r>
             <w:r>
               <w:rPr>
@@ -5713,6 +6939,22 @@
           <w:lang w:val="en-US"/>
         </w:rPr>
       </w:pPr>
+    </w:p>
+    <w:p>
+      <w:pPr>
+        <w:spacing w:after="160" w:line="278" w:lineRule="auto"/>
+        <w:rPr>
+          <w:rFonts w:asciiTheme="minorHAnsi" w:hAnsiTheme="minorHAnsi"/>
+          <w:lang w:val="en-US"/>
+        </w:rPr>
+      </w:pPr>
+      <w:r>
+        <w:rPr>
+          <w:rFonts w:asciiTheme="minorHAnsi" w:hAnsiTheme="minorHAnsi"/>
+          <w:lang w:val="en-US"/>
+        </w:rPr>
+        <w:br w:type="page"/>
+      </w:r>
     </w:p>
     <w:p>
       <w:pPr>
@@ -5748,7 +6990,6 @@
       <w:tr>
         <w:trPr>
           <w:cnfStyle w:val="100000000000" w:firstRow="1" w:lastRow="0" w:firstColumn="0" w:lastColumn="0" w:oddVBand="0" w:evenVBand="0" w:oddHBand="0" w:evenHBand="0" w:firstRowFirstColumn="0" w:firstRowLastColumn="0" w:lastRowFirstColumn="0" w:lastRowLastColumn="0"/>
-          <w:trHeight w:val="264"/>
         </w:trPr>
         <w:tc>
           <w:tcPr>
@@ -5779,7 +7020,6 @@
       <w:tr>
         <w:trPr>
           <w:cnfStyle w:val="000000100000" w:firstRow="0" w:lastRow="0" w:firstColumn="0" w:lastColumn="0" w:oddVBand="0" w:evenVBand="0" w:oddHBand="1" w:evenHBand="0" w:firstRowFirstColumn="0" w:firstRowLastColumn="0" w:lastRowFirstColumn="0" w:lastRowLastColumn="0"/>
-          <w:trHeight w:val="264"/>
         </w:trPr>
         <w:tc>
           <w:tcPr>
@@ -5820,7 +7060,7 @@
           <w:p>
             <w:pPr>
               <w:spacing w:after="0" w:line="240" w:lineRule="auto"/>
-              <w:jc w:val="center"/>
+              <w:jc w:val="both"/>
               <w:cnfStyle w:val="000000100000" w:firstRow="0" w:lastRow="0" w:firstColumn="0" w:lastColumn="0" w:oddVBand="0" w:evenVBand="0" w:oddHBand="1" w:evenHBand="0" w:firstRowFirstColumn="0" w:firstRowLastColumn="0" w:lastRowFirstColumn="0" w:lastRowLastColumn="0"/>
               <w:rPr>
                 <w:rFonts w:asciiTheme="minorHAnsi" w:hAnsiTheme="minorHAnsi" w:cs="Calibri"/>
@@ -5840,9 +7080,7 @@
         </w:tc>
       </w:tr>
       <w:tr>
-        <w:trPr>
-          <w:trHeight w:val="264"/>
-        </w:trPr>
+        <w:trPr/>
         <w:tc>
           <w:tcPr>
             <w:cnfStyle w:val="001000000000" w:firstRow="0" w:lastRow="0" w:firstColumn="1" w:lastColumn="0" w:oddVBand="0" w:evenVBand="0" w:oddHBand="0" w:evenHBand="0" w:firstRowFirstColumn="0" w:firstRowLastColumn="0" w:lastRowFirstColumn="0" w:lastRowLastColumn="0"/>
@@ -5854,6 +7092,7 @@
               <w:pStyle w:val="ListParagraph"/>
               <w:spacing w:after="0" w:line="240" w:lineRule="auto"/>
               <w:contextualSpacing w:val="0"/>
+              <w:jc w:val="both"/>
               <w:rPr>
                 <w:rFonts w:asciiTheme="minorHAnsi" w:hAnsiTheme="minorHAnsi" w:cs="Calibri"/>
                 <w:color w:val="FFFFFF" w:themeColor="background1"/>
@@ -5880,6 +7119,7 @@
               <w:pStyle w:val="ListParagraph"/>
               <w:spacing w:after="0" w:line="240" w:lineRule="auto"/>
               <w:contextualSpacing w:val="0"/>
+              <w:jc w:val="both"/>
               <w:cnfStyle w:val="000000000000" w:firstRow="0" w:lastRow="0" w:firstColumn="0" w:lastColumn="0" w:oddVBand="0" w:evenVBand="0" w:oddHBand="0" w:evenHBand="0" w:firstRowFirstColumn="0" w:firstRowLastColumn="0" w:lastRowFirstColumn="0" w:lastRowLastColumn="0"/>
               <w:rPr>
                 <w:rFonts w:asciiTheme="minorHAnsi" w:hAnsiTheme="minorHAnsi" w:cs="Calibri"/>
@@ -5911,6 +7151,7 @@
               <w:pStyle w:val="ListParagraph"/>
               <w:spacing w:after="0" w:line="240" w:lineRule="auto"/>
               <w:contextualSpacing w:val="0"/>
+              <w:jc w:val="both"/>
               <w:cnfStyle w:val="000000000000" w:firstRow="0" w:lastRow="0" w:firstColumn="0" w:lastColumn="0" w:oddVBand="0" w:evenVBand="0" w:oddHBand="0" w:evenHBand="0" w:firstRowFirstColumn="0" w:firstRowLastColumn="0" w:lastRowFirstColumn="0" w:lastRowLastColumn="0"/>
               <w:rPr>
                 <w:rFonts w:asciiTheme="minorHAnsi" w:hAnsiTheme="minorHAnsi" w:cs="Calibri"/>
@@ -5939,7 +7180,7 @@
           <w:p>
             <w:pPr>
               <w:spacing w:after="0" w:line="240" w:lineRule="auto"/>
-              <w:jc w:val="center"/>
+              <w:jc w:val="both"/>
               <w:cnfStyle w:val="000000000000" w:firstRow="0" w:lastRow="0" w:firstColumn="0" w:lastColumn="0" w:oddVBand="0" w:evenVBand="0" w:oddHBand="0" w:evenHBand="0" w:firstRowFirstColumn="0" w:firstRowLastColumn="0" w:lastRowFirstColumn="0" w:lastRowLastColumn="0"/>
               <w:rPr>
                 <w:rFonts w:asciiTheme="minorHAnsi" w:hAnsiTheme="minorHAnsi" w:cs="Calibri"/>
@@ -5959,7 +7200,6 @@
       <w:tr>
         <w:trPr>
           <w:cnfStyle w:val="000000100000" w:firstRow="0" w:lastRow="0" w:firstColumn="0" w:lastColumn="0" w:oddVBand="0" w:evenVBand="0" w:oddHBand="1" w:evenHBand="0" w:firstRowFirstColumn="0" w:firstRowLastColumn="0" w:lastRowFirstColumn="0" w:lastRowLastColumn="0"/>
-          <w:trHeight w:val="264"/>
         </w:trPr>
         <w:tc>
           <w:tcPr>
@@ -5973,6 +7213,7 @@
               <w:pStyle w:val="ListParagraph"/>
               <w:spacing w:after="0" w:line="240" w:lineRule="auto"/>
               <w:contextualSpacing w:val="0"/>
+              <w:jc w:val="both"/>
               <w:rPr>
                 <w:rFonts w:asciiTheme="minorHAnsi" w:hAnsiTheme="minorHAnsi" w:cs="Calibri"/>
                 <w:b w:val="0"/>
@@ -6004,7 +7245,7 @@
               <w:pStyle w:val="ListParagraph"/>
               <w:spacing w:after="0" w:line="240" w:lineRule="auto"/>
               <w:contextualSpacing w:val="0"/>
-              <w:jc w:val="center"/>
+              <w:jc w:val="both"/>
               <w:cnfStyle w:val="000000100000" w:firstRow="0" w:lastRow="0" w:firstColumn="0" w:lastColumn="0" w:oddVBand="0" w:evenVBand="0" w:oddHBand="1" w:evenHBand="0" w:firstRowFirstColumn="0" w:firstRowLastColumn="0" w:lastRowFirstColumn="0" w:lastRowLastColumn="0"/>
               <w:rPr>
                 <w:rFonts w:asciiTheme="minorHAnsi" w:hAnsiTheme="minorHAnsi" w:cs="Calibri"/>
@@ -6033,6 +7274,7 @@
               <w:pStyle w:val="ListParagraph"/>
               <w:spacing w:after="0" w:line="240" w:lineRule="auto"/>
               <w:contextualSpacing w:val="0"/>
+              <w:jc w:val="both"/>
               <w:cnfStyle w:val="000000100000" w:firstRow="0" w:lastRow="0" w:firstColumn="0" w:lastColumn="0" w:oddVBand="0" w:evenVBand="0" w:oddHBand="1" w:evenHBand="0" w:firstRowFirstColumn="0" w:firstRowLastColumn="0" w:lastRowFirstColumn="0" w:lastRowLastColumn="0"/>
               <w:rPr>
                 <w:rFonts w:asciiTheme="minorHAnsi" w:hAnsiTheme="minorHAnsi" w:cs="Calibri"/>
@@ -6104,9 +7346,7 @@
         <w:gridCol w:w="9580"/>
       </w:tblGrid>
       <w:tr>
-        <w:trPr>
-          <w:trHeight w:val="134"/>
-        </w:trPr>
+        <w:trPr/>
         <w:tc>
           <w:tcPr>
             <w:tcW w:w="9580" w:type="dxa"/>
@@ -6142,9 +7382,7 @@
         </w:tc>
       </w:tr>
       <w:tr>
-        <w:trPr>
-          <w:trHeight w:val="5750"/>
-        </w:trPr>
+        <w:trPr/>
         <w:tc>
           <w:tcPr>
             <w:tcW w:w="9580" w:type="dxa"/>
@@ -6261,7 +7499,7 @@
                 <w:noProof/>
                 <w:lang w:val="en-IN"/>
               </w:rPr>
-              <w:t>11 June 2026</w:t>
+              <w:t>12 June 2026</w:t>
             </w:r>
             <w:r>
               <w:rPr>
@@ -6284,7 +7522,7 @@
                 <w:rFonts w:asciiTheme="minorHAnsi" w:hAnsiTheme="minorHAnsi" w:cs="Calibri"/>
                 <w:lang w:val="en-IN"/>
               </w:rPr>
-              <w:t xml:space="preserve">Kiran Bavimani</w:t>
+              <w:t xml:space="preserve">VIPIN PRAKASH SINGH</w:t>
             </w:r>
           </w:p>
           <w:p>
@@ -6400,7 +7638,7 @@
                 <w:noProof/>
                 <w:lang w:val="en-IN"/>
               </w:rPr>
-              <w:t>11 June 2026</w:t>
+              <w:t>12 June 2026</w:t>
             </w:r>
             <w:r>
               <w:rPr>
@@ -6475,6 +7713,7 @@
         <w:gridCol w:w="9607"/>
       </w:tblGrid>
       <w:tr>
+        <w:trPr/>
         <w:tc>
           <w:tcPr>
             <w:tcW w:w="9607" w:type="dxa"/>
@@ -6686,6 +7925,7 @@
         <w:gridCol w:w="9607"/>
       </w:tblGrid>
       <w:tr>
+        <w:trPr/>
         <w:tc>
           <w:tcPr>
             <w:tcW w:w="9607" w:type="dxa"/>
@@ -6795,6 +8035,7 @@
         <w:gridCol w:w="9607"/>
       </w:tblGrid>
       <w:tr>
+        <w:trPr/>
         <w:tc>
           <w:tcPr>
             <w:tcW w:w="9607" w:type="dxa"/>
@@ -6916,6 +8157,7 @@
         <w:gridCol w:w="9607"/>
       </w:tblGrid>
       <w:tr>
+        <w:trPr/>
         <w:tc>
           <w:tcPr>
             <w:tcW w:w="9607" w:type="dxa"/>
@@ -7618,6 +8860,7 @@
         <w:gridCol w:w="9607"/>
       </w:tblGrid>
       <w:tr>
+        <w:trPr/>
         <w:tc>
           <w:tcPr>
             <w:tcW w:w="9607" w:type="dxa"/>

</xml_diff>